<commit_message>
RealtyDog build spec v1.0 — selection criteria, non-profit signal, financial return gate
Full lean build spec: group model, three-layer selection (buy box +
motivation score + financial return gate), off-market data strategy,
ingestion jobs, Postgres schema, scheduler/commands, roadmap, and the
standard financial assumptions with a worked base case.

Co-Authored-By: Claude Opus 4.8 <noreply@anthropic.com>
</commit_message>
<xml_diff>
--- a/RealtyDog_Build_Spec.docx
+++ b/RealtyDog_Build_Spec.docx
@@ -6840,6 +6840,2495 @@
           <w:i w:val="0"/>
         </w:rPr>
         <w:t xml:space="preserve"> against 3–5 known DFW venues before it's allowed to hard-reject a sub-market.</w:t>
+      </w:r>
+    </w:p>
+    <w:p>
+      <w:pPr>
+        <w:pBdr>
+          <w:bottom w:val="single" w:sz="6" w:space="1" w:color="C9C3B4"/>
+        </w:pBdr>
+      </w:pPr>
+    </w:p>
+    <w:p>
+      <w:pPr>
+        <w:pStyle w:val="Heading2"/>
+      </w:pPr>
+      <w:r>
+        <w:t>13. Standard financial assumptions (the return gate)</w:t>
+      </w:r>
+    </w:p>
+    <w:p>
+      <w:r>
+        <w:rPr>
+          <w:b w:val="0"/>
+          <w:i w:val="0"/>
+        </w:rPr>
+        <w:t xml:space="preserve">These are the defaults the Layer-3 return gate runs on every enriched property. </w:t>
+      </w:r>
+      <w:r>
+        <w:rPr>
+          <w:b/>
+          <w:i w:val="0"/>
+        </w:rPr>
+        <w:t>All are configurable</w:t>
+      </w:r>
+      <w:r>
+        <w:rPr>
+          <w:b w:val="0"/>
+          <w:i w:val="0"/>
+        </w:rPr>
+        <w:t xml:space="preserve">, but a property qualifies only if it models to </w:t>
+      </w:r>
+      <w:r>
+        <w:rPr>
+          <w:b/>
+          <w:i w:val="0"/>
+        </w:rPr>
+        <w:t>Year-2 break-even AND Year-3 EBITDA ≥ 10%</w:t>
+      </w:r>
+      <w:r>
+        <w:rPr>
+          <w:b w:val="0"/>
+          <w:i w:val="0"/>
+        </w:rPr>
+        <w:t xml:space="preserve"> within the </w:t>
+      </w:r>
+      <w:r>
+        <w:rPr>
+          <w:b/>
+          <w:i w:val="0"/>
+        </w:rPr>
+        <w:t>$5M all-in</w:t>
+      </w:r>
+      <w:r>
+        <w:rPr>
+          <w:b w:val="0"/>
+          <w:i w:val="0"/>
+        </w:rPr>
+        <w:t>. Numbers below are starting estimates for a ~15,000 SF, 300-guest DFW venue — tighten them against the first real deal.</w:t>
+      </w:r>
+    </w:p>
+    <w:p>
+      <w:pPr>
+        <w:pStyle w:val="Heading3"/>
+      </w:pPr>
+      <w:r>
+        <w:t>Acquisition &amp; financing</w:t>
+      </w:r>
+    </w:p>
+    <w:tbl>
+      <w:tblPr>
+        <w:tblStyle w:val="TableGrid"/>
+        <w:tblW w:type="auto" w:w="0"/>
+        <w:tblLayout w:type="autofit"/>
+        <w:tblLook w:firstColumn="1" w:firstRow="1" w:lastColumn="0" w:lastRow="0" w:noHBand="0" w:noVBand="1" w:val="04A0"/>
+      </w:tblPr>
+      <w:tblGrid>
+        <w:gridCol w:w="3120"/>
+        <w:gridCol w:w="3120"/>
+        <w:gridCol w:w="3120"/>
+      </w:tblGrid>
+      <w:tr>
+        <w:tc>
+          <w:tcPr>
+            <w:tcW w:type="dxa" w:w="3120"/>
+            <w:shd w:val="clear" w:fill="2F5D4E"/>
+          </w:tcPr>
+          <w:p>
+            <w:r/>
+            <w:r>
+              <w:rPr>
+                <w:b/>
+                <w:i w:val="0"/>
+                <w:color w:val="FFFFFF"/>
+              </w:rPr>
+              <w:t>Assumption</w:t>
+            </w:r>
+          </w:p>
+        </w:tc>
+        <w:tc>
+          <w:tcPr>
+            <w:tcW w:type="dxa" w:w="3120"/>
+            <w:shd w:val="clear" w:fill="2F5D4E"/>
+          </w:tcPr>
+          <w:p>
+            <w:r/>
+            <w:r>
+              <w:rPr>
+                <w:b/>
+                <w:i w:val="0"/>
+                <w:color w:val="FFFFFF"/>
+              </w:rPr>
+              <w:t>Default</w:t>
+            </w:r>
+          </w:p>
+        </w:tc>
+        <w:tc>
+          <w:tcPr>
+            <w:tcW w:type="dxa" w:w="3120"/>
+            <w:shd w:val="clear" w:fill="2F5D4E"/>
+          </w:tcPr>
+          <w:p>
+            <w:r/>
+            <w:r>
+              <w:rPr>
+                <w:b/>
+                <w:i w:val="0"/>
+                <w:color w:val="FFFFFF"/>
+              </w:rPr>
+              <w:t>Note</w:t>
+            </w:r>
+          </w:p>
+        </w:tc>
+      </w:tr>
+      <w:tr>
+        <w:tc>
+          <w:tcPr>
+            <w:tcW w:type="dxa" w:w="3120"/>
+          </w:tcPr>
+          <w:p>
+            <w:r/>
+            <w:r>
+              <w:rPr>
+                <w:b w:val="0"/>
+                <w:i w:val="0"/>
+              </w:rPr>
+              <w:t>Negotiated price</w:t>
+            </w:r>
+          </w:p>
+        </w:tc>
+        <w:tc>
+          <w:tcPr>
+            <w:tcW w:type="dxa" w:w="3120"/>
+          </w:tcPr>
+          <w:p>
+            <w:r/>
+            <w:r>
+              <w:rPr>
+                <w:b w:val="0"/>
+                <w:i w:val="0"/>
+              </w:rPr>
+              <w:t>list/assessed × 0.90</w:t>
+            </w:r>
+          </w:p>
+        </w:tc>
+        <w:tc>
+          <w:tcPr>
+            <w:tcW w:type="dxa" w:w="3120"/>
+          </w:tcPr>
+          <w:p>
+            <w:r/>
+            <w:r>
+              <w:rPr>
+                <w:b w:val="0"/>
+                <w:i w:val="0"/>
+              </w:rPr>
+              <w:t>Distressed / non-profit seller × 0.85; hard cap $4M</w:t>
+            </w:r>
+          </w:p>
+        </w:tc>
+      </w:tr>
+      <w:tr>
+        <w:tc>
+          <w:tcPr>
+            <w:tcW w:type="dxa" w:w="3120"/>
+          </w:tcPr>
+          <w:p>
+            <w:r/>
+            <w:r>
+              <w:rPr>
+                <w:b w:val="0"/>
+                <w:i w:val="0"/>
+              </w:rPr>
+              <w:t>Closing + soft costs</w:t>
+            </w:r>
+          </w:p>
+        </w:tc>
+        <w:tc>
+          <w:tcPr>
+            <w:tcW w:type="dxa" w:w="3120"/>
+          </w:tcPr>
+          <w:p>
+            <w:r/>
+            <w:r>
+              <w:rPr>
+                <w:b w:val="0"/>
+                <w:i w:val="0"/>
+              </w:rPr>
+              <w:t>3%</w:t>
+            </w:r>
+          </w:p>
+        </w:tc>
+        <w:tc>
+          <w:tcPr>
+            <w:tcW w:type="dxa" w:w="3120"/>
+          </w:tcPr>
+          <w:p>
+            <w:r/>
+            <w:r>
+              <w:rPr>
+                <w:b w:val="0"/>
+                <w:i w:val="0"/>
+              </w:rPr>
+              <w:t>Of purchase</w:t>
+            </w:r>
+          </w:p>
+        </w:tc>
+      </w:tr>
+      <w:tr>
+        <w:tc>
+          <w:tcPr>
+            <w:tcW w:type="dxa" w:w="3120"/>
+          </w:tcPr>
+          <w:p>
+            <w:r/>
+            <w:r>
+              <w:rPr>
+                <w:b w:val="0"/>
+                <w:i w:val="0"/>
+              </w:rPr>
+              <w:t>Financing</w:t>
+            </w:r>
+          </w:p>
+        </w:tc>
+        <w:tc>
+          <w:tcPr>
+            <w:tcW w:type="dxa" w:w="3120"/>
+          </w:tcPr>
+          <w:p>
+            <w:r/>
+            <w:r>
+              <w:rPr>
+                <w:b w:val="0"/>
+                <w:i w:val="0"/>
+              </w:rPr>
+              <w:t>70% LTV</w:t>
+            </w:r>
+          </w:p>
+        </w:tc>
+        <w:tc>
+          <w:tcPr>
+            <w:tcW w:type="dxa" w:w="3120"/>
+          </w:tcPr>
+          <w:p>
+            <w:r/>
+            <w:r>
+              <w:rPr>
+                <w:b w:val="0"/>
+                <w:i w:val="0"/>
+              </w:rPr>
+              <w:t>Of purchase + conversion (conventional commercial)</w:t>
+            </w:r>
+          </w:p>
+        </w:tc>
+      </w:tr>
+      <w:tr>
+        <w:tc>
+          <w:tcPr>
+            <w:tcW w:type="dxa" w:w="3120"/>
+          </w:tcPr>
+          <w:p>
+            <w:r/>
+            <w:r>
+              <w:rPr>
+                <w:b w:val="0"/>
+                <w:i w:val="0"/>
+              </w:rPr>
+              <w:t>Rate / amortization</w:t>
+            </w:r>
+          </w:p>
+        </w:tc>
+        <w:tc>
+          <w:tcPr>
+            <w:tcW w:type="dxa" w:w="3120"/>
+          </w:tcPr>
+          <w:p>
+            <w:r/>
+            <w:r>
+              <w:rPr>
+                <w:b w:val="0"/>
+                <w:i w:val="0"/>
+              </w:rPr>
+              <w:t>8.0% / 25 yr</w:t>
+            </w:r>
+          </w:p>
+        </w:tc>
+        <w:tc>
+          <w:tcPr>
+            <w:tcW w:type="dxa" w:w="3120"/>
+          </w:tcPr>
+          <w:p>
+            <w:r/>
+            <w:r>
+              <w:rPr>
+                <w:b w:val="0"/>
+                <w:i w:val="0"/>
+              </w:rPr>
+              <w:t>SBA 504 lowers this materially — big lever</w:t>
+            </w:r>
+          </w:p>
+        </w:tc>
+      </w:tr>
+      <w:tr>
+        <w:tc>
+          <w:tcPr>
+            <w:tcW w:type="dxa" w:w="3120"/>
+          </w:tcPr>
+          <w:p>
+            <w:r/>
+            <w:r>
+              <w:rPr>
+                <w:b w:val="0"/>
+                <w:i w:val="0"/>
+              </w:rPr>
+              <w:t>Equity (pooled)</w:t>
+            </w:r>
+          </w:p>
+        </w:tc>
+        <w:tc>
+          <w:tcPr>
+            <w:tcW w:type="dxa" w:w="3120"/>
+          </w:tcPr>
+          <w:p>
+            <w:r/>
+            <w:r>
+              <w:rPr>
+                <w:b w:val="0"/>
+                <w:i w:val="0"/>
+              </w:rPr>
+              <w:t>~30%</w:t>
+            </w:r>
+          </w:p>
+        </w:tc>
+        <w:tc>
+          <w:tcPr>
+            <w:tcW w:type="dxa" w:w="3120"/>
+          </w:tcPr>
+          <w:p>
+            <w:r/>
+            <w:r>
+              <w:rPr>
+                <w:b w:val="0"/>
+                <w:i w:val="0"/>
+              </w:rPr>
+              <w:t>The group's cash in</w:t>
+            </w:r>
+          </w:p>
+        </w:tc>
+      </w:tr>
+    </w:tbl>
+    <w:p>
+      <w:pPr>
+        <w:spacing w:after="40"/>
+      </w:pPr>
+    </w:p>
+    <w:p>
+      <w:pPr>
+        <w:pStyle w:val="Heading3"/>
+      </w:pPr>
+      <w:r>
+        <w:t>Conversion capex by property type (~15,000 SF → 300-guest, incl. 10% contingency)</w:t>
+      </w:r>
+    </w:p>
+    <w:tbl>
+      <w:tblPr>
+        <w:tblStyle w:val="TableGrid"/>
+        <w:tblW w:type="auto" w:w="0"/>
+        <w:tblLayout w:type="autofit"/>
+        <w:tblLook w:firstColumn="1" w:firstRow="1" w:lastColumn="0" w:lastRow="0" w:noHBand="0" w:noVBand="1" w:val="04A0"/>
+      </w:tblPr>
+      <w:tblGrid>
+        <w:gridCol w:w="3120"/>
+        <w:gridCol w:w="3120"/>
+        <w:gridCol w:w="3120"/>
+      </w:tblGrid>
+      <w:tr>
+        <w:tc>
+          <w:tcPr>
+            <w:tcW w:type="dxa" w:w="3120"/>
+            <w:shd w:val="clear" w:fill="2F5D4E"/>
+          </w:tcPr>
+          <w:p>
+            <w:r/>
+            <w:r>
+              <w:rPr>
+                <w:b/>
+                <w:i w:val="0"/>
+                <w:color w:val="FFFFFF"/>
+              </w:rPr>
+              <w:t>Type</w:t>
+            </w:r>
+          </w:p>
+        </w:tc>
+        <w:tc>
+          <w:tcPr>
+            <w:tcW w:type="dxa" w:w="3120"/>
+            <w:shd w:val="clear" w:fill="2F5D4E"/>
+          </w:tcPr>
+          <w:p>
+            <w:r/>
+            <w:r>
+              <w:rPr>
+                <w:b/>
+                <w:i w:val="0"/>
+                <w:color w:val="FFFFFF"/>
+              </w:rPr>
+              <w:t>Total</w:t>
+            </w:r>
+          </w:p>
+        </w:tc>
+        <w:tc>
+          <w:tcPr>
+            <w:tcW w:type="dxa" w:w="3120"/>
+            <w:shd w:val="clear" w:fill="2F5D4E"/>
+          </w:tcPr>
+          <w:p>
+            <w:r/>
+            <w:r>
+              <w:rPr>
+                <w:b/>
+                <w:i w:val="0"/>
+                <w:color w:val="FFFFFF"/>
+              </w:rPr>
+              <w:t>Why</w:t>
+            </w:r>
+          </w:p>
+        </w:tc>
+      </w:tr>
+      <w:tr>
+        <w:tc>
+          <w:tcPr>
+            <w:tcW w:type="dxa" w:w="3120"/>
+          </w:tcPr>
+          <w:p>
+            <w:r/>
+            <w:r>
+              <w:rPr>
+                <w:b w:val="0"/>
+                <w:i w:val="0"/>
+              </w:rPr>
+              <w:t>Church</w:t>
+            </w:r>
+          </w:p>
+        </w:tc>
+        <w:tc>
+          <w:tcPr>
+            <w:tcW w:type="dxa" w:w="3120"/>
+          </w:tcPr>
+          <w:p>
+            <w:r/>
+            <w:r>
+              <w:rPr>
+                <w:b w:val="0"/>
+                <w:i w:val="0"/>
+              </w:rPr>
+              <w:t>$1.2–1.6M</w:t>
+            </w:r>
+          </w:p>
+        </w:tc>
+        <w:tc>
+          <w:tcPr>
+            <w:tcW w:type="dxa" w:w="3120"/>
+          </w:tcPr>
+          <w:p>
+            <w:r/>
+            <w:r>
+              <w:rPr>
+                <w:b w:val="0"/>
+                <w:i w:val="0"/>
+              </w:rPr>
+              <w:t>Assembly-ready; often has restrooms, parking, kitchen</w:t>
+            </w:r>
+          </w:p>
+        </w:tc>
+      </w:tr>
+      <w:tr>
+        <w:tc>
+          <w:tcPr>
+            <w:tcW w:type="dxa" w:w="3120"/>
+          </w:tcPr>
+          <w:p>
+            <w:r/>
+            <w:r>
+              <w:rPr>
+                <w:b w:val="0"/>
+                <w:i w:val="0"/>
+              </w:rPr>
+              <w:t>Commercial building</w:t>
+            </w:r>
+          </w:p>
+        </w:tc>
+        <w:tc>
+          <w:tcPr>
+            <w:tcW w:type="dxa" w:w="3120"/>
+          </w:tcPr>
+          <w:p>
+            <w:r/>
+            <w:r>
+              <w:rPr>
+                <w:b w:val="0"/>
+                <w:i w:val="0"/>
+              </w:rPr>
+              <w:t>$1.8–2.2M</w:t>
+            </w:r>
+          </w:p>
+        </w:tc>
+        <w:tc>
+          <w:tcPr>
+            <w:tcW w:type="dxa" w:w="3120"/>
+          </w:tcPr>
+          <w:p>
+            <w:r/>
+            <w:r>
+              <w:rPr>
+                <w:b w:val="0"/>
+                <w:i w:val="0"/>
+              </w:rPr>
+              <w:t>Some infrastructure; needs assembly build-out</w:t>
+            </w:r>
+          </w:p>
+        </w:tc>
+      </w:tr>
+      <w:tr>
+        <w:tc>
+          <w:tcPr>
+            <w:tcW w:type="dxa" w:w="3120"/>
+          </w:tcPr>
+          <w:p>
+            <w:r/>
+            <w:r>
+              <w:rPr>
+                <w:b w:val="0"/>
+                <w:i w:val="0"/>
+              </w:rPr>
+              <w:t>Warehouse</w:t>
+            </w:r>
+          </w:p>
+        </w:tc>
+        <w:tc>
+          <w:tcPr>
+            <w:tcW w:type="dxa" w:w="3120"/>
+          </w:tcPr>
+          <w:p>
+            <w:r/>
+            <w:r>
+              <w:rPr>
+                <w:b w:val="0"/>
+                <w:i w:val="0"/>
+              </w:rPr>
+              <w:t>$2.0–2.5M</w:t>
+            </w:r>
+          </w:p>
+        </w:tc>
+        <w:tc>
+          <w:tcPr>
+            <w:tcW w:type="dxa" w:w="3120"/>
+          </w:tcPr>
+          <w:p>
+            <w:r/>
+            <w:r>
+              <w:rPr>
+                <w:b w:val="0"/>
+                <w:i w:val="0"/>
+              </w:rPr>
+              <w:t>Shell — needs nearly everything</w:t>
+            </w:r>
+          </w:p>
+        </w:tc>
+      </w:tr>
+      <w:tr>
+        <w:tc>
+          <w:tcPr>
+            <w:tcW w:type="dxa" w:w="3120"/>
+          </w:tcPr>
+          <w:p>
+            <w:r/>
+            <w:r>
+              <w:rPr>
+                <w:b w:val="0"/>
+                <w:i w:val="0"/>
+              </w:rPr>
+              <w:t>Barn / barndominium</w:t>
+            </w:r>
+          </w:p>
+        </w:tc>
+        <w:tc>
+          <w:tcPr>
+            <w:tcW w:type="dxa" w:w="3120"/>
+          </w:tcPr>
+          <w:p>
+            <w:r/>
+            <w:r>
+              <w:rPr>
+                <w:b w:val="0"/>
+                <w:i w:val="0"/>
+              </w:rPr>
+              <w:t>$2.2–2.8M</w:t>
+            </w:r>
+          </w:p>
+        </w:tc>
+        <w:tc>
+          <w:tcPr>
+            <w:tcW w:type="dxa" w:w="3120"/>
+          </w:tcPr>
+          <w:p>
+            <w:r/>
+            <w:r>
+              <w:rPr>
+                <w:b w:val="0"/>
+                <w:i w:val="0"/>
+              </w:rPr>
+              <w:t>Rural; may lack sewer/utilities</w:t>
+            </w:r>
+          </w:p>
+        </w:tc>
+      </w:tr>
+    </w:tbl>
+    <w:p>
+      <w:pPr>
+        <w:spacing w:after="40"/>
+      </w:pPr>
+    </w:p>
+    <w:p>
+      <w:r>
+        <w:rPr>
+          <w:b w:val="0"/>
+          <w:i w:val="0"/>
+        </w:rPr>
+        <w:t xml:space="preserve">Line items (scaled + contingency): structural, HVAC, 200A+ electrical, ADA restrooms, fire suppression, kitchen build-out, flooring/interior, parking/grading, landscape, permits/soft costs. Fixed-cost components (fire riser, service upgrade, kitchen) do </w:t>
+      </w:r>
+      <w:r>
+        <w:rPr>
+          <w:b w:val="0"/>
+          <w:i/>
+        </w:rPr>
+        <w:t>not</w:t>
+      </w:r>
+      <w:r>
+        <w:rPr>
+          <w:b w:val="0"/>
+          <w:i w:val="0"/>
+        </w:rPr>
+        <w:t xml:space="preserve"> scale linearly with SF.</w:t>
+      </w:r>
+    </w:p>
+    <w:p>
+      <w:pPr>
+        <w:pStyle w:val="Heading3"/>
+      </w:pPr>
+      <w:r>
+        <w:t>Working capital &amp; pre-opening</w:t>
+      </w:r>
+    </w:p>
+    <w:tbl>
+      <w:tblPr>
+        <w:tblStyle w:val="TableGrid"/>
+        <w:tblW w:type="auto" w:w="0"/>
+        <w:tblLayout w:type="autofit"/>
+        <w:tblLook w:firstColumn="1" w:firstRow="1" w:lastColumn="0" w:lastRow="0" w:noHBand="0" w:noVBand="1" w:val="04A0"/>
+      </w:tblPr>
+      <w:tblGrid>
+        <w:gridCol w:w="4680"/>
+        <w:gridCol w:w="4680"/>
+      </w:tblGrid>
+      <w:tr>
+        <w:tc>
+          <w:tcPr>
+            <w:tcW w:type="dxa" w:w="4680"/>
+            <w:shd w:val="clear" w:fill="2F5D4E"/>
+          </w:tcPr>
+          <w:p>
+            <w:r/>
+            <w:r>
+              <w:rPr>
+                <w:b/>
+                <w:i w:val="0"/>
+                <w:color w:val="FFFFFF"/>
+              </w:rPr>
+              <w:t>Line</w:t>
+            </w:r>
+          </w:p>
+        </w:tc>
+        <w:tc>
+          <w:tcPr>
+            <w:tcW w:type="dxa" w:w="4680"/>
+            <w:shd w:val="clear" w:fill="2F5D4E"/>
+          </w:tcPr>
+          <w:p>
+            <w:r/>
+            <w:r>
+              <w:rPr>
+                <w:b/>
+                <w:i w:val="0"/>
+                <w:color w:val="FFFFFF"/>
+              </w:rPr>
+              <w:t>Default</w:t>
+            </w:r>
+          </w:p>
+        </w:tc>
+      </w:tr>
+      <w:tr>
+        <w:tc>
+          <w:tcPr>
+            <w:tcW w:type="dxa" w:w="4680"/>
+          </w:tcPr>
+          <w:p>
+            <w:r/>
+            <w:r>
+              <w:rPr>
+                <w:b w:val="0"/>
+                <w:i w:val="0"/>
+              </w:rPr>
+              <w:t>Pre-opening (branding, website, photography, launch marketing)</w:t>
+            </w:r>
+          </w:p>
+        </w:tc>
+        <w:tc>
+          <w:tcPr>
+            <w:tcW w:type="dxa" w:w="4680"/>
+          </w:tcPr>
+          <w:p>
+            <w:r/>
+            <w:r>
+              <w:rPr>
+                <w:b w:val="0"/>
+                <w:i w:val="0"/>
+              </w:rPr>
+              <w:t>$150,000</w:t>
+            </w:r>
+          </w:p>
+        </w:tc>
+      </w:tr>
+      <w:tr>
+        <w:tc>
+          <w:tcPr>
+            <w:tcW w:type="dxa" w:w="4680"/>
+          </w:tcPr>
+          <w:p>
+            <w:r/>
+            <w:r>
+              <w:rPr>
+                <w:b w:val="0"/>
+                <w:i w:val="0"/>
+              </w:rPr>
+              <w:t>Operating reserve (carries the Year-1 ramp loss)</w:t>
+            </w:r>
+          </w:p>
+        </w:tc>
+        <w:tc>
+          <w:tcPr>
+            <w:tcW w:type="dxa" w:w="4680"/>
+          </w:tcPr>
+          <w:p>
+            <w:r/>
+            <w:r>
+              <w:rPr>
+                <w:b w:val="0"/>
+                <w:i w:val="0"/>
+              </w:rPr>
+              <w:t>$200–250,000</w:t>
+            </w:r>
+          </w:p>
+        </w:tc>
+      </w:tr>
+      <w:tr>
+        <w:tc>
+          <w:tcPr>
+            <w:tcW w:type="dxa" w:w="4680"/>
+          </w:tcPr>
+          <w:p>
+            <w:r/>
+            <w:r>
+              <w:rPr>
+                <w:b/>
+                <w:i w:val="0"/>
+              </w:rPr>
+              <w:t>Working-capital total</w:t>
+            </w:r>
+          </w:p>
+        </w:tc>
+        <w:tc>
+          <w:tcPr>
+            <w:tcW w:type="dxa" w:w="4680"/>
+          </w:tcPr>
+          <w:p>
+            <w:r/>
+            <w:r>
+              <w:rPr>
+                <w:b/>
+                <w:i w:val="0"/>
+              </w:rPr>
+              <w:t>~$350–400K</w:t>
+            </w:r>
+          </w:p>
+        </w:tc>
+      </w:tr>
+    </w:tbl>
+    <w:p>
+      <w:pPr>
+        <w:spacing w:after="40"/>
+      </w:pPr>
+    </w:p>
+    <w:p>
+      <w:pPr>
+        <w:pStyle w:val="Heading3"/>
+      </w:pPr>
+      <w:r>
+        <w:t>Revenue model (stabilized = Year 3) &amp; ramp</w:t>
+      </w:r>
+    </w:p>
+    <w:tbl>
+      <w:tblPr>
+        <w:tblStyle w:val="TableGrid"/>
+        <w:tblW w:type="auto" w:w="0"/>
+        <w:tblLayout w:type="autofit"/>
+        <w:tblLook w:firstColumn="1" w:firstRow="1" w:lastColumn="0" w:lastRow="0" w:noHBand="0" w:noVBand="1" w:val="04A0"/>
+      </w:tblPr>
+      <w:tblGrid>
+        <w:gridCol w:w="2340"/>
+        <w:gridCol w:w="2340"/>
+        <w:gridCol w:w="2340"/>
+        <w:gridCol w:w="2340"/>
+      </w:tblGrid>
+      <w:tr>
+        <w:tc>
+          <w:tcPr>
+            <w:tcW w:type="dxa" w:w="2340"/>
+            <w:shd w:val="clear" w:fill="2F5D4E"/>
+          </w:tcPr>
+          <w:p>
+            <w:r/>
+            <w:r>
+              <w:rPr>
+                <w:b/>
+                <w:i w:val="0"/>
+                <w:color w:val="FFFFFF"/>
+              </w:rPr>
+              <w:t>Segment</w:t>
+            </w:r>
+          </w:p>
+        </w:tc>
+        <w:tc>
+          <w:tcPr>
+            <w:tcW w:type="dxa" w:w="2340"/>
+            <w:shd w:val="clear" w:fill="2F5D4E"/>
+          </w:tcPr>
+          <w:p>
+            <w:r/>
+            <w:r>
+              <w:rPr>
+                <w:b/>
+                <w:i w:val="0"/>
+                <w:color w:val="FFFFFF"/>
+              </w:rPr>
+              <w:t>Volume</w:t>
+            </w:r>
+          </w:p>
+        </w:tc>
+        <w:tc>
+          <w:tcPr>
+            <w:tcW w:type="dxa" w:w="2340"/>
+            <w:shd w:val="clear" w:fill="2F5D4E"/>
+          </w:tcPr>
+          <w:p>
+            <w:r/>
+            <w:r>
+              <w:rPr>
+                <w:b/>
+                <w:i w:val="0"/>
+                <w:color w:val="FFFFFF"/>
+              </w:rPr>
+              <w:t>Avg</w:t>
+            </w:r>
+          </w:p>
+        </w:tc>
+        <w:tc>
+          <w:tcPr>
+            <w:tcW w:type="dxa" w:w="2340"/>
+            <w:shd w:val="clear" w:fill="2F5D4E"/>
+          </w:tcPr>
+          <w:p>
+            <w:r/>
+            <w:r>
+              <w:rPr>
+                <w:b/>
+                <w:i w:val="0"/>
+                <w:color w:val="FFFFFF"/>
+              </w:rPr>
+              <w:t>Stabilized</w:t>
+            </w:r>
+          </w:p>
+        </w:tc>
+      </w:tr>
+      <w:tr>
+        <w:tc>
+          <w:tcPr>
+            <w:tcW w:type="dxa" w:w="2340"/>
+          </w:tcPr>
+          <w:p>
+            <w:r/>
+            <w:r>
+              <w:rPr>
+                <w:b w:val="0"/>
+                <w:i w:val="0"/>
+              </w:rPr>
+              <w:t>Weddings</w:t>
+            </w:r>
+          </w:p>
+        </w:tc>
+        <w:tc>
+          <w:tcPr>
+            <w:tcW w:type="dxa" w:w="2340"/>
+          </w:tcPr>
+          <w:p>
+            <w:r/>
+            <w:r>
+              <w:rPr>
+                <w:b w:val="0"/>
+                <w:i w:val="0"/>
+              </w:rPr>
+              <w:t>45 / yr</w:t>
+            </w:r>
+          </w:p>
+        </w:tc>
+        <w:tc>
+          <w:tcPr>
+            <w:tcW w:type="dxa" w:w="2340"/>
+          </w:tcPr>
+          <w:p>
+            <w:r/>
+            <w:r>
+              <w:rPr>
+                <w:b w:val="0"/>
+                <w:i w:val="0"/>
+              </w:rPr>
+              <w:t>$15,000</w:t>
+            </w:r>
+          </w:p>
+        </w:tc>
+        <w:tc>
+          <w:tcPr>
+            <w:tcW w:type="dxa" w:w="2340"/>
+          </w:tcPr>
+          <w:p>
+            <w:r/>
+            <w:r>
+              <w:rPr>
+                <w:b w:val="0"/>
+                <w:i w:val="0"/>
+              </w:rPr>
+              <w:t>$675,000</w:t>
+            </w:r>
+          </w:p>
+        </w:tc>
+      </w:tr>
+      <w:tr>
+        <w:tc>
+          <w:tcPr>
+            <w:tcW w:type="dxa" w:w="2340"/>
+          </w:tcPr>
+          <w:p>
+            <w:r/>
+            <w:r>
+              <w:rPr>
+                <w:b w:val="0"/>
+                <w:i w:val="0"/>
+              </w:rPr>
+              <w:t>Corporate / galas</w:t>
+            </w:r>
+          </w:p>
+        </w:tc>
+        <w:tc>
+          <w:tcPr>
+            <w:tcW w:type="dxa" w:w="2340"/>
+          </w:tcPr>
+          <w:p>
+            <w:r/>
+            <w:r>
+              <w:rPr>
+                <w:b w:val="0"/>
+                <w:i w:val="0"/>
+              </w:rPr>
+              <w:t>20 / yr</w:t>
+            </w:r>
+          </w:p>
+        </w:tc>
+        <w:tc>
+          <w:tcPr>
+            <w:tcW w:type="dxa" w:w="2340"/>
+          </w:tcPr>
+          <w:p>
+            <w:r/>
+            <w:r>
+              <w:rPr>
+                <w:b w:val="0"/>
+                <w:i w:val="0"/>
+              </w:rPr>
+              <w:t>$7,000</w:t>
+            </w:r>
+          </w:p>
+        </w:tc>
+        <w:tc>
+          <w:tcPr>
+            <w:tcW w:type="dxa" w:w="2340"/>
+          </w:tcPr>
+          <w:p>
+            <w:r/>
+            <w:r>
+              <w:rPr>
+                <w:b w:val="0"/>
+                <w:i w:val="0"/>
+              </w:rPr>
+              <w:t>$140,000</w:t>
+            </w:r>
+          </w:p>
+        </w:tc>
+      </w:tr>
+      <w:tr>
+        <w:tc>
+          <w:tcPr>
+            <w:tcW w:type="dxa" w:w="2340"/>
+          </w:tcPr>
+          <w:p>
+            <w:r/>
+            <w:r>
+              <w:rPr>
+                <w:b w:val="0"/>
+                <w:i w:val="0"/>
+              </w:rPr>
+              <w:t>Private parties</w:t>
+            </w:r>
+          </w:p>
+        </w:tc>
+        <w:tc>
+          <w:tcPr>
+            <w:tcW w:type="dxa" w:w="2340"/>
+          </w:tcPr>
+          <w:p>
+            <w:r/>
+            <w:r>
+              <w:rPr>
+                <w:b w:val="0"/>
+                <w:i w:val="0"/>
+              </w:rPr>
+              <w:t>30 / yr</w:t>
+            </w:r>
+          </w:p>
+        </w:tc>
+        <w:tc>
+          <w:tcPr>
+            <w:tcW w:type="dxa" w:w="2340"/>
+          </w:tcPr>
+          <w:p>
+            <w:r/>
+            <w:r>
+              <w:rPr>
+                <w:b w:val="0"/>
+                <w:i w:val="0"/>
+              </w:rPr>
+              <w:t>$5,000</w:t>
+            </w:r>
+          </w:p>
+        </w:tc>
+        <w:tc>
+          <w:tcPr>
+            <w:tcW w:type="dxa" w:w="2340"/>
+          </w:tcPr>
+          <w:p>
+            <w:r/>
+            <w:r>
+              <w:rPr>
+                <w:b w:val="0"/>
+                <w:i w:val="0"/>
+              </w:rPr>
+              <w:t>$150,000</w:t>
+            </w:r>
+          </w:p>
+        </w:tc>
+      </w:tr>
+      <w:tr>
+        <w:tc>
+          <w:tcPr>
+            <w:tcW w:type="dxa" w:w="2340"/>
+          </w:tcPr>
+          <w:p>
+            <w:r/>
+            <w:r>
+              <w:rPr>
+                <w:b w:val="0"/>
+                <w:i w:val="0"/>
+              </w:rPr>
+              <w:t>Ancillary (bar/catering margin, vendor fees, rentals)</w:t>
+            </w:r>
+          </w:p>
+        </w:tc>
+        <w:tc>
+          <w:tcPr>
+            <w:tcW w:type="dxa" w:w="2340"/>
+          </w:tcPr>
+          <w:p>
+            <w:r/>
+            <w:r>
+              <w:rPr>
+                <w:b w:val="0"/>
+                <w:i w:val="0"/>
+              </w:rPr>
+              <w:t>—</w:t>
+            </w:r>
+          </w:p>
+        </w:tc>
+        <w:tc>
+          <w:tcPr>
+            <w:tcW w:type="dxa" w:w="2340"/>
+          </w:tcPr>
+          <w:p>
+            <w:r/>
+            <w:r>
+              <w:rPr>
+                <w:b w:val="0"/>
+                <w:i w:val="0"/>
+              </w:rPr>
+              <w:t>—</w:t>
+            </w:r>
+          </w:p>
+        </w:tc>
+        <w:tc>
+          <w:tcPr>
+            <w:tcW w:type="dxa" w:w="2340"/>
+          </w:tcPr>
+          <w:p>
+            <w:r/>
+            <w:r>
+              <w:rPr>
+                <w:b w:val="0"/>
+                <w:i w:val="0"/>
+              </w:rPr>
+              <w:t>$285,000</w:t>
+            </w:r>
+          </w:p>
+        </w:tc>
+      </w:tr>
+      <w:tr>
+        <w:tc>
+          <w:tcPr>
+            <w:tcW w:type="dxa" w:w="2340"/>
+          </w:tcPr>
+          <w:p>
+            <w:r/>
+            <w:r>
+              <w:rPr>
+                <w:b/>
+                <w:i w:val="0"/>
+              </w:rPr>
+              <w:t>Stabilized gross</w:t>
+            </w:r>
+          </w:p>
+        </w:tc>
+        <w:tc>
+          <w:tcPr>
+            <w:tcW w:type="dxa" w:w="2340"/>
+          </w:tcPr>
+          <w:p>
+            <w:r/>
+            <w:r>
+              <w:rPr>
+                <w:b w:val="0"/>
+                <w:i w:val="0"/>
+              </w:rPr>
+              <w:t>~95 events</w:t>
+            </w:r>
+          </w:p>
+        </w:tc>
+        <w:tc>
+          <w:tcPr>
+            <w:tcW w:type="dxa" w:w="2340"/>
+          </w:tcPr>
+          <w:p>
+            <w:r/>
+            <w:r>
+              <w:rPr>
+                <w:b w:val="0"/>
+                <w:i w:val="0"/>
+              </w:rPr>
+              <w:t>—</w:t>
+            </w:r>
+          </w:p>
+        </w:tc>
+        <w:tc>
+          <w:tcPr>
+            <w:tcW w:type="dxa" w:w="2340"/>
+          </w:tcPr>
+          <w:p>
+            <w:r/>
+            <w:r>
+              <w:rPr>
+                <w:b/>
+                <w:i w:val="0"/>
+              </w:rPr>
+              <w:t>$1,250,000</w:t>
+            </w:r>
+          </w:p>
+        </w:tc>
+      </w:tr>
+    </w:tbl>
+    <w:p>
+      <w:pPr>
+        <w:spacing w:after="40"/>
+      </w:pPr>
+    </w:p>
+    <w:p>
+      <w:r>
+        <w:rPr>
+          <w:b/>
+          <w:i w:val="0"/>
+        </w:rPr>
+        <w:t>Ramp:</w:t>
+      </w:r>
+      <w:r>
+        <w:rPr>
+          <w:b w:val="0"/>
+          <w:i w:val="0"/>
+        </w:rPr>
+        <w:t xml:space="preserve"> Year 1 = 40% of stabilized, Year 2 = 75%, Year 3 = 100% — venues book 9–18 months out, so Year 1 is nearly empty and the first full booking cycle lands in Year 2. Seasonal skew (spring/fall peak) is absorbed in the annual figures.</w:t>
+      </w:r>
+    </w:p>
+    <w:p>
+      <w:pPr>
+        <w:pStyle w:val="Heading3"/>
+      </w:pPr>
+      <w:r>
+        <w:t>Operating expenses</w:t>
+      </w:r>
+    </w:p>
+    <w:tbl>
+      <w:tblPr>
+        <w:tblStyle w:val="TableGrid"/>
+        <w:tblW w:type="auto" w:w="0"/>
+        <w:tblLayout w:type="autofit"/>
+        <w:tblLook w:firstColumn="1" w:firstRow="1" w:lastColumn="0" w:lastRow="0" w:noHBand="0" w:noVBand="1" w:val="04A0"/>
+      </w:tblPr>
+      <w:tblGrid>
+        <w:gridCol w:w="4680"/>
+        <w:gridCol w:w="4680"/>
+      </w:tblGrid>
+      <w:tr>
+        <w:tc>
+          <w:tcPr>
+            <w:tcW w:type="dxa" w:w="4680"/>
+            <w:shd w:val="clear" w:fill="2F5D4E"/>
+          </w:tcPr>
+          <w:p>
+            <w:r/>
+            <w:r>
+              <w:rPr>
+                <w:b/>
+                <w:i w:val="0"/>
+                <w:color w:val="FFFFFF"/>
+              </w:rPr>
+              <w:t>Line</w:t>
+            </w:r>
+          </w:p>
+        </w:tc>
+        <w:tc>
+          <w:tcPr>
+            <w:tcW w:type="dxa" w:w="4680"/>
+            <w:shd w:val="clear" w:fill="2F5D4E"/>
+          </w:tcPr>
+          <w:p>
+            <w:r/>
+            <w:r>
+              <w:rPr>
+                <w:b/>
+                <w:i w:val="0"/>
+                <w:color w:val="FFFFFF"/>
+              </w:rPr>
+              <w:t>Default</w:t>
+            </w:r>
+          </w:p>
+        </w:tc>
+      </w:tr>
+      <w:tr>
+        <w:tc>
+          <w:tcPr>
+            <w:tcW w:type="dxa" w:w="4680"/>
+          </w:tcPr>
+          <w:p>
+            <w:r/>
+            <w:r>
+              <w:rPr>
+                <w:b w:val="0"/>
+                <w:i w:val="0"/>
+              </w:rPr>
+              <w:t>Variable OpEx (per-event staffing, supplies)</w:t>
+            </w:r>
+          </w:p>
+        </w:tc>
+        <w:tc>
+          <w:tcPr>
+            <w:tcW w:type="dxa" w:w="4680"/>
+          </w:tcPr>
+          <w:p>
+            <w:r/>
+            <w:r>
+              <w:rPr>
+                <w:b w:val="0"/>
+                <w:i w:val="0"/>
+              </w:rPr>
+              <w:t>30% of revenue</w:t>
+            </w:r>
+          </w:p>
+        </w:tc>
+      </w:tr>
+      <w:tr>
+        <w:tc>
+          <w:tcPr>
+            <w:tcW w:type="dxa" w:w="4680"/>
+          </w:tcPr>
+          <w:p>
+            <w:r/>
+            <w:r>
+              <w:rPr>
+                <w:b w:val="0"/>
+                <w:i w:val="0"/>
+              </w:rPr>
+              <w:t>Marketing (ongoing)</w:t>
+            </w:r>
+          </w:p>
+        </w:tc>
+        <w:tc>
+          <w:tcPr>
+            <w:tcW w:type="dxa" w:w="4680"/>
+          </w:tcPr>
+          <w:p>
+            <w:r/>
+            <w:r>
+              <w:rPr>
+                <w:b w:val="0"/>
+                <w:i w:val="0"/>
+              </w:rPr>
+              <w:t>6% of revenue</w:t>
+            </w:r>
+          </w:p>
+        </w:tc>
+      </w:tr>
+      <w:tr>
+        <w:tc>
+          <w:tcPr>
+            <w:tcW w:type="dxa" w:w="4680"/>
+          </w:tcPr>
+          <w:p>
+            <w:r/>
+            <w:r>
+              <w:rPr>
+                <w:b w:val="0"/>
+                <w:i w:val="0"/>
+              </w:rPr>
+              <w:t>Replacement reserve</w:t>
+            </w:r>
+          </w:p>
+        </w:tc>
+        <w:tc>
+          <w:tcPr>
+            <w:tcW w:type="dxa" w:w="4680"/>
+          </w:tcPr>
+          <w:p>
+            <w:r/>
+            <w:r>
+              <w:rPr>
+                <w:b w:val="0"/>
+                <w:i w:val="0"/>
+              </w:rPr>
+              <w:t>2% of revenue</w:t>
+            </w:r>
+          </w:p>
+        </w:tc>
+      </w:tr>
+      <w:tr>
+        <w:tc>
+          <w:tcPr>
+            <w:tcW w:type="dxa" w:w="4680"/>
+          </w:tcPr>
+          <w:p>
+            <w:r/>
+            <w:r>
+              <w:rPr>
+                <w:b w:val="0"/>
+                <w:i w:val="0"/>
+              </w:rPr>
+              <w:t>GM + admin salaries</w:t>
+            </w:r>
+          </w:p>
+        </w:tc>
+        <w:tc>
+          <w:tcPr>
+            <w:tcW w:type="dxa" w:w="4680"/>
+          </w:tcPr>
+          <w:p>
+            <w:r/>
+            <w:r>
+              <w:rPr>
+                <w:b w:val="0"/>
+                <w:i w:val="0"/>
+              </w:rPr>
+              <w:t>$120,000</w:t>
+            </w:r>
+          </w:p>
+        </w:tc>
+      </w:tr>
+      <w:tr>
+        <w:tc>
+          <w:tcPr>
+            <w:tcW w:type="dxa" w:w="4680"/>
+          </w:tcPr>
+          <w:p>
+            <w:r/>
+            <w:r>
+              <w:rPr>
+                <w:b w:val="0"/>
+                <w:i w:val="0"/>
+              </w:rPr>
+              <w:t>Property tax</w:t>
+            </w:r>
+          </w:p>
+        </w:tc>
+        <w:tc>
+          <w:tcPr>
+            <w:tcW w:type="dxa" w:w="4680"/>
+          </w:tcPr>
+          <w:p>
+            <w:r/>
+            <w:r>
+              <w:rPr>
+                <w:b w:val="0"/>
+                <w:i w:val="0"/>
+              </w:rPr>
+              <w:t>$70,000</w:t>
+            </w:r>
+          </w:p>
+        </w:tc>
+      </w:tr>
+      <w:tr>
+        <w:tc>
+          <w:tcPr>
+            <w:tcW w:type="dxa" w:w="4680"/>
+          </w:tcPr>
+          <w:p>
+            <w:r/>
+            <w:r>
+              <w:rPr>
+                <w:b w:val="0"/>
+                <w:i w:val="0"/>
+              </w:rPr>
+              <w:t>Insurance (venue liability + property)</w:t>
+            </w:r>
+          </w:p>
+        </w:tc>
+        <w:tc>
+          <w:tcPr>
+            <w:tcW w:type="dxa" w:w="4680"/>
+          </w:tcPr>
+          <w:p>
+            <w:r/>
+            <w:r>
+              <w:rPr>
+                <w:b w:val="0"/>
+                <w:i w:val="0"/>
+              </w:rPr>
+              <w:t>$25,000</w:t>
+            </w:r>
+          </w:p>
+        </w:tc>
+      </w:tr>
+      <w:tr>
+        <w:tc>
+          <w:tcPr>
+            <w:tcW w:type="dxa" w:w="4680"/>
+          </w:tcPr>
+          <w:p>
+            <w:r/>
+            <w:r>
+              <w:rPr>
+                <w:b w:val="0"/>
+                <w:i w:val="0"/>
+              </w:rPr>
+              <w:t>Utilities</w:t>
+            </w:r>
+          </w:p>
+        </w:tc>
+        <w:tc>
+          <w:tcPr>
+            <w:tcW w:type="dxa" w:w="4680"/>
+          </w:tcPr>
+          <w:p>
+            <w:r/>
+            <w:r>
+              <w:rPr>
+                <w:b w:val="0"/>
+                <w:i w:val="0"/>
+              </w:rPr>
+              <w:t>$30,000</w:t>
+            </w:r>
+          </w:p>
+        </w:tc>
+      </w:tr>
+      <w:tr>
+        <w:tc>
+          <w:tcPr>
+            <w:tcW w:type="dxa" w:w="4680"/>
+          </w:tcPr>
+          <w:p>
+            <w:r/>
+            <w:r>
+              <w:rPr>
+                <w:b w:val="0"/>
+                <w:i w:val="0"/>
+              </w:rPr>
+              <w:t>Maintenance / grounds</w:t>
+            </w:r>
+          </w:p>
+        </w:tc>
+        <w:tc>
+          <w:tcPr>
+            <w:tcW w:type="dxa" w:w="4680"/>
+          </w:tcPr>
+          <w:p>
+            <w:r/>
+            <w:r>
+              <w:rPr>
+                <w:b w:val="0"/>
+                <w:i w:val="0"/>
+              </w:rPr>
+              <w:t>$35,000</w:t>
+            </w:r>
+          </w:p>
+        </w:tc>
+      </w:tr>
+    </w:tbl>
+    <w:p>
+      <w:pPr>
+        <w:spacing w:after="40"/>
+      </w:pPr>
+    </w:p>
+    <w:p>
+      <w:pPr>
+        <w:pStyle w:val="Heading3"/>
+      </w:pPr>
+      <w:r>
+        <w:t>Worked base case — proof it pencils</w:t>
+      </w:r>
+    </w:p>
+    <w:p>
+      <w:r>
+        <w:rPr>
+          <w:b w:val="0"/>
+          <w:i w:val="0"/>
+        </w:rPr>
+        <w:t>A $5M all-in on a $2.5M church/commercial retrofit:</w:t>
+      </w:r>
+    </w:p>
+    <w:tbl>
+      <w:tblPr>
+        <w:tblStyle w:val="TableGrid"/>
+        <w:tblW w:type="auto" w:w="0"/>
+        <w:tblLayout w:type="autofit"/>
+        <w:tblLook w:firstColumn="1" w:firstRow="1" w:lastColumn="0" w:lastRow="0" w:noHBand="0" w:noVBand="1" w:val="04A0"/>
+      </w:tblPr>
+      <w:tblGrid>
+        <w:gridCol w:w="4680"/>
+        <w:gridCol w:w="4680"/>
+      </w:tblGrid>
+      <w:tr>
+        <w:tc>
+          <w:tcPr>
+            <w:tcW w:type="dxa" w:w="4680"/>
+            <w:shd w:val="clear" w:fill="2F5D4E"/>
+          </w:tcPr>
+          <w:p>
+            <w:r/>
+            <w:r>
+              <w:rPr>
+                <w:b/>
+                <w:i w:val="0"/>
+                <w:color w:val="FFFFFF"/>
+              </w:rPr>
+              <w:t>All-in</w:t>
+            </w:r>
+          </w:p>
+        </w:tc>
+        <w:tc>
+          <w:tcPr>
+            <w:tcW w:type="dxa" w:w="4680"/>
+            <w:shd w:val="clear" w:fill="2F5D4E"/>
+          </w:tcPr>
+          <w:p>
+            <w:r/>
+            <w:r>
+              <w:rPr>
+                <w:b/>
+                <w:i w:val="0"/>
+                <w:color w:val="FFFFFF"/>
+              </w:rPr>
+              <w:t>Amount</w:t>
+            </w:r>
+          </w:p>
+        </w:tc>
+      </w:tr>
+      <w:tr>
+        <w:tc>
+          <w:tcPr>
+            <w:tcW w:type="dxa" w:w="4680"/>
+          </w:tcPr>
+          <w:p>
+            <w:r/>
+            <w:r>
+              <w:rPr>
+                <w:b w:val="0"/>
+                <w:i w:val="0"/>
+              </w:rPr>
+              <w:t>Purchase (negotiated)</w:t>
+            </w:r>
+          </w:p>
+        </w:tc>
+        <w:tc>
+          <w:tcPr>
+            <w:tcW w:type="dxa" w:w="4680"/>
+          </w:tcPr>
+          <w:p>
+            <w:r/>
+            <w:r>
+              <w:rPr>
+                <w:b w:val="0"/>
+                <w:i w:val="0"/>
+              </w:rPr>
+              <w:t>$2,500,000</w:t>
+            </w:r>
+          </w:p>
+        </w:tc>
+      </w:tr>
+      <w:tr>
+        <w:tc>
+          <w:tcPr>
+            <w:tcW w:type="dxa" w:w="4680"/>
+          </w:tcPr>
+          <w:p>
+            <w:r/>
+            <w:r>
+              <w:rPr>
+                <w:b w:val="0"/>
+                <w:i w:val="0"/>
+              </w:rPr>
+              <w:t>Conversion capex (incl. 10% contingency)</w:t>
+            </w:r>
+          </w:p>
+        </w:tc>
+        <w:tc>
+          <w:tcPr>
+            <w:tcW w:type="dxa" w:w="4680"/>
+          </w:tcPr>
+          <w:p>
+            <w:r/>
+            <w:r>
+              <w:rPr>
+                <w:b w:val="0"/>
+                <w:i w:val="0"/>
+              </w:rPr>
+              <w:t>$2,000,000</w:t>
+            </w:r>
+          </w:p>
+        </w:tc>
+      </w:tr>
+      <w:tr>
+        <w:tc>
+          <w:tcPr>
+            <w:tcW w:type="dxa" w:w="4680"/>
+          </w:tcPr>
+          <w:p>
+            <w:r/>
+            <w:r>
+              <w:rPr>
+                <w:b w:val="0"/>
+                <w:i w:val="0"/>
+              </w:rPr>
+              <w:t>Closing + soft costs</w:t>
+            </w:r>
+          </w:p>
+        </w:tc>
+        <w:tc>
+          <w:tcPr>
+            <w:tcW w:type="dxa" w:w="4680"/>
+          </w:tcPr>
+          <w:p>
+            <w:r/>
+            <w:r>
+              <w:rPr>
+                <w:b w:val="0"/>
+                <w:i w:val="0"/>
+              </w:rPr>
+              <w:t>$150,000</w:t>
+            </w:r>
+          </w:p>
+        </w:tc>
+      </w:tr>
+      <w:tr>
+        <w:tc>
+          <w:tcPr>
+            <w:tcW w:type="dxa" w:w="4680"/>
+          </w:tcPr>
+          <w:p>
+            <w:r/>
+            <w:r>
+              <w:rPr>
+                <w:b w:val="0"/>
+                <w:i w:val="0"/>
+              </w:rPr>
+              <w:t>Working capital + pre-opening</w:t>
+            </w:r>
+          </w:p>
+        </w:tc>
+        <w:tc>
+          <w:tcPr>
+            <w:tcW w:type="dxa" w:w="4680"/>
+          </w:tcPr>
+          <w:p>
+            <w:r/>
+            <w:r>
+              <w:rPr>
+                <w:b w:val="0"/>
+                <w:i w:val="0"/>
+              </w:rPr>
+              <w:t>$350,000</w:t>
+            </w:r>
+          </w:p>
+        </w:tc>
+      </w:tr>
+      <w:tr>
+        <w:tc>
+          <w:tcPr>
+            <w:tcW w:type="dxa" w:w="4680"/>
+          </w:tcPr>
+          <w:p>
+            <w:r/>
+            <w:r>
+              <w:rPr>
+                <w:b/>
+                <w:i w:val="0"/>
+              </w:rPr>
+              <w:t>Total all-in</w:t>
+            </w:r>
+          </w:p>
+        </w:tc>
+        <w:tc>
+          <w:tcPr>
+            <w:tcW w:type="dxa" w:w="4680"/>
+          </w:tcPr>
+          <w:p>
+            <w:r/>
+            <w:r>
+              <w:rPr>
+                <w:b/>
+                <w:i w:val="0"/>
+              </w:rPr>
+              <w:t>$5,000,000</w:t>
+            </w:r>
+          </w:p>
+        </w:tc>
+      </w:tr>
+      <w:tr>
+        <w:tc>
+          <w:tcPr>
+            <w:tcW w:type="dxa" w:w="4680"/>
+          </w:tcPr>
+          <w:p>
+            <w:r/>
+            <w:r>
+              <w:rPr>
+                <w:b w:val="0"/>
+                <w:i w:val="0"/>
+              </w:rPr>
+              <w:t>Debt (70% of $4.5M)</w:t>
+            </w:r>
+          </w:p>
+        </w:tc>
+        <w:tc>
+          <w:tcPr>
+            <w:tcW w:type="dxa" w:w="4680"/>
+          </w:tcPr>
+          <w:p>
+            <w:r/>
+            <w:r>
+              <w:rPr>
+                <w:b w:val="0"/>
+                <w:i w:val="0"/>
+              </w:rPr>
+              <w:t>$3,150,000</w:t>
+            </w:r>
+          </w:p>
+        </w:tc>
+      </w:tr>
+      <w:tr>
+        <w:tc>
+          <w:tcPr>
+            <w:tcW w:type="dxa" w:w="4680"/>
+          </w:tcPr>
+          <w:p>
+            <w:r/>
+            <w:r>
+              <w:rPr>
+                <w:b w:val="0"/>
+                <w:i w:val="0"/>
+              </w:rPr>
+              <w:t>Equity (pooled — ~$308K × 6)</w:t>
+            </w:r>
+          </w:p>
+        </w:tc>
+        <w:tc>
+          <w:tcPr>
+            <w:tcW w:type="dxa" w:w="4680"/>
+          </w:tcPr>
+          <w:p>
+            <w:r/>
+            <w:r>
+              <w:rPr>
+                <w:b w:val="0"/>
+                <w:i w:val="0"/>
+              </w:rPr>
+              <w:t>$1,850,000</w:t>
+            </w:r>
+          </w:p>
+        </w:tc>
+      </w:tr>
+      <w:tr>
+        <w:tc>
+          <w:tcPr>
+            <w:tcW w:type="dxa" w:w="4680"/>
+          </w:tcPr>
+          <w:p>
+            <w:r/>
+            <w:r>
+              <w:rPr>
+                <w:b w:val="0"/>
+                <w:i w:val="0"/>
+              </w:rPr>
+              <w:t>Annual debt service (8%, 25 yr)</w:t>
+            </w:r>
+          </w:p>
+        </w:tc>
+        <w:tc>
+          <w:tcPr>
+            <w:tcW w:type="dxa" w:w="4680"/>
+          </w:tcPr>
+          <w:p>
+            <w:r/>
+            <w:r>
+              <w:rPr>
+                <w:b w:val="0"/>
+                <w:i w:val="0"/>
+              </w:rPr>
+              <w:t>~$291,700</w:t>
+            </w:r>
+          </w:p>
+        </w:tc>
+      </w:tr>
+    </w:tbl>
+    <w:p>
+      <w:pPr>
+        <w:spacing w:after="40"/>
+      </w:pPr>
+    </w:p>
+    <w:tbl>
+      <w:tblPr>
+        <w:tblStyle w:val="TableGrid"/>
+        <w:tblW w:type="auto" w:w="0"/>
+        <w:tblLayout w:type="autofit"/>
+        <w:tblLook w:firstColumn="1" w:firstRow="1" w:lastColumn="0" w:lastRow="0" w:noHBand="0" w:noVBand="1" w:val="04A0"/>
+      </w:tblPr>
+      <w:tblGrid>
+        <w:gridCol w:w="2340"/>
+        <w:gridCol w:w="2340"/>
+        <w:gridCol w:w="2340"/>
+        <w:gridCol w:w="2340"/>
+      </w:tblGrid>
+      <w:tr>
+        <w:tc>
+          <w:tcPr>
+            <w:tcW w:type="dxa" w:w="2340"/>
+            <w:shd w:val="clear" w:fill="2F5D4E"/>
+          </w:tcPr>
+          <w:p>
+            <w:r/>
+            <w:r>
+              <w:rPr>
+                <w:b/>
+                <w:i w:val="0"/>
+                <w:color w:val="FFFFFF"/>
+              </w:rPr>
+              <w:t>3-year P&amp;L</w:t>
+            </w:r>
+          </w:p>
+        </w:tc>
+        <w:tc>
+          <w:tcPr>
+            <w:tcW w:type="dxa" w:w="2340"/>
+            <w:shd w:val="clear" w:fill="2F5D4E"/>
+          </w:tcPr>
+          <w:p>
+            <w:r/>
+            <w:r>
+              <w:rPr>
+                <w:b/>
+                <w:i w:val="0"/>
+                <w:color w:val="FFFFFF"/>
+              </w:rPr>
+              <w:t>Yr 1 (40%)</w:t>
+            </w:r>
+          </w:p>
+        </w:tc>
+        <w:tc>
+          <w:tcPr>
+            <w:tcW w:type="dxa" w:w="2340"/>
+            <w:shd w:val="clear" w:fill="2F5D4E"/>
+          </w:tcPr>
+          <w:p>
+            <w:r/>
+            <w:r>
+              <w:rPr>
+                <w:b/>
+                <w:i w:val="0"/>
+                <w:color w:val="FFFFFF"/>
+              </w:rPr>
+              <w:t>Yr 2 (75%)</w:t>
+            </w:r>
+          </w:p>
+        </w:tc>
+        <w:tc>
+          <w:tcPr>
+            <w:tcW w:type="dxa" w:w="2340"/>
+            <w:shd w:val="clear" w:fill="2F5D4E"/>
+          </w:tcPr>
+          <w:p>
+            <w:r/>
+            <w:r>
+              <w:rPr>
+                <w:b/>
+                <w:i w:val="0"/>
+                <w:color w:val="FFFFFF"/>
+              </w:rPr>
+              <w:t>Yr 3 (100%)</w:t>
+            </w:r>
+          </w:p>
+        </w:tc>
+      </w:tr>
+      <w:tr>
+        <w:tc>
+          <w:tcPr>
+            <w:tcW w:type="dxa" w:w="2340"/>
+          </w:tcPr>
+          <w:p>
+            <w:r/>
+            <w:r>
+              <w:rPr>
+                <w:b w:val="0"/>
+                <w:i w:val="0"/>
+              </w:rPr>
+              <w:t>Gross revenue</w:t>
+            </w:r>
+          </w:p>
+        </w:tc>
+        <w:tc>
+          <w:tcPr>
+            <w:tcW w:type="dxa" w:w="2340"/>
+          </w:tcPr>
+          <w:p>
+            <w:r/>
+            <w:r>
+              <w:rPr>
+                <w:b w:val="0"/>
+                <w:i w:val="0"/>
+              </w:rPr>
+              <w:t>$500,000</w:t>
+            </w:r>
+          </w:p>
+        </w:tc>
+        <w:tc>
+          <w:tcPr>
+            <w:tcW w:type="dxa" w:w="2340"/>
+          </w:tcPr>
+          <w:p>
+            <w:r/>
+            <w:r>
+              <w:rPr>
+                <w:b w:val="0"/>
+                <w:i w:val="0"/>
+              </w:rPr>
+              <w:t>$937,500</w:t>
+            </w:r>
+          </w:p>
+        </w:tc>
+        <w:tc>
+          <w:tcPr>
+            <w:tcW w:type="dxa" w:w="2340"/>
+          </w:tcPr>
+          <w:p>
+            <w:r/>
+            <w:r>
+              <w:rPr>
+                <w:b w:val="0"/>
+                <w:i w:val="0"/>
+              </w:rPr>
+              <w:t>$1,250,000</w:t>
+            </w:r>
+          </w:p>
+        </w:tc>
+      </w:tr>
+      <w:tr>
+        <w:tc>
+          <w:tcPr>
+            <w:tcW w:type="dxa" w:w="2340"/>
+          </w:tcPr>
+          <w:p>
+            <w:r/>
+            <w:r>
+              <w:rPr>
+                <w:b w:val="0"/>
+                <w:i w:val="0"/>
+              </w:rPr>
+              <w:t>Total OpEx</w:t>
+            </w:r>
+          </w:p>
+        </w:tc>
+        <w:tc>
+          <w:tcPr>
+            <w:tcW w:type="dxa" w:w="2340"/>
+          </w:tcPr>
+          <w:p>
+            <w:r/>
+            <w:r>
+              <w:rPr>
+                <w:b w:val="0"/>
+                <w:i w:val="0"/>
+              </w:rPr>
+              <w:t>$470,000</w:t>
+            </w:r>
+          </w:p>
+        </w:tc>
+        <w:tc>
+          <w:tcPr>
+            <w:tcW w:type="dxa" w:w="2340"/>
+          </w:tcPr>
+          <w:p>
+            <w:r/>
+            <w:r>
+              <w:rPr>
+                <w:b w:val="0"/>
+                <w:i w:val="0"/>
+              </w:rPr>
+              <w:t>$636,250</w:t>
+            </w:r>
+          </w:p>
+        </w:tc>
+        <w:tc>
+          <w:tcPr>
+            <w:tcW w:type="dxa" w:w="2340"/>
+          </w:tcPr>
+          <w:p>
+            <w:r/>
+            <w:r>
+              <w:rPr>
+                <w:b w:val="0"/>
+                <w:i w:val="0"/>
+              </w:rPr>
+              <w:t>$755,000</w:t>
+            </w:r>
+          </w:p>
+        </w:tc>
+      </w:tr>
+      <w:tr>
+        <w:tc>
+          <w:tcPr>
+            <w:tcW w:type="dxa" w:w="2340"/>
+          </w:tcPr>
+          <w:p>
+            <w:r/>
+            <w:r>
+              <w:rPr>
+                <w:b w:val="0"/>
+                <w:i w:val="0"/>
+              </w:rPr>
+              <w:t>EBITDA</w:t>
+            </w:r>
+          </w:p>
+        </w:tc>
+        <w:tc>
+          <w:tcPr>
+            <w:tcW w:type="dxa" w:w="2340"/>
+          </w:tcPr>
+          <w:p>
+            <w:r/>
+            <w:r>
+              <w:rPr>
+                <w:b w:val="0"/>
+                <w:i w:val="0"/>
+              </w:rPr>
+              <w:t>$30,000</w:t>
+            </w:r>
+          </w:p>
+        </w:tc>
+        <w:tc>
+          <w:tcPr>
+            <w:tcW w:type="dxa" w:w="2340"/>
+          </w:tcPr>
+          <w:p>
+            <w:r/>
+            <w:r>
+              <w:rPr>
+                <w:b w:val="0"/>
+                <w:i w:val="0"/>
+              </w:rPr>
+              <w:t>$301,250</w:t>
+            </w:r>
+          </w:p>
+        </w:tc>
+        <w:tc>
+          <w:tcPr>
+            <w:tcW w:type="dxa" w:w="2340"/>
+          </w:tcPr>
+          <w:p>
+            <w:r/>
+            <w:r>
+              <w:rPr>
+                <w:b w:val="0"/>
+                <w:i w:val="0"/>
+              </w:rPr>
+              <w:t>$495,000</w:t>
+            </w:r>
+          </w:p>
+        </w:tc>
+      </w:tr>
+      <w:tr>
+        <w:tc>
+          <w:tcPr>
+            <w:tcW w:type="dxa" w:w="2340"/>
+          </w:tcPr>
+          <w:p>
+            <w:r/>
+            <w:r>
+              <w:rPr>
+                <w:b w:val="0"/>
+                <w:i w:val="0"/>
+              </w:rPr>
+              <w:t>EBITDA margin</w:t>
+            </w:r>
+          </w:p>
+        </w:tc>
+        <w:tc>
+          <w:tcPr>
+            <w:tcW w:type="dxa" w:w="2340"/>
+          </w:tcPr>
+          <w:p>
+            <w:r/>
+            <w:r>
+              <w:rPr>
+                <w:b w:val="0"/>
+                <w:i w:val="0"/>
+              </w:rPr>
+              <w:t>6%</w:t>
+            </w:r>
+          </w:p>
+        </w:tc>
+        <w:tc>
+          <w:tcPr>
+            <w:tcW w:type="dxa" w:w="2340"/>
+          </w:tcPr>
+          <w:p>
+            <w:r/>
+            <w:r>
+              <w:rPr>
+                <w:b w:val="0"/>
+                <w:i w:val="0"/>
+              </w:rPr>
+              <w:t>32%</w:t>
+            </w:r>
+          </w:p>
+        </w:tc>
+        <w:tc>
+          <w:tcPr>
+            <w:tcW w:type="dxa" w:w="2340"/>
+          </w:tcPr>
+          <w:p>
+            <w:r/>
+            <w:r>
+              <w:rPr>
+                <w:b w:val="0"/>
+                <w:i w:val="0"/>
+              </w:rPr>
+              <w:t>40%</w:t>
+            </w:r>
+          </w:p>
+        </w:tc>
+      </w:tr>
+      <w:tr>
+        <w:tc>
+          <w:tcPr>
+            <w:tcW w:type="dxa" w:w="2340"/>
+          </w:tcPr>
+          <w:p>
+            <w:r/>
+            <w:r>
+              <w:rPr>
+                <w:b w:val="0"/>
+                <w:i w:val="0"/>
+              </w:rPr>
+              <w:t>Debt service</w:t>
+            </w:r>
+          </w:p>
+        </w:tc>
+        <w:tc>
+          <w:tcPr>
+            <w:tcW w:type="dxa" w:w="2340"/>
+          </w:tcPr>
+          <w:p>
+            <w:r/>
+            <w:r>
+              <w:rPr>
+                <w:b w:val="0"/>
+                <w:i w:val="0"/>
+              </w:rPr>
+              <w:t>($291,700)</w:t>
+            </w:r>
+          </w:p>
+        </w:tc>
+        <w:tc>
+          <w:tcPr>
+            <w:tcW w:type="dxa" w:w="2340"/>
+          </w:tcPr>
+          <w:p>
+            <w:r/>
+            <w:r>
+              <w:rPr>
+                <w:b w:val="0"/>
+                <w:i w:val="0"/>
+              </w:rPr>
+              <w:t>($291,700)</w:t>
+            </w:r>
+          </w:p>
+        </w:tc>
+        <w:tc>
+          <w:tcPr>
+            <w:tcW w:type="dxa" w:w="2340"/>
+          </w:tcPr>
+          <w:p>
+            <w:r/>
+            <w:r>
+              <w:rPr>
+                <w:b w:val="0"/>
+                <w:i w:val="0"/>
+              </w:rPr>
+              <w:t>($291,700)</w:t>
+            </w:r>
+          </w:p>
+        </w:tc>
+      </w:tr>
+      <w:tr>
+        <w:tc>
+          <w:tcPr>
+            <w:tcW w:type="dxa" w:w="2340"/>
+          </w:tcPr>
+          <w:p>
+            <w:r/>
+            <w:r>
+              <w:rPr>
+                <w:b/>
+                <w:i w:val="0"/>
+              </w:rPr>
+              <w:t>Cash flow</w:t>
+            </w:r>
+          </w:p>
+        </w:tc>
+        <w:tc>
+          <w:tcPr>
+            <w:tcW w:type="dxa" w:w="2340"/>
+          </w:tcPr>
+          <w:p>
+            <w:r/>
+            <w:r>
+              <w:rPr>
+                <w:b w:val="0"/>
+                <w:i w:val="0"/>
+              </w:rPr>
+              <w:t>($261,700)</w:t>
+            </w:r>
+          </w:p>
+        </w:tc>
+        <w:tc>
+          <w:tcPr>
+            <w:tcW w:type="dxa" w:w="2340"/>
+          </w:tcPr>
+          <w:p>
+            <w:r/>
+            <w:r>
+              <w:rPr>
+                <w:b/>
+                <w:i w:val="0"/>
+              </w:rPr>
+              <w:t>+$9,550</w:t>
+            </w:r>
+          </w:p>
+        </w:tc>
+        <w:tc>
+          <w:tcPr>
+            <w:tcW w:type="dxa" w:w="2340"/>
+          </w:tcPr>
+          <w:p>
+            <w:r/>
+            <w:r>
+              <w:rPr>
+                <w:b/>
+                <w:i w:val="0"/>
+              </w:rPr>
+              <w:t>+$203,300</w:t>
+            </w:r>
+          </w:p>
+        </w:tc>
+      </w:tr>
+    </w:tbl>
+    <w:p>
+      <w:pPr>
+        <w:spacing w:after="40"/>
+      </w:pPr>
+    </w:p>
+    <w:p>
+      <w:r>
+        <w:rPr>
+          <w:b/>
+          <w:i w:val="0"/>
+        </w:rPr>
+        <w:t>Gate check:</w:t>
+      </w:r>
+      <w:r>
+        <w:rPr>
+          <w:b w:val="0"/>
+          <w:i w:val="0"/>
+        </w:rPr>
+        <w:t xml:space="preserve"> Year-2 cash flow </w:t>
+      </w:r>
+      <w:r>
+        <w:rPr>
+          <w:b/>
+          <w:i w:val="0"/>
+        </w:rPr>
+        <w:t>+$9,550 → break-even ✓</w:t>
+      </w:r>
+      <w:r>
+        <w:rPr>
+          <w:b w:val="0"/>
+          <w:i w:val="0"/>
+        </w:rPr>
+        <w:t xml:space="preserve"> · Year-3 EBITDA margin </w:t>
+      </w:r>
+      <w:r>
+        <w:rPr>
+          <w:b/>
+          <w:i w:val="0"/>
+        </w:rPr>
+        <w:t>40% ≥ 10% ✓</w:t>
+      </w:r>
+      <w:r>
+        <w:rPr>
+          <w:b w:val="0"/>
+          <w:i w:val="0"/>
+        </w:rPr>
+        <w:t xml:space="preserve"> · Year-1 loss ($262K) covered by the $350K working-capital reserve.</w:t>
+      </w:r>
+    </w:p>
+    <w:p>
+      <w:pPr>
+        <w:spacing w:before="80" w:after="120"/>
+        <w:ind w:left="288"/>
+        <w:shd w:val="clear" w:fill="F1EFE7"/>
+      </w:pPr>
+      <w:r>
+        <w:rPr>
+          <w:b/>
+          <w:i w:val="0"/>
+        </w:rPr>
+        <w:t>The honest read on these targets:</w:t>
+      </w:r>
+      <w:r>
+        <w:rPr>
+          <w:b w:val="0"/>
+          <w:i w:val="0"/>
+        </w:rPr>
+        <w:t xml:space="preserve"> </w:t>
+      </w:r>
+      <w:r>
+        <w:rPr>
+          <w:b/>
+          <w:i w:val="0"/>
+        </w:rPr>
+        <w:t>Year-2 break-even is the binding constraint, not the 10% EBITDA</w:t>
+      </w:r>
+      <w:r>
+        <w:rPr>
+          <w:b w:val="0"/>
+          <w:i w:val="0"/>
+        </w:rPr>
+        <w:t xml:space="preserve"> — a healthy venue clears 30–40% EBITDA by Year 3, so that gate is easy; the hard one is covering debt service by Year 2 while still ramping. It pencils here </w:t>
+      </w:r>
+      <w:r>
+        <w:rPr>
+          <w:b w:val="0"/>
+          <w:i/>
+        </w:rPr>
+        <w:t>only</w:t>
+      </w:r>
+      <w:r>
+        <w:rPr>
+          <w:b w:val="0"/>
+          <w:i w:val="0"/>
+        </w:rPr>
+        <w:t xml:space="preserve"> because the purchase stays at $2.5M (modest leverage) and revenue ramps to 75% by Year 2 — optimistic given 9–18-month booking lead times. Three levers decide it: </w:t>
+      </w:r>
+      <w:r>
+        <w:rPr>
+          <w:b/>
+          <w:i w:val="0"/>
+        </w:rPr>
+        <w:t>keep the purchase low</w:t>
+      </w:r>
+      <w:r>
+        <w:rPr>
+          <w:b w:val="0"/>
+          <w:i w:val="0"/>
+        </w:rPr>
+        <w:t xml:space="preserve"> (more equity, less debt service), </w:t>
+      </w:r>
+      <w:r>
+        <w:rPr>
+          <w:b/>
+          <w:i w:val="0"/>
+        </w:rPr>
+        <w:t>SBA 504 financing</w:t>
+      </w:r>
+      <w:r>
+        <w:rPr>
+          <w:b w:val="0"/>
+          <w:i w:val="0"/>
+        </w:rPr>
+        <w:t xml:space="preserve"> (cuts debt service materially), and </w:t>
+      </w:r>
+      <w:r>
+        <w:rPr>
+          <w:b/>
+          <w:i w:val="0"/>
+        </w:rPr>
+        <w:t>property type</w:t>
+      </w:r>
+      <w:r>
+        <w:rPr>
+          <w:b w:val="0"/>
+          <w:i w:val="0"/>
+        </w:rPr>
+        <w:t xml:space="preserve"> (a barn/warehouse's higher conversion cost forces a lower purchase to stay under $5M). A high-purchase, high-leverage deal misses Year-2 break-even even on a great building — which is exactly what the gate is there to catch.</w:t>
       </w:r>
     </w:p>
     <w:p>

</xml_diff>

<commit_message>
Clean up README: remove design-history framing, keep forward-looking spec
Drop enterprise-comparison intro, the 'what we cut' section, and
prior-draft references; restate the design guidance as positive
principles. Content of the spec itself is unchanged.

Co-Authored-By: Claude Opus 4.8 <noreply@anthropic.com>
</commit_message>
<xml_diff>
--- a/RealtyDog_Build_Spec.docx
+++ b/RealtyDog_Build_Spec.docx
@@ -261,1902 +261,6 @@
                 <w:i w:val="0"/>
               </w:rPr>
               <w:t>~5 focused weeks</w:t>
-            </w:r>
-          </w:p>
-        </w:tc>
-      </w:tr>
-    </w:tbl>
-    <w:p>
-      <w:pPr>
-        <w:spacing w:after="40"/>
-      </w:pPr>
-    </w:p>
-    <w:p>
-      <w:r>
-        <w:rPr>
-          <w:b w:val="0"/>
-          <w:i w:val="0"/>
-        </w:rPr>
-        <w:t>This replaces the original enterprise architecture (six datastores, Celery pools, real-time SLOs, 500-user tenancy, ~$3,835/mo) with a build sized to what we actually are: a small private partnership finding a handful of qualifying properties a week. The enterprise version is deferred to a future SaaS phase — the schema stays multi-user-aware so that pivot is a fan-out, not a rewrite.</w:t>
-      </w:r>
-    </w:p>
-    <w:p>
-      <w:pPr>
-        <w:pBdr>
-          <w:bottom w:val="single" w:sz="6" w:space="1" w:color="C9C3B4"/>
-        </w:pBdr>
-      </w:pPr>
-    </w:p>
-    <w:p>
-      <w:pPr>
-        <w:pStyle w:val="Heading2"/>
-      </w:pPr>
-      <w:r>
-        <w:t>1. The group model</w:t>
-      </w:r>
-    </w:p>
-    <w:p>
-      <w:r>
-        <w:rPr>
-          <w:b w:val="0"/>
-          <w:i w:val="0"/>
-        </w:rPr>
-        <w:t>One pooled strategy, one buy box, six notification endpoints. Because the investment is shared, everything per-user disappears — no individual filters, no tenancy, no fan-out logic.</w:t>
-      </w:r>
-    </w:p>
-    <w:p>
-      <w:pPr>
-        <w:pStyle w:val="ListBullet"/>
-      </w:pPr>
-      <w:r>
-        <w:rPr>
-          <w:b/>
-          <w:i w:val="0"/>
-        </w:rPr>
-        <w:t>Shared deal pipeline, not personal portfolios.</w:t>
-      </w:r>
-      <w:r>
-        <w:rPr>
-          <w:b w:val="0"/>
-          <w:i w:val="0"/>
-        </w:rPr>
-        <w:t xml:space="preserve"> The board runs </w:t>
-      </w:r>
-      <w:r>
-        <w:rPr>
-          <w:rFonts w:ascii="Consolas" w:hAnsi="Consolas"/>
-          <w:b w:val="0"/>
-          <w:i w:val="0"/>
-          <w:sz w:val="19"/>
-        </w:rPr>
-        <w:t>New → Reviewing → Site Visit → Offer → Closed / Passed</w:t>
-      </w:r>
-      <w:r>
-        <w:rPr>
-          <w:b w:val="0"/>
-          <w:i w:val="0"/>
-        </w:rPr>
-        <w:t xml:space="preserve"> with inline comments and a yes/no/maybe vote so the six of us converge on what to pursue.</w:t>
-      </w:r>
-    </w:p>
-    <w:p>
-      <w:pPr>
-        <w:pStyle w:val="ListBullet"/>
-      </w:pPr>
-      <w:r>
-        <w:rPr>
-          <w:b/>
-          <w:i w:val="0"/>
-        </w:rPr>
-        <w:t>The Telegram group is the primary surface.</w:t>
-      </w:r>
-      <w:r>
-        <w:rPr>
-          <w:b w:val="0"/>
-          <w:i w:val="0"/>
-        </w:rPr>
-        <w:t xml:space="preserve"> Deals land in the group, discussion happens inline, decisions get recorded.</w:t>
-      </w:r>
-    </w:p>
-    <w:p>
-      <w:pPr>
-        <w:pStyle w:val="ListBullet"/>
-      </w:pPr>
-      <w:r>
-        <w:rPr>
-          <w:b/>
-          <w:i w:val="0"/>
-        </w:rPr>
-        <w:t>No OAuth / RBAC / JWT.</w:t>
-      </w:r>
-      <w:r>
-        <w:rPr>
-          <w:b w:val="0"/>
-          <w:i w:val="0"/>
-        </w:rPr>
-        <w:t xml:space="preserve"> Six people = an allowlist of Telegram IDs. Real auth arrives only if the dashboard ever goes public.</w:t>
-      </w:r>
-    </w:p>
-    <w:p>
-      <w:pPr>
-        <w:spacing w:before="80" w:after="120"/>
-        <w:ind w:left="288"/>
-        <w:shd w:val="clear" w:fill="F1EFE7"/>
-      </w:pPr>
-      <w:r>
-        <w:rPr>
-          <w:b/>
-          <w:i w:val="0"/>
-        </w:rPr>
-        <w:t>Decide off-app:</w:t>
-      </w:r>
-      <w:r>
-        <w:rPr>
-          <w:b w:val="0"/>
-          <w:i w:val="0"/>
-        </w:rPr>
-        <w:t xml:space="preserve"> Pooling money among six friends implies an LLC/JV + operating agreement, and if any member is passive it can raise securities questions. That's a lawyer conversation, not an app feature — flagged so it doesn't surprise us. The app is only the shared research-and-decision record for that one entity. </w:t>
-      </w:r>
-      <w:r>
-        <w:rPr>
-          <w:b w:val="0"/>
-          <w:i/>
-        </w:rPr>
-        <w:t>(Not legal advice.)</w:t>
-      </w:r>
-    </w:p>
-    <w:p>
-      <w:pPr>
-        <w:pBdr>
-          <w:bottom w:val="single" w:sz="6" w:space="1" w:color="C9C3B4"/>
-        </w:pBdr>
-      </w:pPr>
-    </w:p>
-    <w:p>
-      <w:pPr>
-        <w:pStyle w:val="Heading2"/>
-      </w:pPr>
-      <w:r>
-        <w:t>2. Selection &amp; notification criteria</w:t>
-      </w:r>
-    </w:p>
-    <w:p>
-      <w:r>
-        <w:rPr>
-          <w:b/>
-          <w:i w:val="0"/>
-        </w:rPr>
-        <w:t>Selection and notification are two different gates.</w:t>
-      </w:r>
-      <w:r>
-        <w:rPr>
-          <w:b w:val="0"/>
-          <w:i w:val="0"/>
-        </w:rPr>
-        <w:t xml:space="preserve"> Everything that clears selection enters the pipeline quietly; only a subset crosses the notification threshold and interrupts the group. Selection runs in three layers.</w:t>
-      </w:r>
-    </w:p>
-    <w:p>
-      <w:pPr>
-        <w:pStyle w:val="Heading3"/>
-      </w:pPr>
-      <w:r>
-        <w:t>Layer 1 — Buy box (hard filter, pass/fail)</w:t>
-      </w:r>
-    </w:p>
-    <w:tbl>
-      <w:tblPr>
-        <w:tblStyle w:val="TableGrid"/>
-        <w:tblW w:type="auto" w:w="0"/>
-        <w:tblLayout w:type="autofit"/>
-        <w:tblLook w:firstColumn="1" w:firstRow="1" w:lastColumn="0" w:lastRow="0" w:noHBand="0" w:noVBand="1" w:val="04A0"/>
-      </w:tblPr>
-      <w:tblGrid>
-        <w:gridCol w:w="3120"/>
-        <w:gridCol w:w="3120"/>
-        <w:gridCol w:w="3120"/>
-      </w:tblGrid>
-      <w:tr>
-        <w:tc>
-          <w:tcPr>
-            <w:tcW w:type="dxa" w:w="3120"/>
-            <w:shd w:val="clear" w:fill="2F5D4E"/>
-          </w:tcPr>
-          <w:p>
-            <w:r/>
-            <w:r>
-              <w:rPr>
-                <w:b/>
-                <w:i w:val="0"/>
-                <w:color w:val="FFFFFF"/>
-              </w:rPr>
-              <w:t>Criterion</w:t>
-            </w:r>
-          </w:p>
-        </w:tc>
-        <w:tc>
-          <w:tcPr>
-            <w:tcW w:type="dxa" w:w="3120"/>
-            <w:shd w:val="clear" w:fill="2F5D4E"/>
-          </w:tcPr>
-          <w:p>
-            <w:r/>
-            <w:r>
-              <w:rPr>
-                <w:b/>
-                <w:i w:val="0"/>
-                <w:color w:val="FFFFFF"/>
-              </w:rPr>
-              <w:t>Threshold</w:t>
-            </w:r>
-          </w:p>
-        </w:tc>
-        <w:tc>
-          <w:tcPr>
-            <w:tcW w:type="dxa" w:w="3120"/>
-            <w:shd w:val="clear" w:fill="2F5D4E"/>
-          </w:tcPr>
-          <w:p>
-            <w:r/>
-            <w:r>
-              <w:rPr>
-                <w:b/>
-                <w:i w:val="0"/>
-                <w:color w:val="FFFFFF"/>
-              </w:rPr>
-              <w:t>Note</w:t>
-            </w:r>
-          </w:p>
-        </w:tc>
-      </w:tr>
-      <w:tr>
-        <w:tc>
-          <w:tcPr>
-            <w:tcW w:type="dxa" w:w="3120"/>
-          </w:tcPr>
-          <w:p>
-            <w:r/>
-            <w:r>
-              <w:rPr>
-                <w:b w:val="0"/>
-                <w:i w:val="0"/>
-              </w:rPr>
-              <w:t>Geography</w:t>
-            </w:r>
-          </w:p>
-        </w:tc>
-        <w:tc>
-          <w:tcPr>
-            <w:tcW w:type="dxa" w:w="3120"/>
-          </w:tcPr>
-          <w:p>
-            <w:r/>
-            <w:r>
-              <w:rPr>
-                <w:b w:val="0"/>
-                <w:i w:val="0"/>
-              </w:rPr>
-              <w:t>DFW + ring counties</w:t>
-            </w:r>
-          </w:p>
-        </w:tc>
-        <w:tc>
-          <w:tcPr>
-            <w:tcW w:type="dxa" w:w="3120"/>
-          </w:tcPr>
-          <w:p>
-            <w:r/>
-            <w:r>
-              <w:rPr>
-                <w:b w:val="0"/>
-                <w:i w:val="0"/>
-              </w:rPr>
-              <w:t>Dallas, Tarrant, Collin, Denton, Ellis, Johnson, Kaufman, Parker, Rockwall, Wise</w:t>
-            </w:r>
-          </w:p>
-        </w:tc>
-      </w:tr>
-      <w:tr>
-        <w:tc>
-          <w:tcPr>
-            <w:tcW w:type="dxa" w:w="3120"/>
-          </w:tcPr>
-          <w:p>
-            <w:r/>
-            <w:r>
-              <w:rPr>
-                <w:b w:val="0"/>
-                <w:i w:val="0"/>
-              </w:rPr>
-              <w:t>Land parcel</w:t>
-            </w:r>
-          </w:p>
-        </w:tc>
-        <w:tc>
-          <w:tcPr>
-            <w:tcW w:type="dxa" w:w="3120"/>
-          </w:tcPr>
-          <w:p>
-            <w:r/>
-            <w:r>
-              <w:rPr>
-                <w:b w:val="0"/>
-                <w:i w:val="0"/>
-              </w:rPr>
-              <w:t>≥ 5 acres</w:t>
-            </w:r>
-          </w:p>
-        </w:tc>
-        <w:tc>
-          <w:tcPr>
-            <w:tcW w:type="dxa" w:w="3120"/>
-          </w:tcPr>
-          <w:p>
-            <w:r/>
-            <w:r>
-              <w:rPr>
-                <w:b w:val="0"/>
-                <w:i w:val="0"/>
-              </w:rPr>
-              <w:t>Overall parcel size (min)</w:t>
-            </w:r>
-          </w:p>
-        </w:tc>
-      </w:tr>
-      <w:tr>
-        <w:tc>
-          <w:tcPr>
-            <w:tcW w:type="dxa" w:w="3120"/>
-          </w:tcPr>
-          <w:p>
-            <w:r/>
-            <w:r>
-              <w:rPr>
-                <w:b w:val="0"/>
-                <w:i w:val="0"/>
-              </w:rPr>
-              <w:t>Existing structure</w:t>
-            </w:r>
-          </w:p>
-        </w:tc>
-        <w:tc>
-          <w:tcPr>
-            <w:tcW w:type="dxa" w:w="3120"/>
-          </w:tcPr>
-          <w:p>
-            <w:r/>
-            <w:r>
-              <w:rPr>
-                <w:b w:val="0"/>
-                <w:i w:val="0"/>
-              </w:rPr>
-              <w:t>≥ 15,000 SF</w:t>
-            </w:r>
-          </w:p>
-        </w:tc>
-        <w:tc>
-          <w:tcPr>
-            <w:tcW w:type="dxa" w:w="3120"/>
-          </w:tcPr>
-          <w:p>
-            <w:r/>
-            <w:r>
-              <w:rPr>
-                <w:b w:val="0"/>
-                <w:i w:val="0"/>
-              </w:rPr>
-              <w:t>Must support 300+ guests</w:t>
-            </w:r>
-          </w:p>
-        </w:tc>
-      </w:tr>
-      <w:tr>
-        <w:tc>
-          <w:tcPr>
-            <w:tcW w:type="dxa" w:w="3120"/>
-          </w:tcPr>
-          <w:p>
-            <w:r/>
-            <w:r>
-              <w:rPr>
-                <w:b w:val="0"/>
-                <w:i w:val="0"/>
-              </w:rPr>
-              <w:t>Purchase price</w:t>
-            </w:r>
-          </w:p>
-        </w:tc>
-        <w:tc>
-          <w:tcPr>
-            <w:tcW w:type="dxa" w:w="3120"/>
-          </w:tcPr>
-          <w:p>
-            <w:r/>
-            <w:r>
-              <w:rPr>
-                <w:b w:val="0"/>
-                <w:i w:val="0"/>
-              </w:rPr>
-              <w:t>≤ $4M</w:t>
-            </w:r>
-          </w:p>
-        </w:tc>
-        <w:tc>
-          <w:tcPr>
-            <w:tcW w:type="dxa" w:w="3120"/>
-          </w:tcPr>
-          <w:p>
-            <w:r/>
-            <w:r>
-              <w:rPr>
-                <w:b w:val="0"/>
-                <w:i w:val="0"/>
-              </w:rPr>
-              <w:t>Modeled at negotiated price, not list</w:t>
-            </w:r>
-          </w:p>
-        </w:tc>
-      </w:tr>
-      <w:tr>
-        <w:tc>
-          <w:tcPr>
-            <w:tcW w:type="dxa" w:w="3120"/>
-          </w:tcPr>
-          <w:p>
-            <w:r/>
-            <w:r>
-              <w:rPr>
-                <w:b/>
-                <w:i w:val="0"/>
-              </w:rPr>
-              <w:t>Total all-in</w:t>
-            </w:r>
-          </w:p>
-        </w:tc>
-        <w:tc>
-          <w:tcPr>
-            <w:tcW w:type="dxa" w:w="3120"/>
-          </w:tcPr>
-          <w:p>
-            <w:r/>
-            <w:r>
-              <w:rPr>
-                <w:b/>
-                <w:i w:val="0"/>
-              </w:rPr>
-              <w:t>≤ $5M</w:t>
-            </w:r>
-          </w:p>
-        </w:tc>
-        <w:tc>
-          <w:tcPr>
-            <w:tcW w:type="dxa" w:w="3120"/>
-          </w:tcPr>
-          <w:p>
-            <w:r/>
-            <w:r>
-              <w:rPr>
-                <w:b/>
-                <w:i w:val="0"/>
-              </w:rPr>
-              <w:t>Binding constraint</w:t>
-            </w:r>
-            <w:r>
-              <w:rPr>
-                <w:b w:val="0"/>
-                <w:i w:val="0"/>
-              </w:rPr>
-              <w:t xml:space="preserve"> — purchase + conversion + working capital to break-even</w:t>
-            </w:r>
-          </w:p>
-        </w:tc>
-      </w:tr>
-      <w:tr>
-        <w:tc>
-          <w:tcPr>
-            <w:tcW w:type="dxa" w:w="3120"/>
-          </w:tcPr>
-          <w:p>
-            <w:r/>
-            <w:r>
-              <w:rPr>
-                <w:b w:val="0"/>
-                <w:i w:val="0"/>
-              </w:rPr>
-              <w:t>Property type</w:t>
-            </w:r>
-          </w:p>
-        </w:tc>
-        <w:tc>
-          <w:tcPr>
-            <w:tcW w:type="dxa" w:w="3120"/>
-          </w:tcPr>
-          <w:p>
-            <w:r/>
-            <w:r>
-              <w:rPr>
-                <w:b w:val="0"/>
-                <w:i w:val="0"/>
-              </w:rPr>
-              <w:t>Barn / church / commercial</w:t>
-            </w:r>
-          </w:p>
-        </w:tc>
-        <w:tc>
-          <w:tcPr>
-            <w:tcW w:type="dxa" w:w="3120"/>
-          </w:tcPr>
-          <w:p>
-            <w:r/>
-            <w:r>
-              <w:rPr>
-                <w:b w:val="0"/>
-                <w:i w:val="0"/>
-              </w:rPr>
-              <w:t>Existing building to retrofit — no raw land, no ground-up</w:t>
-            </w:r>
-          </w:p>
-        </w:tc>
-      </w:tr>
-      <w:tr>
-        <w:tc>
-          <w:tcPr>
-            <w:tcW w:type="dxa" w:w="3120"/>
-          </w:tcPr>
-          <w:p>
-            <w:r/>
-            <w:r>
-              <w:rPr>
-                <w:b w:val="0"/>
-                <w:i w:val="0"/>
-              </w:rPr>
-              <w:t>Capacity</w:t>
-            </w:r>
-          </w:p>
-        </w:tc>
-        <w:tc>
-          <w:tcPr>
-            <w:tcW w:type="dxa" w:w="3120"/>
-          </w:tcPr>
-          <w:p>
-            <w:r/>
-            <w:r>
-              <w:rPr>
-                <w:b w:val="0"/>
-                <w:i w:val="0"/>
-              </w:rPr>
-              <w:t>300+ guests</w:t>
-            </w:r>
-          </w:p>
-        </w:tc>
-        <w:tc>
-          <w:tcPr>
-            <w:tcW w:type="dxa" w:w="3120"/>
-          </w:tcPr>
-          <w:p>
-            <w:r/>
-            <w:r>
-              <w:rPr>
-                <w:b w:val="0"/>
-                <w:i w:val="0"/>
-              </w:rPr>
-              <w:t>Parking (~100 spaces), ADA restrooms, HVAC, egress</w:t>
-            </w:r>
-          </w:p>
-        </w:tc>
-      </w:tr>
-      <w:tr>
-        <w:tc>
-          <w:tcPr>
-            <w:tcW w:type="dxa" w:w="3120"/>
-          </w:tcPr>
-          <w:p>
-            <w:r/>
-            <w:r>
-              <w:rPr>
-                <w:b w:val="0"/>
-                <w:i w:val="0"/>
-              </w:rPr>
-              <w:t>Go-live</w:t>
-            </w:r>
-          </w:p>
-        </w:tc>
-        <w:tc>
-          <w:tcPr>
-            <w:tcW w:type="dxa" w:w="3120"/>
-          </w:tcPr>
-          <w:p>
-            <w:r/>
-            <w:r>
-              <w:rPr>
-                <w:b w:val="0"/>
-                <w:i w:val="0"/>
-              </w:rPr>
-              <w:t>≤ 6 months</w:t>
-            </w:r>
-          </w:p>
-        </w:tc>
-        <w:tc>
-          <w:tcPr>
-            <w:tcW w:type="dxa" w:w="3120"/>
-          </w:tcPr>
-          <w:p>
-            <w:r/>
-            <w:r>
-              <w:rPr>
-                <w:b w:val="0"/>
-                <w:i w:val="0"/>
-              </w:rPr>
-              <w:t>Favors assembly-zoned, structurally sound, utility-served</w:t>
-            </w:r>
-          </w:p>
-        </w:tc>
-      </w:tr>
-      <w:tr>
-        <w:tc>
-          <w:tcPr>
-            <w:tcW w:type="dxa" w:w="3120"/>
-          </w:tcPr>
-          <w:p>
-            <w:r/>
-            <w:r>
-              <w:rPr>
-                <w:b w:val="0"/>
-                <w:i w:val="0"/>
-              </w:rPr>
-              <w:t>Hard exclusions</w:t>
-            </w:r>
-          </w:p>
-        </w:tc>
-        <w:tc>
-          <w:tcPr>
-            <w:tcW w:type="dxa" w:w="3120"/>
-          </w:tcPr>
-          <w:p>
-            <w:r/>
-            <w:r>
-              <w:rPr>
-                <w:b w:val="0"/>
-                <w:i w:val="0"/>
-              </w:rPr>
-              <w:t>—</w:t>
-            </w:r>
-          </w:p>
-        </w:tc>
-        <w:tc>
-          <w:tcPr>
-            <w:tcW w:type="dxa" w:w="3120"/>
-          </w:tcPr>
-          <w:p>
-            <w:r/>
-            <w:r>
-              <w:rPr>
-                <w:b w:val="0"/>
-                <w:i w:val="0"/>
-              </w:rPr>
-              <w:t>Flood AE/AO · Superfund ≤ 1 mi · condemnation · saturated sub-market (Layer 3)</w:t>
-            </w:r>
-          </w:p>
-        </w:tc>
-      </w:tr>
-    </w:tbl>
-    <w:p>
-      <w:pPr>
-        <w:spacing w:after="40"/>
-      </w:pPr>
-    </w:p>
-    <w:p>
-      <w:pPr>
-        <w:spacing w:before="80" w:after="120"/>
-        <w:ind w:left="288"/>
-        <w:shd w:val="clear" w:fill="F1EFE7"/>
-      </w:pPr>
-      <w:r>
-        <w:rPr>
-          <w:b/>
-          <w:i w:val="0"/>
-        </w:rPr>
-        <w:t>The coupled budget drives most decisions.</w:t>
-      </w:r>
-      <w:r>
-        <w:rPr>
-          <w:b w:val="0"/>
-          <w:i w:val="0"/>
-        </w:rPr>
-        <w:t xml:space="preserve"> $4M purchase </w:t>
-      </w:r>
-      <w:r>
-        <w:rPr>
-          <w:b w:val="0"/>
-          <w:i/>
-        </w:rPr>
-        <w:t>and</w:t>
-      </w:r>
-      <w:r>
-        <w:rPr>
-          <w:b w:val="0"/>
-          <w:i w:val="0"/>
-        </w:rPr>
-        <w:t xml:space="preserve"> $5M all-in means </w:t>
-      </w:r>
-      <w:r>
-        <w:rPr>
-          <w:b/>
-          <w:i w:val="0"/>
-        </w:rPr>
-        <w:t>conversion + working capital ≤ ($5M − negotiated price)</w:t>
-      </w:r>
-      <w:r>
-        <w:rPr>
-          <w:b w:val="0"/>
-          <w:i w:val="0"/>
-        </w:rPr>
-        <w:t xml:space="preserve">. At a $4M buy that leaves only ~$1M for a 300-guest retrofit + ramp — rarely enough, so the $5M cap will reject most top-of-budget purchases. The sweet spot is a </w:t>
-      </w:r>
-      <w:r>
-        <w:rPr>
-          <w:b/>
-          <w:i w:val="0"/>
-        </w:rPr>
-        <w:t>~$2–3M purchase</w:t>
-      </w:r>
-      <w:r>
-        <w:rPr>
-          <w:b w:val="0"/>
-          <w:i w:val="0"/>
-        </w:rPr>
-        <w:t xml:space="preserve"> leaving $2–3M for conversion + working capital. RealtyDog shows this headroom on every deal card.</w:t>
-      </w:r>
-    </w:p>
-    <w:p>
-      <w:pPr>
-        <w:pStyle w:val="Heading3"/>
-      </w:pPr>
-      <w:r>
-        <w:t>Layer 2 — Motivation score (off-market ranker)</w:t>
-      </w:r>
-    </w:p>
-    <w:p>
-      <w:r>
-        <w:rPr>
-          <w:b w:val="0"/>
-          <w:i w:val="0"/>
-        </w:rPr>
-        <w:t xml:space="preserve">Ranks which qualifying owners to pursue first, now headlined by the </w:t>
-      </w:r>
-      <w:r>
-        <w:rPr>
-          <w:b/>
-          <w:i w:val="0"/>
-        </w:rPr>
-        <w:t>distressed non-profit</w:t>
-      </w:r>
-      <w:r>
-        <w:rPr>
-          <w:b w:val="0"/>
-          <w:i w:val="0"/>
-        </w:rPr>
-        <w:t xml:space="preserve"> signal (full rubric in Section 8). Bucketed </w:t>
-      </w:r>
-      <w:r>
-        <w:rPr>
-          <w:b/>
-          <w:i w:val="0"/>
-        </w:rPr>
-        <w:t>HOT ≥ 60 · WARM 30–59 · COLD &lt; 30</w:t>
-      </w:r>
-      <w:r>
-        <w:rPr>
-          <w:b w:val="0"/>
-          <w:i w:val="0"/>
-        </w:rPr>
-        <w:t>.</w:t>
-      </w:r>
-    </w:p>
-    <w:p>
-      <w:pPr>
-        <w:pStyle w:val="Heading3"/>
-      </w:pPr>
-      <w:r>
-        <w:t>Layer 3 — Financial &amp; market qualification (hard gate, post-enrichment)</w:t>
-      </w:r>
-    </w:p>
-    <w:p>
-      <w:r>
-        <w:rPr>
-          <w:b w:val="0"/>
-          <w:i w:val="0"/>
-        </w:rPr>
-        <w:t xml:space="preserve">The pro-forma is part of selection, not just analysis. A property must clear </w:t>
-      </w:r>
-      <w:r>
-        <w:rPr>
-          <w:b w:val="0"/>
-          <w:i/>
-        </w:rPr>
-        <w:t>all</w:t>
-      </w:r>
-      <w:r>
-        <w:rPr>
-          <w:b w:val="0"/>
-          <w:i w:val="0"/>
-        </w:rPr>
-        <w:t xml:space="preserve"> of:</w:t>
-      </w:r>
-    </w:p>
-    <w:p>
-      <w:pPr>
-        <w:pStyle w:val="ListBullet"/>
-      </w:pPr>
-      <w:r>
-        <w:rPr>
-          <w:b/>
-          <w:i w:val="0"/>
-        </w:rPr>
-        <w:t>Return gate:</w:t>
-      </w:r>
-      <w:r>
-        <w:rPr>
-          <w:b w:val="0"/>
-          <w:i w:val="0"/>
-        </w:rPr>
-        <w:t xml:space="preserve"> at standard assumptions, </w:t>
-      </w:r>
-      <w:r>
-        <w:rPr>
-          <w:b/>
-          <w:i w:val="0"/>
-        </w:rPr>
-        <w:t>Year-2 break-even AND Year-3 EBITDA ≥ 10%</w:t>
-      </w:r>
-      <w:r>
-        <w:rPr>
-          <w:b w:val="0"/>
-          <w:i w:val="0"/>
-        </w:rPr>
-        <w:t>, within the $5M all-in. Can't model to it → rejected.</w:t>
-      </w:r>
-    </w:p>
-    <w:p>
-      <w:pPr>
-        <w:pStyle w:val="ListBullet"/>
-      </w:pPr>
-      <w:r>
-        <w:rPr>
-          <w:b/>
-          <w:i w:val="0"/>
-        </w:rPr>
-        <w:t>Negotiated price:</w:t>
-      </w:r>
-      <w:r>
-        <w:rPr>
-          <w:b w:val="0"/>
-          <w:i w:val="0"/>
-        </w:rPr>
-        <w:t xml:space="preserve"> the buy is priced at an expected market-condition discount to list/assessed, not list. Pre-filter screens list/assessed ≤ ~$4.5–5M, then the hard test runs on the modeled negotiated number.</w:t>
-      </w:r>
-    </w:p>
-    <w:p>
-      <w:pPr>
-        <w:pStyle w:val="ListBullet"/>
-      </w:pPr>
-      <w:r>
-        <w:rPr>
-          <w:b/>
-          <w:i w:val="0"/>
-        </w:rPr>
-        <w:t>Capacity to 300+:</w:t>
-      </w:r>
-      <w:r>
-        <w:rPr>
-          <w:b w:val="0"/>
-          <w:i w:val="0"/>
-        </w:rPr>
-        <w:t xml:space="preserve"> any retrofit cost to reach parking / restroom / HVAC / egress for 300 counts against the $5M.</w:t>
-      </w:r>
-    </w:p>
-    <w:p>
-      <w:pPr>
-        <w:pStyle w:val="ListBullet"/>
-      </w:pPr>
-      <w:r>
-        <w:rPr>
-          <w:b/>
-          <w:i w:val="0"/>
-        </w:rPr>
-        <w:t>Competitor demand:</w:t>
-      </w:r>
-      <w:r>
-        <w:rPr>
-          <w:b w:val="0"/>
-          <w:i w:val="0"/>
-        </w:rPr>
-        <w:t xml:space="preserve"> </w:t>
-      </w:r>
-      <w:r>
-        <w:rPr>
-          <w:b/>
-          <w:i w:val="0"/>
-        </w:rPr>
-        <w:t>reject</w:t>
-      </w:r>
-      <w:r>
-        <w:rPr>
-          <w:b w:val="0"/>
-          <w:i w:val="0"/>
-        </w:rPr>
-        <w:t xml:space="preserve"> a sub-market where nearby venues run </w:t>
-      </w:r>
-      <w:r>
-        <w:rPr>
-          <w:b/>
-          <w:i w:val="0"/>
-        </w:rPr>
-        <w:t>&lt; 40% utilization</w:t>
-      </w:r>
-      <w:r>
-        <w:rPr>
-          <w:b w:val="0"/>
-          <w:i w:val="0"/>
-        </w:rPr>
-        <w:t xml:space="preserve"> (estimated from review cadence + booking-calendar availability).</w:t>
-      </w:r>
-    </w:p>
-    <w:p>
-      <w:pPr>
-        <w:pStyle w:val="ListBullet"/>
-      </w:pPr>
-      <w:r>
-        <w:rPr>
-          <w:b/>
-          <w:i w:val="0"/>
-        </w:rPr>
-        <w:t>Retrofit feasibility ≤ 6 months:</w:t>
-      </w:r>
-      <w:r>
-        <w:rPr>
-          <w:b w:val="0"/>
-          <w:i w:val="0"/>
-        </w:rPr>
-        <w:t xml:space="preserve"> rezoning-required → excluded; CUP-required → amber timeline-risk flag.</w:t>
-      </w:r>
-    </w:p>
-    <w:p>
-      <w:pPr>
-        <w:spacing w:before="80" w:after="120"/>
-        <w:ind w:left="288"/>
-        <w:shd w:val="clear" w:fill="F1EFE7"/>
-      </w:pPr>
-      <w:r>
-        <w:rPr>
-          <w:b/>
-          <w:i w:val="0"/>
-        </w:rPr>
-        <w:t>Two honest flags.</w:t>
-      </w:r>
-      <w:r>
-        <w:rPr>
-          <w:b w:val="0"/>
-          <w:i w:val="0"/>
-        </w:rPr>
-        <w:t xml:space="preserve"> </w:t>
-      </w:r>
-      <w:r>
-        <w:rPr>
-          <w:b w:val="0"/>
-          <w:i/>
-        </w:rPr>
-        <w:t>6-month go-live is aggressive</w:t>
-      </w:r>
-      <w:r>
-        <w:rPr>
-          <w:b w:val="0"/>
-          <w:i w:val="0"/>
-        </w:rPr>
-        <w:t xml:space="preserve"> for 300+ capacity — a CUP alone is 60–120 days, so this works as a selection </w:t>
-      </w:r>
-      <w:r>
-        <w:rPr>
-          <w:b w:val="0"/>
-          <w:i/>
-        </w:rPr>
-        <w:t>preference</w:t>
-      </w:r>
-      <w:r>
-        <w:rPr>
-          <w:b w:val="0"/>
-          <w:i w:val="0"/>
-        </w:rPr>
-        <w:t xml:space="preserve"> (favor already-assembly-zoned, utility-served buildings), not a promise. </w:t>
-      </w:r>
-      <w:r>
-        <w:rPr>
-          <w:b w:val="0"/>
-          <w:i/>
-        </w:rPr>
-        <w:t>Competitor utilization is an estimate</w:t>
-      </w:r>
-      <w:r>
-        <w:rPr>
-          <w:b w:val="0"/>
-          <w:i w:val="0"/>
-        </w:rPr>
-        <w:t>, not published data — treat &lt; 40% as an amber "verify" flag, sanity-checked against a few known venues before it hard-rejects a sub-market.</w:t>
-      </w:r>
-    </w:p>
-    <w:p>
-      <w:pPr>
-        <w:pStyle w:val="Heading3"/>
-      </w:pPr>
-      <w:r>
-        <w:t>Notification tiers</w:t>
-      </w:r>
-    </w:p>
-    <w:tbl>
-      <w:tblPr>
-        <w:tblStyle w:val="TableGrid"/>
-        <w:tblW w:type="auto" w:w="0"/>
-        <w:tblLayout w:type="autofit"/>
-        <w:tblLook w:firstColumn="1" w:firstRow="1" w:lastColumn="0" w:lastRow="0" w:noHBand="0" w:noVBand="1" w:val="04A0"/>
-      </w:tblPr>
-      <w:tblGrid>
-        <w:gridCol w:w="3120"/>
-        <w:gridCol w:w="3120"/>
-        <w:gridCol w:w="3120"/>
-      </w:tblGrid>
-      <w:tr>
-        <w:tc>
-          <w:tcPr>
-            <w:tcW w:type="dxa" w:w="3120"/>
-            <w:shd w:val="clear" w:fill="2F5D4E"/>
-          </w:tcPr>
-          <w:p>
-            <w:r/>
-            <w:r>
-              <w:rPr>
-                <w:b/>
-                <w:i w:val="0"/>
-                <w:color w:val="FFFFFF"/>
-              </w:rPr>
-              <w:t>Tier</w:t>
-            </w:r>
-          </w:p>
-        </w:tc>
-        <w:tc>
-          <w:tcPr>
-            <w:tcW w:type="dxa" w:w="3120"/>
-            <w:shd w:val="clear" w:fill="2F5D4E"/>
-          </w:tcPr>
-          <w:p>
-            <w:r/>
-            <w:r>
-              <w:rPr>
-                <w:b/>
-                <w:i w:val="0"/>
-                <w:color w:val="FFFFFF"/>
-              </w:rPr>
-              <w:t>Trigger</w:t>
-            </w:r>
-          </w:p>
-        </w:tc>
-        <w:tc>
-          <w:tcPr>
-            <w:tcW w:type="dxa" w:w="3120"/>
-            <w:shd w:val="clear" w:fill="2F5D4E"/>
-          </w:tcPr>
-          <w:p>
-            <w:r/>
-            <w:r>
-              <w:rPr>
-                <w:b/>
-                <w:i w:val="0"/>
-                <w:color w:val="FFFFFF"/>
-              </w:rPr>
-              <w:t>Channel</w:t>
-            </w:r>
-          </w:p>
-        </w:tc>
-      </w:tr>
-      <w:tr>
-        <w:tc>
-          <w:tcPr>
-            <w:tcW w:type="dxa" w:w="3120"/>
-          </w:tcPr>
-          <w:p>
-            <w:r/>
-            <w:r>
-              <w:rPr>
-                <w:b/>
-                <w:i w:val="0"/>
-              </w:rPr>
-              <w:t>Instant</w:t>
-            </w:r>
-          </w:p>
-        </w:tc>
-        <w:tc>
-          <w:tcPr>
-            <w:tcW w:type="dxa" w:w="3120"/>
-          </w:tcPr>
-          <w:p>
-            <w:r/>
-            <w:r>
-              <w:rPr>
-                <w:b w:val="0"/>
-                <w:i w:val="0"/>
-              </w:rPr>
-              <w:t>New buy-box parcel that's Hot (≥ 60), or a new on-market buy-box listing that clears the Layer-3 return gate</w:t>
-            </w:r>
-          </w:p>
-        </w:tc>
-        <w:tc>
-          <w:tcPr>
-            <w:tcW w:type="dxa" w:w="3120"/>
-          </w:tcPr>
-          <w:p>
-            <w:r/>
-            <w:r>
-              <w:rPr>
-                <w:b w:val="0"/>
-                <w:i w:val="0"/>
-              </w:rPr>
-              <w:t>Telegram group, next scan</w:t>
-            </w:r>
-          </w:p>
-        </w:tc>
-      </w:tr>
-      <w:tr>
-        <w:tc>
-          <w:tcPr>
-            <w:tcW w:type="dxa" w:w="3120"/>
-          </w:tcPr>
-          <w:p>
-            <w:r/>
-            <w:r>
-              <w:rPr>
-                <w:b/>
-                <w:i w:val="0"/>
-              </w:rPr>
-              <w:t>Nightly digest</w:t>
-            </w:r>
-          </w:p>
-        </w:tc>
-        <w:tc>
-          <w:tcPr>
-            <w:tcW w:type="dxa" w:w="3120"/>
-          </w:tcPr>
-          <w:p>
-            <w:r/>
-            <w:r>
-              <w:rPr>
-                <w:b w:val="0"/>
-                <w:i w:val="0"/>
-              </w:rPr>
-              <w:t>New Warm prospects + everything new that passed the buy box</w:t>
-            </w:r>
-          </w:p>
-        </w:tc>
-        <w:tc>
-          <w:tcPr>
-            <w:tcW w:type="dxa" w:w="3120"/>
-          </w:tcPr>
-          <w:p>
-            <w:r/>
-            <w:r>
-              <w:rPr>
-                <w:b w:val="0"/>
-                <w:i w:val="0"/>
-              </w:rPr>
-              <w:t>Telegram + email, 8 AM</w:t>
-            </w:r>
-          </w:p>
-        </w:tc>
-      </w:tr>
-      <w:tr>
-        <w:tc>
-          <w:tcPr>
-            <w:tcW w:type="dxa" w:w="3120"/>
-          </w:tcPr>
-          <w:p>
-            <w:r/>
-            <w:r>
-              <w:rPr>
-                <w:b/>
-                <w:i w:val="0"/>
-              </w:rPr>
-              <w:t>On-demand</w:t>
-            </w:r>
-          </w:p>
-        </w:tc>
-        <w:tc>
-          <w:tcPr>
-            <w:tcW w:type="dxa" w:w="3120"/>
-          </w:tcPr>
-          <w:p>
-            <w:r/>
-            <w:r>
-              <w:rPr>
-                <w:rFonts w:ascii="Consolas" w:hAnsi="Consolas"/>
-                <w:b w:val="0"/>
-                <w:i w:val="0"/>
-                <w:sz w:val="19"/>
-              </w:rPr>
-              <w:t>/analyze</w:t>
-            </w:r>
-            <w:r>
-              <w:rPr>
-                <w:b w:val="0"/>
-                <w:i w:val="0"/>
-              </w:rPr>
-              <w:t xml:space="preserve">, </w:t>
-            </w:r>
-            <w:r>
-              <w:rPr>
-                <w:rFonts w:ascii="Consolas" w:hAnsi="Consolas"/>
-                <w:b w:val="0"/>
-                <w:i w:val="0"/>
-                <w:sz w:val="19"/>
-              </w:rPr>
-              <w:t>/tip</w:t>
-            </w:r>
-            <w:r>
-              <w:rPr>
-                <w:b w:val="0"/>
-                <w:i w:val="0"/>
-              </w:rPr>
-              <w:t xml:space="preserve">, </w:t>
-            </w:r>
-            <w:r>
-              <w:rPr>
-                <w:rFonts w:ascii="Consolas" w:hAnsi="Consolas"/>
-                <w:b w:val="0"/>
-                <w:i w:val="0"/>
-                <w:sz w:val="19"/>
-              </w:rPr>
-              <w:t>/prospects</w:t>
-            </w:r>
-          </w:p>
-        </w:tc>
-        <w:tc>
-          <w:tcPr>
-            <w:tcW w:type="dxa" w:w="3120"/>
-          </w:tcPr>
-          <w:p>
-            <w:r/>
-            <w:r>
-              <w:rPr>
-                <w:b w:val="0"/>
-                <w:i w:val="0"/>
-              </w:rPr>
-              <w:t>Whoever asked</w:t>
-            </w:r>
-          </w:p>
-        </w:tc>
-      </w:tr>
-    </w:tbl>
-    <w:p>
-      <w:pPr>
-        <w:spacing w:after="40"/>
-      </w:pPr>
-    </w:p>
-    <w:p>
-      <w:r>
-        <w:rPr>
-          <w:b/>
-          <w:i w:val="0"/>
-        </w:rPr>
-        <w:t>Cold (&lt; 30) is selected but never notified</w:t>
-      </w:r>
-      <w:r>
-        <w:rPr>
-          <w:b w:val="0"/>
-          <w:i w:val="0"/>
-        </w:rPr>
-        <w:t xml:space="preserve"> — it lives in the universe and surfaces only via </w:t>
-      </w:r>
-      <w:r>
-        <w:rPr>
-          <w:rFonts w:ascii="Consolas" w:hAnsi="Consolas"/>
-          <w:b w:val="0"/>
-          <w:i w:val="0"/>
-          <w:sz w:val="19"/>
-        </w:rPr>
-        <w:t>/prospects</w:t>
-      </w:r>
-      <w:r>
-        <w:rPr>
-          <w:b w:val="0"/>
-          <w:i w:val="0"/>
-        </w:rPr>
-        <w:t>. A dedup ledger (parcel + signal) prevents notifying the same property twice for the same trigger. All thresholds are per-group config.</w:t>
-      </w:r>
-    </w:p>
-    <w:p>
-      <w:pPr>
-        <w:pBdr>
-          <w:bottom w:val="single" w:sz="6" w:space="1" w:color="C9C3B4"/>
-        </w:pBdr>
-      </w:pPr>
-    </w:p>
-    <w:p>
-      <w:pPr>
-        <w:pStyle w:val="Heading2"/>
-      </w:pPr>
-      <w:r>
-        <w:t>3. Architecture — the whole thing</w:t>
-      </w:r>
-    </w:p>
-    <w:p>
-      <w:pPr>
-        <w:pStyle w:val="ListBullet"/>
-      </w:pPr>
-      <w:r>
-        <w:rPr>
-          <w:b/>
-          <w:i w:val="0"/>
-        </w:rPr>
-        <w:t>One service.</w:t>
-      </w:r>
-      <w:r>
-        <w:rPr>
-          <w:b w:val="0"/>
-          <w:i w:val="0"/>
-        </w:rPr>
-        <w:t xml:space="preserve"> FastAPI + APScheduler in a single process. Scheduler jobs: ingest → filter → enrich → score → digest.</w:t>
-      </w:r>
-    </w:p>
-    <w:p>
-      <w:pPr>
-        <w:pStyle w:val="ListBullet"/>
-      </w:pPr>
-      <w:r>
-        <w:rPr>
-          <w:b/>
-          <w:i w:val="0"/>
-        </w:rPr>
-        <w:t>One database.</w:t>
-      </w:r>
-      <w:r>
-        <w:rPr>
-          <w:b w:val="0"/>
-          <w:i w:val="0"/>
-        </w:rPr>
-        <w:t xml:space="preserve"> Postgres with PostGIS (geo), JSONB (raw payloads), </w:t>
-      </w:r>
-      <w:r>
-        <w:rPr>
-          <w:rFonts w:ascii="Consolas" w:hAnsi="Consolas"/>
-          <w:b w:val="0"/>
-          <w:i w:val="0"/>
-          <w:sz w:val="19"/>
-        </w:rPr>
-        <w:t>pg_trgm</w:t>
-      </w:r>
-      <w:r>
-        <w:rPr>
-          <w:b w:val="0"/>
-          <w:i w:val="0"/>
-        </w:rPr>
-        <w:t xml:space="preserve"> (fuzzy dedup + search). This alone replaces PostgreSQL + MongoDB + Elasticsearch + Pinecone + Snowflake from the original.</w:t>
-      </w:r>
-    </w:p>
-    <w:p>
-      <w:pPr>
-        <w:pStyle w:val="ListBullet"/>
-      </w:pPr>
-      <w:r>
-        <w:rPr>
-          <w:b/>
-          <w:i w:val="0"/>
-        </w:rPr>
-        <w:t>S3 / Backblaze B2</w:t>
-      </w:r>
-      <w:r>
-        <w:rPr>
-          <w:b w:val="0"/>
-          <w:i w:val="0"/>
-        </w:rPr>
-        <w:t xml:space="preserve"> for property photos — the only thing Postgres shouldn't hold.</w:t>
-      </w:r>
-    </w:p>
-    <w:p>
-      <w:pPr>
-        <w:pStyle w:val="ListBullet"/>
-      </w:pPr>
-      <w:r>
-        <w:rPr>
-          <w:b/>
-          <w:i w:val="0"/>
-        </w:rPr>
-        <w:t>Telegram-first.</w:t>
-      </w:r>
-      <w:r>
-        <w:rPr>
-          <w:b w:val="0"/>
-          <w:i w:val="0"/>
-        </w:rPr>
-        <w:t xml:space="preserve"> Free, rich cards, inline buttons, group-native. No Twilio/SMS — it's the one paid, rate-limited, verification-heavy channel and the group doesn't need it. Free-tier email for the daily digest.</w:t>
-      </w:r>
-    </w:p>
-    <w:p>
-      <w:pPr>
-        <w:pStyle w:val="ListBullet"/>
-      </w:pPr>
-      <w:r>
-        <w:rPr>
-          <w:b/>
-          <w:i w:val="0"/>
-        </w:rPr>
-        <w:t>Deploy</w:t>
-      </w:r>
-      <w:r>
-        <w:rPr>
-          <w:b w:val="0"/>
-          <w:i w:val="0"/>
-        </w:rPr>
-        <w:t xml:space="preserve"> on Railway/Fly, single process, </w:t>
-      </w:r>
-      <w:r>
-        <w:rPr>
-          <w:rFonts w:ascii="Consolas" w:hAnsi="Consolas"/>
-          <w:b w:val="0"/>
-          <w:i w:val="0"/>
-          <w:sz w:val="19"/>
-        </w:rPr>
-        <w:t>alembic upgrade head</w:t>
-      </w:r>
-      <w:r>
-        <w:rPr>
-          <w:b w:val="0"/>
-          <w:i w:val="0"/>
-        </w:rPr>
-        <w:t xml:space="preserve"> on deploy.</w:t>
-      </w:r>
-    </w:p>
-    <w:p>
-      <w:pPr>
-        <w:pStyle w:val="Heading3"/>
-      </w:pPr>
-      <w:r>
-        <w:t>Monthly cost</w:t>
-      </w:r>
-    </w:p>
-    <w:tbl>
-      <w:tblPr>
-        <w:tblStyle w:val="TableGrid"/>
-        <w:tblW w:type="auto" w:w="0"/>
-        <w:tblLayout w:type="autofit"/>
-        <w:tblLook w:firstColumn="1" w:firstRow="1" w:lastColumn="0" w:lastRow="0" w:noHBand="0" w:noVBand="1" w:val="04A0"/>
-      </w:tblPr>
-      <w:tblGrid>
-        <w:gridCol w:w="3120"/>
-        <w:gridCol w:w="3120"/>
-        <w:gridCol w:w="3120"/>
-      </w:tblGrid>
-      <w:tr>
-        <w:tc>
-          <w:tcPr>
-            <w:tcW w:type="dxa" w:w="3120"/>
-            <w:shd w:val="clear" w:fill="2F5D4E"/>
-          </w:tcPr>
-          <w:p>
-            <w:r/>
-            <w:r>
-              <w:rPr>
-                <w:b/>
-                <w:i w:val="0"/>
-                <w:color w:val="FFFFFF"/>
-              </w:rPr>
-              <w:t>Line</w:t>
-            </w:r>
-          </w:p>
-        </w:tc>
-        <w:tc>
-          <w:tcPr>
-            <w:tcW w:type="dxa" w:w="3120"/>
-            <w:shd w:val="clear" w:fill="2F5D4E"/>
-          </w:tcPr>
-          <w:p>
-            <w:r/>
-            <w:r>
-              <w:rPr>
-                <w:b/>
-                <w:i w:val="0"/>
-                <w:color w:val="FFFFFF"/>
-              </w:rPr>
-              <w:t>Choice</w:t>
-            </w:r>
-          </w:p>
-        </w:tc>
-        <w:tc>
-          <w:tcPr>
-            <w:tcW w:type="dxa" w:w="3120"/>
-            <w:shd w:val="clear" w:fill="2F5D4E"/>
-          </w:tcPr>
-          <w:p>
-            <w:r/>
-            <w:r>
-              <w:rPr>
-                <w:b/>
-                <w:i w:val="0"/>
-                <w:color w:val="FFFFFF"/>
-              </w:rPr>
-              <w:t>Cost</w:t>
-            </w:r>
-          </w:p>
-        </w:tc>
-      </w:tr>
-      <w:tr>
-        <w:tc>
-          <w:tcPr>
-            <w:tcW w:type="dxa" w:w="3120"/>
-          </w:tcPr>
-          <w:p>
-            <w:r/>
-            <w:r>
-              <w:rPr>
-                <w:b w:val="0"/>
-                <w:i w:val="0"/>
-              </w:rPr>
-              <w:t>Compute</w:t>
-            </w:r>
-          </w:p>
-        </w:tc>
-        <w:tc>
-          <w:tcPr>
-            <w:tcW w:type="dxa" w:w="3120"/>
-          </w:tcPr>
-          <w:p>
-            <w:r/>
-            <w:r>
-              <w:rPr>
-                <w:b w:val="0"/>
-                <w:i w:val="0"/>
-              </w:rPr>
-              <w:t>Single process, Railway/Fly</w:t>
-            </w:r>
-          </w:p>
-        </w:tc>
-        <w:tc>
-          <w:tcPr>
-            <w:tcW w:type="dxa" w:w="3120"/>
-          </w:tcPr>
-          <w:p>
-            <w:r/>
-            <w:r>
-              <w:rPr>
-                <w:b w:val="0"/>
-                <w:i w:val="0"/>
-              </w:rPr>
-              <w:t>$5–20</w:t>
-            </w:r>
-          </w:p>
-        </w:tc>
-      </w:tr>
-      <w:tr>
-        <w:tc>
-          <w:tcPr>
-            <w:tcW w:type="dxa" w:w="3120"/>
-          </w:tcPr>
-          <w:p>
-            <w:r/>
-            <w:r>
-              <w:rPr>
-                <w:b w:val="0"/>
-                <w:i w:val="0"/>
-              </w:rPr>
-              <w:t>Database</w:t>
-            </w:r>
-          </w:p>
-        </w:tc>
-        <w:tc>
-          <w:tcPr>
-            <w:tcW w:type="dxa" w:w="3120"/>
-          </w:tcPr>
-          <w:p>
-            <w:r/>
-            <w:r>
-              <w:rPr>
-                <w:b w:val="0"/>
-                <w:i w:val="0"/>
-              </w:rPr>
-              <w:t>Managed Postgres + PostGIS</w:t>
-            </w:r>
-          </w:p>
-        </w:tc>
-        <w:tc>
-          <w:tcPr>
-            <w:tcW w:type="dxa" w:w="3120"/>
-          </w:tcPr>
-          <w:p>
-            <w:r/>
-            <w:r>
-              <w:rPr>
-                <w:b w:val="0"/>
-                <w:i w:val="0"/>
-              </w:rPr>
-              <w:t>$0–25</w:t>
-            </w:r>
-          </w:p>
-        </w:tc>
-      </w:tr>
-      <w:tr>
-        <w:tc>
-          <w:tcPr>
-            <w:tcW w:type="dxa" w:w="3120"/>
-          </w:tcPr>
-          <w:p>
-            <w:r/>
-            <w:r>
-              <w:rPr>
-                <w:b w:val="0"/>
-                <w:i w:val="0"/>
-              </w:rPr>
-              <w:t>Photo storage</w:t>
-            </w:r>
-          </w:p>
-        </w:tc>
-        <w:tc>
-          <w:tcPr>
-            <w:tcW w:type="dxa" w:w="3120"/>
-          </w:tcPr>
-          <w:p>
-            <w:r/>
-            <w:r>
-              <w:rPr>
-                <w:b w:val="0"/>
-                <w:i w:val="0"/>
-              </w:rPr>
-              <w:t>Backblaze B2 / S3</w:t>
-            </w:r>
-          </w:p>
-        </w:tc>
-        <w:tc>
-          <w:tcPr>
-            <w:tcW w:type="dxa" w:w="3120"/>
-          </w:tcPr>
-          <w:p>
-            <w:r/>
-            <w:r>
-              <w:rPr>
-                <w:b w:val="0"/>
-                <w:i w:val="0"/>
-              </w:rPr>
-              <w:t>$1–5</w:t>
-            </w:r>
-          </w:p>
-        </w:tc>
-      </w:tr>
-      <w:tr>
-        <w:tc>
-          <w:tcPr>
-            <w:tcW w:type="dxa" w:w="3120"/>
-          </w:tcPr>
-          <w:p>
-            <w:r/>
-            <w:r>
-              <w:rPr>
-                <w:b w:val="0"/>
-                <w:i w:val="0"/>
-              </w:rPr>
-              <w:t>Maps / proximity</w:t>
-            </w:r>
-          </w:p>
-        </w:tc>
-        <w:tc>
-          <w:tcPr>
-            <w:tcW w:type="dxa" w:w="3120"/>
-          </w:tcPr>
-          <w:p>
-            <w:r/>
-            <w:r>
-              <w:rPr>
-                <w:b w:val="0"/>
-                <w:i w:val="0"/>
-              </w:rPr>
-              <w:t>Google Maps, cached 7d</w:t>
-            </w:r>
-          </w:p>
-        </w:tc>
-        <w:tc>
-          <w:tcPr>
-            <w:tcW w:type="dxa" w:w="3120"/>
-          </w:tcPr>
-          <w:p>
-            <w:r/>
-            <w:r>
-              <w:rPr>
-                <w:b w:val="0"/>
-                <w:i w:val="0"/>
-              </w:rPr>
-              <w:t>$0–30</w:t>
-            </w:r>
-          </w:p>
-        </w:tc>
-      </w:tr>
-      <w:tr>
-        <w:tc>
-          <w:tcPr>
-            <w:tcW w:type="dxa" w:w="3120"/>
-          </w:tcPr>
-          <w:p>
-            <w:r/>
-            <w:r>
-              <w:rPr>
-                <w:b w:val="0"/>
-                <w:i w:val="0"/>
-              </w:rPr>
-              <w:t>LLM narrative</w:t>
-            </w:r>
-          </w:p>
-        </w:tc>
-        <w:tc>
-          <w:tcPr>
-            <w:tcW w:type="dxa" w:w="3120"/>
-          </w:tcPr>
-          <w:p>
-            <w:r/>
-            <w:r>
-              <w:rPr>
-                <w:b w:val="0"/>
-                <w:i w:val="0"/>
-              </w:rPr>
-              <w:t>Cheap model, on-demand</w:t>
-            </w:r>
-          </w:p>
-        </w:tc>
-        <w:tc>
-          <w:tcPr>
-            <w:tcW w:type="dxa" w:w="3120"/>
-          </w:tcPr>
-          <w:p>
-            <w:r/>
-            <w:r>
-              <w:rPr>
-                <w:b w:val="0"/>
-                <w:i w:val="0"/>
-              </w:rPr>
-              <w:t>$1–10</w:t>
-            </w:r>
-          </w:p>
-        </w:tc>
-      </w:tr>
-      <w:tr>
-        <w:tc>
-          <w:tcPr>
-            <w:tcW w:type="dxa" w:w="3120"/>
-          </w:tcPr>
-          <w:p>
-            <w:r/>
-            <w:r>
-              <w:rPr>
-                <w:b w:val="0"/>
-                <w:i w:val="0"/>
-              </w:rPr>
-              <w:t>Skip-trace</w:t>
-            </w:r>
-          </w:p>
-        </w:tc>
-        <w:tc>
-          <w:tcPr>
-            <w:tcW w:type="dxa" w:w="3120"/>
-          </w:tcPr>
-          <w:p>
-            <w:r/>
-            <w:r>
-              <w:rPr>
-                <w:b w:val="0"/>
-                <w:i w:val="0"/>
-              </w:rPr>
-              <w:t>Per-hit, hot leads only</w:t>
-            </w:r>
-          </w:p>
-        </w:tc>
-        <w:tc>
-          <w:tcPr>
-            <w:tcW w:type="dxa" w:w="3120"/>
-          </w:tcPr>
-          <w:p>
-            <w:r/>
-            <w:r>
-              <w:rPr>
-                <w:b w:val="0"/>
-                <w:i w:val="0"/>
-              </w:rPr>
-              <w:t>pennies</w:t>
-            </w:r>
-          </w:p>
-        </w:tc>
-      </w:tr>
-      <w:tr>
-        <w:tc>
-          <w:tcPr>
-            <w:tcW w:type="dxa" w:w="3120"/>
-          </w:tcPr>
-          <w:p>
-            <w:r/>
-            <w:r>
-              <w:rPr>
-                <w:b w:val="0"/>
-                <w:i w:val="0"/>
-              </w:rPr>
-              <w:t>Telegram + email</w:t>
-            </w:r>
-          </w:p>
-        </w:tc>
-        <w:tc>
-          <w:tcPr>
-            <w:tcW w:type="dxa" w:w="3120"/>
-          </w:tcPr>
-          <w:p>
-            <w:r/>
-            <w:r>
-              <w:rPr>
-                <w:b w:val="0"/>
-                <w:i w:val="0"/>
-              </w:rPr>
-              <w:t>Free tiers</w:t>
-            </w:r>
-          </w:p>
-        </w:tc>
-        <w:tc>
-          <w:tcPr>
-            <w:tcW w:type="dxa" w:w="3120"/>
-          </w:tcPr>
-          <w:p>
-            <w:r/>
-            <w:r>
-              <w:rPr>
-                <w:b w:val="0"/>
-                <w:i w:val="0"/>
-              </w:rPr>
-              <w:t>$0</w:t>
-            </w:r>
-          </w:p>
-        </w:tc>
-      </w:tr>
-      <w:tr>
-        <w:tc>
-          <w:tcPr>
-            <w:tcW w:type="dxa" w:w="3120"/>
-          </w:tcPr>
-          <w:p>
-            <w:r/>
-            <w:r>
-              <w:rPr>
-                <w:b/>
-                <w:i w:val="0"/>
-              </w:rPr>
-              <w:t>Total</w:t>
-            </w:r>
-          </w:p>
-        </w:tc>
-        <w:tc>
-          <w:tcPr>
-            <w:tcW w:type="dxa" w:w="3120"/>
-          </w:tcPr>
-          <w:p>
-            <w:r/>
-            <w:r>
-              <w:rPr>
-                <w:b w:val="0"/>
-                <w:i w:val="0"/>
-              </w:rPr>
-              <w:t>vs. $3,835 in the enterprise draft</w:t>
-            </w:r>
-          </w:p>
-        </w:tc>
-        <w:tc>
-          <w:tcPr>
-            <w:tcW w:type="dxa" w:w="3120"/>
-          </w:tcPr>
-          <w:p>
-            <w:r/>
-            <w:r>
-              <w:rPr>
-                <w:b/>
-                <w:i w:val="0"/>
-              </w:rPr>
-              <w:t>~$0–100</w:t>
             </w:r>
           </w:p>
         </w:tc>
@@ -2179,6 +283,1893 @@
         <w:pStyle w:val="Heading2"/>
       </w:pPr>
       <w:r>
+        <w:t>1. The group model</w:t>
+      </w:r>
+    </w:p>
+    <w:p>
+      <w:r>
+        <w:rPr>
+          <w:b w:val="0"/>
+          <w:i w:val="0"/>
+        </w:rPr>
+        <w:t>One pooled strategy, one buy box, six notification endpoints. Because the investment is shared, everything per-user disappears — no individual filters, no tenancy, no fan-out logic.</w:t>
+      </w:r>
+    </w:p>
+    <w:p>
+      <w:pPr>
+        <w:pStyle w:val="ListBullet"/>
+      </w:pPr>
+      <w:r>
+        <w:rPr>
+          <w:b/>
+          <w:i w:val="0"/>
+        </w:rPr>
+        <w:t>Shared deal pipeline, not personal portfolios.</w:t>
+      </w:r>
+      <w:r>
+        <w:rPr>
+          <w:b w:val="0"/>
+          <w:i w:val="0"/>
+        </w:rPr>
+        <w:t xml:space="preserve"> The board runs </w:t>
+      </w:r>
+      <w:r>
+        <w:rPr>
+          <w:rFonts w:ascii="Consolas" w:hAnsi="Consolas"/>
+          <w:b w:val="0"/>
+          <w:i w:val="0"/>
+          <w:sz w:val="19"/>
+        </w:rPr>
+        <w:t>New → Reviewing → Site Visit → Offer → Closed / Passed</w:t>
+      </w:r>
+      <w:r>
+        <w:rPr>
+          <w:b w:val="0"/>
+          <w:i w:val="0"/>
+        </w:rPr>
+        <w:t xml:space="preserve"> with inline comments and a yes/no/maybe vote so the six of us converge on what to pursue.</w:t>
+      </w:r>
+    </w:p>
+    <w:p>
+      <w:pPr>
+        <w:pStyle w:val="ListBullet"/>
+      </w:pPr>
+      <w:r>
+        <w:rPr>
+          <w:b/>
+          <w:i w:val="0"/>
+        </w:rPr>
+        <w:t>The Telegram group is the primary surface.</w:t>
+      </w:r>
+      <w:r>
+        <w:rPr>
+          <w:b w:val="0"/>
+          <w:i w:val="0"/>
+        </w:rPr>
+        <w:t xml:space="preserve"> Deals land in the group, discussion happens inline, decisions get recorded.</w:t>
+      </w:r>
+    </w:p>
+    <w:p>
+      <w:pPr>
+        <w:pStyle w:val="ListBullet"/>
+      </w:pPr>
+      <w:r>
+        <w:rPr>
+          <w:b/>
+          <w:i w:val="0"/>
+        </w:rPr>
+        <w:t>No OAuth / RBAC / JWT.</w:t>
+      </w:r>
+      <w:r>
+        <w:rPr>
+          <w:b w:val="0"/>
+          <w:i w:val="0"/>
+        </w:rPr>
+        <w:t xml:space="preserve"> Six people = an allowlist of Telegram IDs. Real auth arrives only if the dashboard ever goes public.</w:t>
+      </w:r>
+    </w:p>
+    <w:p>
+      <w:pPr>
+        <w:spacing w:before="80" w:after="120"/>
+        <w:ind w:left="288"/>
+        <w:shd w:val="clear" w:fill="F1EFE7"/>
+      </w:pPr>
+      <w:r>
+        <w:rPr>
+          <w:b/>
+          <w:i w:val="0"/>
+        </w:rPr>
+        <w:t>Decide off-app:</w:t>
+      </w:r>
+      <w:r>
+        <w:rPr>
+          <w:b w:val="0"/>
+          <w:i w:val="0"/>
+        </w:rPr>
+        <w:t xml:space="preserve"> Pooling money among six friends implies an LLC/JV + operating agreement, and if any member is passive it can raise securities questions. That's a lawyer conversation, not an app feature — flagged so it doesn't surprise us. The app is only the shared research-and-decision record for that one entity. </w:t>
+      </w:r>
+      <w:r>
+        <w:rPr>
+          <w:b w:val="0"/>
+          <w:i/>
+        </w:rPr>
+        <w:t>(Not legal advice.)</w:t>
+      </w:r>
+    </w:p>
+    <w:p>
+      <w:pPr>
+        <w:pBdr>
+          <w:bottom w:val="single" w:sz="6" w:space="1" w:color="C9C3B4"/>
+        </w:pBdr>
+      </w:pPr>
+    </w:p>
+    <w:p>
+      <w:pPr>
+        <w:pStyle w:val="Heading2"/>
+      </w:pPr>
+      <w:r>
+        <w:t>2. Selection &amp; notification criteria</w:t>
+      </w:r>
+    </w:p>
+    <w:p>
+      <w:r>
+        <w:rPr>
+          <w:b/>
+          <w:i w:val="0"/>
+        </w:rPr>
+        <w:t>Selection and notification are two different gates.</w:t>
+      </w:r>
+      <w:r>
+        <w:rPr>
+          <w:b w:val="0"/>
+          <w:i w:val="0"/>
+        </w:rPr>
+        <w:t xml:space="preserve"> Everything that clears selection enters the pipeline quietly; only a subset crosses the notification threshold and interrupts the group. Selection runs in three layers.</w:t>
+      </w:r>
+    </w:p>
+    <w:p>
+      <w:pPr>
+        <w:pStyle w:val="Heading3"/>
+      </w:pPr>
+      <w:r>
+        <w:t>Layer 1 — Buy box (hard filter, pass/fail)</w:t>
+      </w:r>
+    </w:p>
+    <w:tbl>
+      <w:tblPr>
+        <w:tblStyle w:val="TableGrid"/>
+        <w:tblW w:type="auto" w:w="0"/>
+        <w:tblLayout w:type="autofit"/>
+        <w:tblLook w:firstColumn="1" w:firstRow="1" w:lastColumn="0" w:lastRow="0" w:noHBand="0" w:noVBand="1" w:val="04A0"/>
+      </w:tblPr>
+      <w:tblGrid>
+        <w:gridCol w:w="3120"/>
+        <w:gridCol w:w="3120"/>
+        <w:gridCol w:w="3120"/>
+      </w:tblGrid>
+      <w:tr>
+        <w:tc>
+          <w:tcPr>
+            <w:tcW w:type="dxa" w:w="3120"/>
+            <w:shd w:val="clear" w:fill="2F5D4E"/>
+          </w:tcPr>
+          <w:p>
+            <w:r/>
+            <w:r>
+              <w:rPr>
+                <w:b/>
+                <w:i w:val="0"/>
+                <w:color w:val="FFFFFF"/>
+              </w:rPr>
+              <w:t>Criterion</w:t>
+            </w:r>
+          </w:p>
+        </w:tc>
+        <w:tc>
+          <w:tcPr>
+            <w:tcW w:type="dxa" w:w="3120"/>
+            <w:shd w:val="clear" w:fill="2F5D4E"/>
+          </w:tcPr>
+          <w:p>
+            <w:r/>
+            <w:r>
+              <w:rPr>
+                <w:b/>
+                <w:i w:val="0"/>
+                <w:color w:val="FFFFFF"/>
+              </w:rPr>
+              <w:t>Threshold</w:t>
+            </w:r>
+          </w:p>
+        </w:tc>
+        <w:tc>
+          <w:tcPr>
+            <w:tcW w:type="dxa" w:w="3120"/>
+            <w:shd w:val="clear" w:fill="2F5D4E"/>
+          </w:tcPr>
+          <w:p>
+            <w:r/>
+            <w:r>
+              <w:rPr>
+                <w:b/>
+                <w:i w:val="0"/>
+                <w:color w:val="FFFFFF"/>
+              </w:rPr>
+              <w:t>Note</w:t>
+            </w:r>
+          </w:p>
+        </w:tc>
+      </w:tr>
+      <w:tr>
+        <w:tc>
+          <w:tcPr>
+            <w:tcW w:type="dxa" w:w="3120"/>
+          </w:tcPr>
+          <w:p>
+            <w:r/>
+            <w:r>
+              <w:rPr>
+                <w:b w:val="0"/>
+                <w:i w:val="0"/>
+              </w:rPr>
+              <w:t>Geography</w:t>
+            </w:r>
+          </w:p>
+        </w:tc>
+        <w:tc>
+          <w:tcPr>
+            <w:tcW w:type="dxa" w:w="3120"/>
+          </w:tcPr>
+          <w:p>
+            <w:r/>
+            <w:r>
+              <w:rPr>
+                <w:b w:val="0"/>
+                <w:i w:val="0"/>
+              </w:rPr>
+              <w:t>DFW + ring counties</w:t>
+            </w:r>
+          </w:p>
+        </w:tc>
+        <w:tc>
+          <w:tcPr>
+            <w:tcW w:type="dxa" w:w="3120"/>
+          </w:tcPr>
+          <w:p>
+            <w:r/>
+            <w:r>
+              <w:rPr>
+                <w:b w:val="0"/>
+                <w:i w:val="0"/>
+              </w:rPr>
+              <w:t>Dallas, Tarrant, Collin, Denton, Ellis, Johnson, Kaufman, Parker, Rockwall, Wise</w:t>
+            </w:r>
+          </w:p>
+        </w:tc>
+      </w:tr>
+      <w:tr>
+        <w:tc>
+          <w:tcPr>
+            <w:tcW w:type="dxa" w:w="3120"/>
+          </w:tcPr>
+          <w:p>
+            <w:r/>
+            <w:r>
+              <w:rPr>
+                <w:b w:val="0"/>
+                <w:i w:val="0"/>
+              </w:rPr>
+              <w:t>Land parcel</w:t>
+            </w:r>
+          </w:p>
+        </w:tc>
+        <w:tc>
+          <w:tcPr>
+            <w:tcW w:type="dxa" w:w="3120"/>
+          </w:tcPr>
+          <w:p>
+            <w:r/>
+            <w:r>
+              <w:rPr>
+                <w:b w:val="0"/>
+                <w:i w:val="0"/>
+              </w:rPr>
+              <w:t>≥ 5 acres</w:t>
+            </w:r>
+          </w:p>
+        </w:tc>
+        <w:tc>
+          <w:tcPr>
+            <w:tcW w:type="dxa" w:w="3120"/>
+          </w:tcPr>
+          <w:p>
+            <w:r/>
+            <w:r>
+              <w:rPr>
+                <w:b w:val="0"/>
+                <w:i w:val="0"/>
+              </w:rPr>
+              <w:t>Overall parcel size (min)</w:t>
+            </w:r>
+          </w:p>
+        </w:tc>
+      </w:tr>
+      <w:tr>
+        <w:tc>
+          <w:tcPr>
+            <w:tcW w:type="dxa" w:w="3120"/>
+          </w:tcPr>
+          <w:p>
+            <w:r/>
+            <w:r>
+              <w:rPr>
+                <w:b w:val="0"/>
+                <w:i w:val="0"/>
+              </w:rPr>
+              <w:t>Existing structure</w:t>
+            </w:r>
+          </w:p>
+        </w:tc>
+        <w:tc>
+          <w:tcPr>
+            <w:tcW w:type="dxa" w:w="3120"/>
+          </w:tcPr>
+          <w:p>
+            <w:r/>
+            <w:r>
+              <w:rPr>
+                <w:b w:val="0"/>
+                <w:i w:val="0"/>
+              </w:rPr>
+              <w:t>≥ 15,000 SF</w:t>
+            </w:r>
+          </w:p>
+        </w:tc>
+        <w:tc>
+          <w:tcPr>
+            <w:tcW w:type="dxa" w:w="3120"/>
+          </w:tcPr>
+          <w:p>
+            <w:r/>
+            <w:r>
+              <w:rPr>
+                <w:b w:val="0"/>
+                <w:i w:val="0"/>
+              </w:rPr>
+              <w:t>Must support 300+ guests</w:t>
+            </w:r>
+          </w:p>
+        </w:tc>
+      </w:tr>
+      <w:tr>
+        <w:tc>
+          <w:tcPr>
+            <w:tcW w:type="dxa" w:w="3120"/>
+          </w:tcPr>
+          <w:p>
+            <w:r/>
+            <w:r>
+              <w:rPr>
+                <w:b w:val="0"/>
+                <w:i w:val="0"/>
+              </w:rPr>
+              <w:t>Purchase price</w:t>
+            </w:r>
+          </w:p>
+        </w:tc>
+        <w:tc>
+          <w:tcPr>
+            <w:tcW w:type="dxa" w:w="3120"/>
+          </w:tcPr>
+          <w:p>
+            <w:r/>
+            <w:r>
+              <w:rPr>
+                <w:b w:val="0"/>
+                <w:i w:val="0"/>
+              </w:rPr>
+              <w:t>≤ $4M</w:t>
+            </w:r>
+          </w:p>
+        </w:tc>
+        <w:tc>
+          <w:tcPr>
+            <w:tcW w:type="dxa" w:w="3120"/>
+          </w:tcPr>
+          <w:p>
+            <w:r/>
+            <w:r>
+              <w:rPr>
+                <w:b w:val="0"/>
+                <w:i w:val="0"/>
+              </w:rPr>
+              <w:t>Modeled at negotiated price, not list</w:t>
+            </w:r>
+          </w:p>
+        </w:tc>
+      </w:tr>
+      <w:tr>
+        <w:tc>
+          <w:tcPr>
+            <w:tcW w:type="dxa" w:w="3120"/>
+          </w:tcPr>
+          <w:p>
+            <w:r/>
+            <w:r>
+              <w:rPr>
+                <w:b/>
+                <w:i w:val="0"/>
+              </w:rPr>
+              <w:t>Total all-in</w:t>
+            </w:r>
+          </w:p>
+        </w:tc>
+        <w:tc>
+          <w:tcPr>
+            <w:tcW w:type="dxa" w:w="3120"/>
+          </w:tcPr>
+          <w:p>
+            <w:r/>
+            <w:r>
+              <w:rPr>
+                <w:b/>
+                <w:i w:val="0"/>
+              </w:rPr>
+              <w:t>≤ $5M</w:t>
+            </w:r>
+          </w:p>
+        </w:tc>
+        <w:tc>
+          <w:tcPr>
+            <w:tcW w:type="dxa" w:w="3120"/>
+          </w:tcPr>
+          <w:p>
+            <w:r/>
+            <w:r>
+              <w:rPr>
+                <w:b/>
+                <w:i w:val="0"/>
+              </w:rPr>
+              <w:t>Binding constraint</w:t>
+            </w:r>
+            <w:r>
+              <w:rPr>
+                <w:b w:val="0"/>
+                <w:i w:val="0"/>
+              </w:rPr>
+              <w:t xml:space="preserve"> — purchase + conversion + working capital to break-even</w:t>
+            </w:r>
+          </w:p>
+        </w:tc>
+      </w:tr>
+      <w:tr>
+        <w:tc>
+          <w:tcPr>
+            <w:tcW w:type="dxa" w:w="3120"/>
+          </w:tcPr>
+          <w:p>
+            <w:r/>
+            <w:r>
+              <w:rPr>
+                <w:b w:val="0"/>
+                <w:i w:val="0"/>
+              </w:rPr>
+              <w:t>Property type</w:t>
+            </w:r>
+          </w:p>
+        </w:tc>
+        <w:tc>
+          <w:tcPr>
+            <w:tcW w:type="dxa" w:w="3120"/>
+          </w:tcPr>
+          <w:p>
+            <w:r/>
+            <w:r>
+              <w:rPr>
+                <w:b w:val="0"/>
+                <w:i w:val="0"/>
+              </w:rPr>
+              <w:t>Barn / church / commercial</w:t>
+            </w:r>
+          </w:p>
+        </w:tc>
+        <w:tc>
+          <w:tcPr>
+            <w:tcW w:type="dxa" w:w="3120"/>
+          </w:tcPr>
+          <w:p>
+            <w:r/>
+            <w:r>
+              <w:rPr>
+                <w:b w:val="0"/>
+                <w:i w:val="0"/>
+              </w:rPr>
+              <w:t>Existing building to retrofit — no raw land, no ground-up</w:t>
+            </w:r>
+          </w:p>
+        </w:tc>
+      </w:tr>
+      <w:tr>
+        <w:tc>
+          <w:tcPr>
+            <w:tcW w:type="dxa" w:w="3120"/>
+          </w:tcPr>
+          <w:p>
+            <w:r/>
+            <w:r>
+              <w:rPr>
+                <w:b w:val="0"/>
+                <w:i w:val="0"/>
+              </w:rPr>
+              <w:t>Capacity</w:t>
+            </w:r>
+          </w:p>
+        </w:tc>
+        <w:tc>
+          <w:tcPr>
+            <w:tcW w:type="dxa" w:w="3120"/>
+          </w:tcPr>
+          <w:p>
+            <w:r/>
+            <w:r>
+              <w:rPr>
+                <w:b w:val="0"/>
+                <w:i w:val="0"/>
+              </w:rPr>
+              <w:t>300+ guests</w:t>
+            </w:r>
+          </w:p>
+        </w:tc>
+        <w:tc>
+          <w:tcPr>
+            <w:tcW w:type="dxa" w:w="3120"/>
+          </w:tcPr>
+          <w:p>
+            <w:r/>
+            <w:r>
+              <w:rPr>
+                <w:b w:val="0"/>
+                <w:i w:val="0"/>
+              </w:rPr>
+              <w:t>Parking (~100 spaces), ADA restrooms, HVAC, egress</w:t>
+            </w:r>
+          </w:p>
+        </w:tc>
+      </w:tr>
+      <w:tr>
+        <w:tc>
+          <w:tcPr>
+            <w:tcW w:type="dxa" w:w="3120"/>
+          </w:tcPr>
+          <w:p>
+            <w:r/>
+            <w:r>
+              <w:rPr>
+                <w:b w:val="0"/>
+                <w:i w:val="0"/>
+              </w:rPr>
+              <w:t>Go-live</w:t>
+            </w:r>
+          </w:p>
+        </w:tc>
+        <w:tc>
+          <w:tcPr>
+            <w:tcW w:type="dxa" w:w="3120"/>
+          </w:tcPr>
+          <w:p>
+            <w:r/>
+            <w:r>
+              <w:rPr>
+                <w:b w:val="0"/>
+                <w:i w:val="0"/>
+              </w:rPr>
+              <w:t>≤ 6 months</w:t>
+            </w:r>
+          </w:p>
+        </w:tc>
+        <w:tc>
+          <w:tcPr>
+            <w:tcW w:type="dxa" w:w="3120"/>
+          </w:tcPr>
+          <w:p>
+            <w:r/>
+            <w:r>
+              <w:rPr>
+                <w:b w:val="0"/>
+                <w:i w:val="0"/>
+              </w:rPr>
+              <w:t>Favors assembly-zoned, structurally sound, utility-served</w:t>
+            </w:r>
+          </w:p>
+        </w:tc>
+      </w:tr>
+      <w:tr>
+        <w:tc>
+          <w:tcPr>
+            <w:tcW w:type="dxa" w:w="3120"/>
+          </w:tcPr>
+          <w:p>
+            <w:r/>
+            <w:r>
+              <w:rPr>
+                <w:b w:val="0"/>
+                <w:i w:val="0"/>
+              </w:rPr>
+              <w:t>Hard exclusions</w:t>
+            </w:r>
+          </w:p>
+        </w:tc>
+        <w:tc>
+          <w:tcPr>
+            <w:tcW w:type="dxa" w:w="3120"/>
+          </w:tcPr>
+          <w:p>
+            <w:r/>
+            <w:r>
+              <w:rPr>
+                <w:b w:val="0"/>
+                <w:i w:val="0"/>
+              </w:rPr>
+              <w:t>—</w:t>
+            </w:r>
+          </w:p>
+        </w:tc>
+        <w:tc>
+          <w:tcPr>
+            <w:tcW w:type="dxa" w:w="3120"/>
+          </w:tcPr>
+          <w:p>
+            <w:r/>
+            <w:r>
+              <w:rPr>
+                <w:b w:val="0"/>
+                <w:i w:val="0"/>
+              </w:rPr>
+              <w:t>Flood AE/AO · Superfund ≤ 1 mi · condemnation · saturated sub-market (Layer 3)</w:t>
+            </w:r>
+          </w:p>
+        </w:tc>
+      </w:tr>
+    </w:tbl>
+    <w:p>
+      <w:pPr>
+        <w:spacing w:after="40"/>
+      </w:pPr>
+    </w:p>
+    <w:p>
+      <w:pPr>
+        <w:spacing w:before="80" w:after="120"/>
+        <w:ind w:left="288"/>
+        <w:shd w:val="clear" w:fill="F1EFE7"/>
+      </w:pPr>
+      <w:r>
+        <w:rPr>
+          <w:b/>
+          <w:i w:val="0"/>
+        </w:rPr>
+        <w:t>The coupled budget drives most decisions.</w:t>
+      </w:r>
+      <w:r>
+        <w:rPr>
+          <w:b w:val="0"/>
+          <w:i w:val="0"/>
+        </w:rPr>
+        <w:t xml:space="preserve"> $4M purchase </w:t>
+      </w:r>
+      <w:r>
+        <w:rPr>
+          <w:b w:val="0"/>
+          <w:i/>
+        </w:rPr>
+        <w:t>and</w:t>
+      </w:r>
+      <w:r>
+        <w:rPr>
+          <w:b w:val="0"/>
+          <w:i w:val="0"/>
+        </w:rPr>
+        <w:t xml:space="preserve"> $5M all-in means </w:t>
+      </w:r>
+      <w:r>
+        <w:rPr>
+          <w:b/>
+          <w:i w:val="0"/>
+        </w:rPr>
+        <w:t>conversion + working capital ≤ ($5M − negotiated price)</w:t>
+      </w:r>
+      <w:r>
+        <w:rPr>
+          <w:b w:val="0"/>
+          <w:i w:val="0"/>
+        </w:rPr>
+        <w:t xml:space="preserve">. At a $4M buy that leaves only ~$1M for a 300-guest retrofit + ramp — rarely enough, so the $5M cap will reject most top-of-budget purchases. The sweet spot is a </w:t>
+      </w:r>
+      <w:r>
+        <w:rPr>
+          <w:b/>
+          <w:i w:val="0"/>
+        </w:rPr>
+        <w:t>~$2–3M purchase</w:t>
+      </w:r>
+      <w:r>
+        <w:rPr>
+          <w:b w:val="0"/>
+          <w:i w:val="0"/>
+        </w:rPr>
+        <w:t xml:space="preserve"> leaving $2–3M for conversion + working capital. RealtyDog shows this headroom on every deal card.</w:t>
+      </w:r>
+    </w:p>
+    <w:p>
+      <w:pPr>
+        <w:pStyle w:val="Heading3"/>
+      </w:pPr>
+      <w:r>
+        <w:t>Layer 2 — Motivation score (off-market ranker)</w:t>
+      </w:r>
+    </w:p>
+    <w:p>
+      <w:r>
+        <w:rPr>
+          <w:b w:val="0"/>
+          <w:i w:val="0"/>
+        </w:rPr>
+        <w:t xml:space="preserve">Ranks which qualifying owners to pursue first, now headlined by the </w:t>
+      </w:r>
+      <w:r>
+        <w:rPr>
+          <w:b/>
+          <w:i w:val="0"/>
+        </w:rPr>
+        <w:t>distressed non-profit</w:t>
+      </w:r>
+      <w:r>
+        <w:rPr>
+          <w:b w:val="0"/>
+          <w:i w:val="0"/>
+        </w:rPr>
+        <w:t xml:space="preserve"> signal (full rubric in Section 8). Bucketed </w:t>
+      </w:r>
+      <w:r>
+        <w:rPr>
+          <w:b/>
+          <w:i w:val="0"/>
+        </w:rPr>
+        <w:t>HOT ≥ 60 · WARM 30–59 · COLD &lt; 30</w:t>
+      </w:r>
+      <w:r>
+        <w:rPr>
+          <w:b w:val="0"/>
+          <w:i w:val="0"/>
+        </w:rPr>
+        <w:t>.</w:t>
+      </w:r>
+    </w:p>
+    <w:p>
+      <w:pPr>
+        <w:pStyle w:val="Heading3"/>
+      </w:pPr>
+      <w:r>
+        <w:t>Layer 3 — Financial &amp; market qualification (hard gate, post-enrichment)</w:t>
+      </w:r>
+    </w:p>
+    <w:p>
+      <w:r>
+        <w:rPr>
+          <w:b w:val="0"/>
+          <w:i w:val="0"/>
+        </w:rPr>
+        <w:t xml:space="preserve">The pro-forma is part of selection, not just analysis. A property must clear </w:t>
+      </w:r>
+      <w:r>
+        <w:rPr>
+          <w:b w:val="0"/>
+          <w:i/>
+        </w:rPr>
+        <w:t>all</w:t>
+      </w:r>
+      <w:r>
+        <w:rPr>
+          <w:b w:val="0"/>
+          <w:i w:val="0"/>
+        </w:rPr>
+        <w:t xml:space="preserve"> of:</w:t>
+      </w:r>
+    </w:p>
+    <w:p>
+      <w:pPr>
+        <w:pStyle w:val="ListBullet"/>
+      </w:pPr>
+      <w:r>
+        <w:rPr>
+          <w:b/>
+          <w:i w:val="0"/>
+        </w:rPr>
+        <w:t>Return gate:</w:t>
+      </w:r>
+      <w:r>
+        <w:rPr>
+          <w:b w:val="0"/>
+          <w:i w:val="0"/>
+        </w:rPr>
+        <w:t xml:space="preserve"> at standard assumptions, </w:t>
+      </w:r>
+      <w:r>
+        <w:rPr>
+          <w:b/>
+          <w:i w:val="0"/>
+        </w:rPr>
+        <w:t>Year-2 break-even AND Year-3 EBITDA ≥ 10%</w:t>
+      </w:r>
+      <w:r>
+        <w:rPr>
+          <w:b w:val="0"/>
+          <w:i w:val="0"/>
+        </w:rPr>
+        <w:t>, within the $5M all-in. Can't model to it → rejected.</w:t>
+      </w:r>
+    </w:p>
+    <w:p>
+      <w:pPr>
+        <w:pStyle w:val="ListBullet"/>
+      </w:pPr>
+      <w:r>
+        <w:rPr>
+          <w:b/>
+          <w:i w:val="0"/>
+        </w:rPr>
+        <w:t>Negotiated price:</w:t>
+      </w:r>
+      <w:r>
+        <w:rPr>
+          <w:b w:val="0"/>
+          <w:i w:val="0"/>
+        </w:rPr>
+        <w:t xml:space="preserve"> the buy is priced at an expected market-condition discount to list/assessed, not list. Pre-filter screens list/assessed ≤ ~$4.5–5M, then the hard test runs on the modeled negotiated number.</w:t>
+      </w:r>
+    </w:p>
+    <w:p>
+      <w:pPr>
+        <w:pStyle w:val="ListBullet"/>
+      </w:pPr>
+      <w:r>
+        <w:rPr>
+          <w:b/>
+          <w:i w:val="0"/>
+        </w:rPr>
+        <w:t>Capacity to 300+:</w:t>
+      </w:r>
+      <w:r>
+        <w:rPr>
+          <w:b w:val="0"/>
+          <w:i w:val="0"/>
+        </w:rPr>
+        <w:t xml:space="preserve"> any retrofit cost to reach parking / restroom / HVAC / egress for 300 counts against the $5M.</w:t>
+      </w:r>
+    </w:p>
+    <w:p>
+      <w:pPr>
+        <w:pStyle w:val="ListBullet"/>
+      </w:pPr>
+      <w:r>
+        <w:rPr>
+          <w:b/>
+          <w:i w:val="0"/>
+        </w:rPr>
+        <w:t>Competitor demand:</w:t>
+      </w:r>
+      <w:r>
+        <w:rPr>
+          <w:b w:val="0"/>
+          <w:i w:val="0"/>
+        </w:rPr>
+        <w:t xml:space="preserve"> </w:t>
+      </w:r>
+      <w:r>
+        <w:rPr>
+          <w:b/>
+          <w:i w:val="0"/>
+        </w:rPr>
+        <w:t>reject</w:t>
+      </w:r>
+      <w:r>
+        <w:rPr>
+          <w:b w:val="0"/>
+          <w:i w:val="0"/>
+        </w:rPr>
+        <w:t xml:space="preserve"> a sub-market where nearby venues run </w:t>
+      </w:r>
+      <w:r>
+        <w:rPr>
+          <w:b/>
+          <w:i w:val="0"/>
+        </w:rPr>
+        <w:t>&lt; 40% utilization</w:t>
+      </w:r>
+      <w:r>
+        <w:rPr>
+          <w:b w:val="0"/>
+          <w:i w:val="0"/>
+        </w:rPr>
+        <w:t xml:space="preserve"> (estimated from review cadence + booking-calendar availability).</w:t>
+      </w:r>
+    </w:p>
+    <w:p>
+      <w:pPr>
+        <w:pStyle w:val="ListBullet"/>
+      </w:pPr>
+      <w:r>
+        <w:rPr>
+          <w:b/>
+          <w:i w:val="0"/>
+        </w:rPr>
+        <w:t>Retrofit feasibility ≤ 6 months:</w:t>
+      </w:r>
+      <w:r>
+        <w:rPr>
+          <w:b w:val="0"/>
+          <w:i w:val="0"/>
+        </w:rPr>
+        <w:t xml:space="preserve"> rezoning-required → excluded; CUP-required → amber timeline-risk flag.</w:t>
+      </w:r>
+    </w:p>
+    <w:p>
+      <w:pPr>
+        <w:spacing w:before="80" w:after="120"/>
+        <w:ind w:left="288"/>
+        <w:shd w:val="clear" w:fill="F1EFE7"/>
+      </w:pPr>
+      <w:r>
+        <w:rPr>
+          <w:b/>
+          <w:i w:val="0"/>
+        </w:rPr>
+        <w:t>Two honest flags.</w:t>
+      </w:r>
+      <w:r>
+        <w:rPr>
+          <w:b w:val="0"/>
+          <w:i w:val="0"/>
+        </w:rPr>
+        <w:t xml:space="preserve"> </w:t>
+      </w:r>
+      <w:r>
+        <w:rPr>
+          <w:b w:val="0"/>
+          <w:i/>
+        </w:rPr>
+        <w:t>6-month go-live is aggressive</w:t>
+      </w:r>
+      <w:r>
+        <w:rPr>
+          <w:b w:val="0"/>
+          <w:i w:val="0"/>
+        </w:rPr>
+        <w:t xml:space="preserve"> for 300+ capacity — a CUP alone is 60–120 days, so this works as a selection </w:t>
+      </w:r>
+      <w:r>
+        <w:rPr>
+          <w:b w:val="0"/>
+          <w:i/>
+        </w:rPr>
+        <w:t>preference</w:t>
+      </w:r>
+      <w:r>
+        <w:rPr>
+          <w:b w:val="0"/>
+          <w:i w:val="0"/>
+        </w:rPr>
+        <w:t xml:space="preserve"> (favor already-assembly-zoned, utility-served buildings), not a promise. </w:t>
+      </w:r>
+      <w:r>
+        <w:rPr>
+          <w:b w:val="0"/>
+          <w:i/>
+        </w:rPr>
+        <w:t>Competitor utilization is an estimate</w:t>
+      </w:r>
+      <w:r>
+        <w:rPr>
+          <w:b w:val="0"/>
+          <w:i w:val="0"/>
+        </w:rPr>
+        <w:t>, not published data — treat &lt; 40% as an amber "verify" flag, sanity-checked against a few known venues before it hard-rejects a sub-market.</w:t>
+      </w:r>
+    </w:p>
+    <w:p>
+      <w:pPr>
+        <w:pStyle w:val="Heading3"/>
+      </w:pPr>
+      <w:r>
+        <w:t>Notification tiers</w:t>
+      </w:r>
+    </w:p>
+    <w:tbl>
+      <w:tblPr>
+        <w:tblStyle w:val="TableGrid"/>
+        <w:tblW w:type="auto" w:w="0"/>
+        <w:tblLayout w:type="autofit"/>
+        <w:tblLook w:firstColumn="1" w:firstRow="1" w:lastColumn="0" w:lastRow="0" w:noHBand="0" w:noVBand="1" w:val="04A0"/>
+      </w:tblPr>
+      <w:tblGrid>
+        <w:gridCol w:w="3120"/>
+        <w:gridCol w:w="3120"/>
+        <w:gridCol w:w="3120"/>
+      </w:tblGrid>
+      <w:tr>
+        <w:tc>
+          <w:tcPr>
+            <w:tcW w:type="dxa" w:w="3120"/>
+            <w:shd w:val="clear" w:fill="2F5D4E"/>
+          </w:tcPr>
+          <w:p>
+            <w:r/>
+            <w:r>
+              <w:rPr>
+                <w:b/>
+                <w:i w:val="0"/>
+                <w:color w:val="FFFFFF"/>
+              </w:rPr>
+              <w:t>Tier</w:t>
+            </w:r>
+          </w:p>
+        </w:tc>
+        <w:tc>
+          <w:tcPr>
+            <w:tcW w:type="dxa" w:w="3120"/>
+            <w:shd w:val="clear" w:fill="2F5D4E"/>
+          </w:tcPr>
+          <w:p>
+            <w:r/>
+            <w:r>
+              <w:rPr>
+                <w:b/>
+                <w:i w:val="0"/>
+                <w:color w:val="FFFFFF"/>
+              </w:rPr>
+              <w:t>Trigger</w:t>
+            </w:r>
+          </w:p>
+        </w:tc>
+        <w:tc>
+          <w:tcPr>
+            <w:tcW w:type="dxa" w:w="3120"/>
+            <w:shd w:val="clear" w:fill="2F5D4E"/>
+          </w:tcPr>
+          <w:p>
+            <w:r/>
+            <w:r>
+              <w:rPr>
+                <w:b/>
+                <w:i w:val="0"/>
+                <w:color w:val="FFFFFF"/>
+              </w:rPr>
+              <w:t>Channel</w:t>
+            </w:r>
+          </w:p>
+        </w:tc>
+      </w:tr>
+      <w:tr>
+        <w:tc>
+          <w:tcPr>
+            <w:tcW w:type="dxa" w:w="3120"/>
+          </w:tcPr>
+          <w:p>
+            <w:r/>
+            <w:r>
+              <w:rPr>
+                <w:b/>
+                <w:i w:val="0"/>
+              </w:rPr>
+              <w:t>Instant</w:t>
+            </w:r>
+          </w:p>
+        </w:tc>
+        <w:tc>
+          <w:tcPr>
+            <w:tcW w:type="dxa" w:w="3120"/>
+          </w:tcPr>
+          <w:p>
+            <w:r/>
+            <w:r>
+              <w:rPr>
+                <w:b w:val="0"/>
+                <w:i w:val="0"/>
+              </w:rPr>
+              <w:t>New buy-box parcel that's Hot (≥ 60), or a new on-market buy-box listing that clears the Layer-3 return gate</w:t>
+            </w:r>
+          </w:p>
+        </w:tc>
+        <w:tc>
+          <w:tcPr>
+            <w:tcW w:type="dxa" w:w="3120"/>
+          </w:tcPr>
+          <w:p>
+            <w:r/>
+            <w:r>
+              <w:rPr>
+                <w:b w:val="0"/>
+                <w:i w:val="0"/>
+              </w:rPr>
+              <w:t>Telegram group, next scan</w:t>
+            </w:r>
+          </w:p>
+        </w:tc>
+      </w:tr>
+      <w:tr>
+        <w:tc>
+          <w:tcPr>
+            <w:tcW w:type="dxa" w:w="3120"/>
+          </w:tcPr>
+          <w:p>
+            <w:r/>
+            <w:r>
+              <w:rPr>
+                <w:b/>
+                <w:i w:val="0"/>
+              </w:rPr>
+              <w:t>Nightly digest</w:t>
+            </w:r>
+          </w:p>
+        </w:tc>
+        <w:tc>
+          <w:tcPr>
+            <w:tcW w:type="dxa" w:w="3120"/>
+          </w:tcPr>
+          <w:p>
+            <w:r/>
+            <w:r>
+              <w:rPr>
+                <w:b w:val="0"/>
+                <w:i w:val="0"/>
+              </w:rPr>
+              <w:t>New Warm prospects + everything new that passed the buy box</w:t>
+            </w:r>
+          </w:p>
+        </w:tc>
+        <w:tc>
+          <w:tcPr>
+            <w:tcW w:type="dxa" w:w="3120"/>
+          </w:tcPr>
+          <w:p>
+            <w:r/>
+            <w:r>
+              <w:rPr>
+                <w:b w:val="0"/>
+                <w:i w:val="0"/>
+              </w:rPr>
+              <w:t>Telegram + email, 8 AM</w:t>
+            </w:r>
+          </w:p>
+        </w:tc>
+      </w:tr>
+      <w:tr>
+        <w:tc>
+          <w:tcPr>
+            <w:tcW w:type="dxa" w:w="3120"/>
+          </w:tcPr>
+          <w:p>
+            <w:r/>
+            <w:r>
+              <w:rPr>
+                <w:b/>
+                <w:i w:val="0"/>
+              </w:rPr>
+              <w:t>On-demand</w:t>
+            </w:r>
+          </w:p>
+        </w:tc>
+        <w:tc>
+          <w:tcPr>
+            <w:tcW w:type="dxa" w:w="3120"/>
+          </w:tcPr>
+          <w:p>
+            <w:r/>
+            <w:r>
+              <w:rPr>
+                <w:rFonts w:ascii="Consolas" w:hAnsi="Consolas"/>
+                <w:b w:val="0"/>
+                <w:i w:val="0"/>
+                <w:sz w:val="19"/>
+              </w:rPr>
+              <w:t>/analyze</w:t>
+            </w:r>
+            <w:r>
+              <w:rPr>
+                <w:b w:val="0"/>
+                <w:i w:val="0"/>
+              </w:rPr>
+              <w:t xml:space="preserve">, </w:t>
+            </w:r>
+            <w:r>
+              <w:rPr>
+                <w:rFonts w:ascii="Consolas" w:hAnsi="Consolas"/>
+                <w:b w:val="0"/>
+                <w:i w:val="0"/>
+                <w:sz w:val="19"/>
+              </w:rPr>
+              <w:t>/tip</w:t>
+            </w:r>
+            <w:r>
+              <w:rPr>
+                <w:b w:val="0"/>
+                <w:i w:val="0"/>
+              </w:rPr>
+              <w:t xml:space="preserve">, </w:t>
+            </w:r>
+            <w:r>
+              <w:rPr>
+                <w:rFonts w:ascii="Consolas" w:hAnsi="Consolas"/>
+                <w:b w:val="0"/>
+                <w:i w:val="0"/>
+                <w:sz w:val="19"/>
+              </w:rPr>
+              <w:t>/prospects</w:t>
+            </w:r>
+          </w:p>
+        </w:tc>
+        <w:tc>
+          <w:tcPr>
+            <w:tcW w:type="dxa" w:w="3120"/>
+          </w:tcPr>
+          <w:p>
+            <w:r/>
+            <w:r>
+              <w:rPr>
+                <w:b w:val="0"/>
+                <w:i w:val="0"/>
+              </w:rPr>
+              <w:t>Whoever asked</w:t>
+            </w:r>
+          </w:p>
+        </w:tc>
+      </w:tr>
+    </w:tbl>
+    <w:p>
+      <w:pPr>
+        <w:spacing w:after="40"/>
+      </w:pPr>
+    </w:p>
+    <w:p>
+      <w:r>
+        <w:rPr>
+          <w:b/>
+          <w:i w:val="0"/>
+        </w:rPr>
+        <w:t>Cold (&lt; 30) is selected but never notified</w:t>
+      </w:r>
+      <w:r>
+        <w:rPr>
+          <w:b w:val="0"/>
+          <w:i w:val="0"/>
+        </w:rPr>
+        <w:t xml:space="preserve"> — it lives in the universe and surfaces only via </w:t>
+      </w:r>
+      <w:r>
+        <w:rPr>
+          <w:rFonts w:ascii="Consolas" w:hAnsi="Consolas"/>
+          <w:b w:val="0"/>
+          <w:i w:val="0"/>
+          <w:sz w:val="19"/>
+        </w:rPr>
+        <w:t>/prospects</w:t>
+      </w:r>
+      <w:r>
+        <w:rPr>
+          <w:b w:val="0"/>
+          <w:i w:val="0"/>
+        </w:rPr>
+        <w:t>. A dedup ledger (parcel + signal) prevents notifying the same property twice for the same trigger. All thresholds are per-group config.</w:t>
+      </w:r>
+    </w:p>
+    <w:p>
+      <w:pPr>
+        <w:pBdr>
+          <w:bottom w:val="single" w:sz="6" w:space="1" w:color="C9C3B4"/>
+        </w:pBdr>
+      </w:pPr>
+    </w:p>
+    <w:p>
+      <w:pPr>
+        <w:pStyle w:val="Heading2"/>
+      </w:pPr>
+      <w:r>
+        <w:t>3. Architecture — the whole thing</w:t>
+      </w:r>
+    </w:p>
+    <w:p>
+      <w:pPr>
+        <w:pStyle w:val="ListBullet"/>
+      </w:pPr>
+      <w:r>
+        <w:rPr>
+          <w:b/>
+          <w:i w:val="0"/>
+        </w:rPr>
+        <w:t>One service.</w:t>
+      </w:r>
+      <w:r>
+        <w:rPr>
+          <w:b w:val="0"/>
+          <w:i w:val="0"/>
+        </w:rPr>
+        <w:t xml:space="preserve"> FastAPI + APScheduler in a single process. Scheduler jobs: ingest → filter → enrich → score → digest.</w:t>
+      </w:r>
+    </w:p>
+    <w:p>
+      <w:pPr>
+        <w:pStyle w:val="ListBullet"/>
+      </w:pPr>
+      <w:r>
+        <w:rPr>
+          <w:b/>
+          <w:i w:val="0"/>
+        </w:rPr>
+        <w:t>One database.</w:t>
+      </w:r>
+      <w:r>
+        <w:rPr>
+          <w:b w:val="0"/>
+          <w:i w:val="0"/>
+        </w:rPr>
+        <w:t xml:space="preserve"> Postgres with PostGIS (geo), JSONB (raw payloads), </w:t>
+      </w:r>
+      <w:r>
+        <w:rPr>
+          <w:rFonts w:ascii="Consolas" w:hAnsi="Consolas"/>
+          <w:b w:val="0"/>
+          <w:i w:val="0"/>
+          <w:sz w:val="19"/>
+        </w:rPr>
+        <w:t>pg_trgm</w:t>
+      </w:r>
+      <w:r>
+        <w:rPr>
+          <w:b w:val="0"/>
+          <w:i w:val="0"/>
+        </w:rPr>
+        <w:t xml:space="preserve"> (fuzzy dedup + search). This alone replaces PostgreSQL + MongoDB + Elasticsearch + Pinecone + Snowflake from the original.</w:t>
+      </w:r>
+    </w:p>
+    <w:p>
+      <w:pPr>
+        <w:pStyle w:val="ListBullet"/>
+      </w:pPr>
+      <w:r>
+        <w:rPr>
+          <w:b/>
+          <w:i w:val="0"/>
+        </w:rPr>
+        <w:t>S3 / Backblaze B2</w:t>
+      </w:r>
+      <w:r>
+        <w:rPr>
+          <w:b w:val="0"/>
+          <w:i w:val="0"/>
+        </w:rPr>
+        <w:t xml:space="preserve"> for property photos — the only thing Postgres shouldn't hold.</w:t>
+      </w:r>
+    </w:p>
+    <w:p>
+      <w:pPr>
+        <w:pStyle w:val="ListBullet"/>
+      </w:pPr>
+      <w:r>
+        <w:rPr>
+          <w:b/>
+          <w:i w:val="0"/>
+        </w:rPr>
+        <w:t>Telegram-first.</w:t>
+      </w:r>
+      <w:r>
+        <w:rPr>
+          <w:b w:val="0"/>
+          <w:i w:val="0"/>
+        </w:rPr>
+        <w:t xml:space="preserve"> Free, rich cards, inline buttons, group-native. No Twilio/SMS — it's the one paid, rate-limited, verification-heavy channel and the group doesn't need it. Free-tier email for the daily digest.</w:t>
+      </w:r>
+    </w:p>
+    <w:p>
+      <w:pPr>
+        <w:pStyle w:val="ListBullet"/>
+      </w:pPr>
+      <w:r>
+        <w:rPr>
+          <w:b/>
+          <w:i w:val="0"/>
+        </w:rPr>
+        <w:t>Deploy</w:t>
+      </w:r>
+      <w:r>
+        <w:rPr>
+          <w:b w:val="0"/>
+          <w:i w:val="0"/>
+        </w:rPr>
+        <w:t xml:space="preserve"> on Railway/Fly, single process, </w:t>
+      </w:r>
+      <w:r>
+        <w:rPr>
+          <w:rFonts w:ascii="Consolas" w:hAnsi="Consolas"/>
+          <w:b w:val="0"/>
+          <w:i w:val="0"/>
+          <w:sz w:val="19"/>
+        </w:rPr>
+        <w:t>alembic upgrade head</w:t>
+      </w:r>
+      <w:r>
+        <w:rPr>
+          <w:b w:val="0"/>
+          <w:i w:val="0"/>
+        </w:rPr>
+        <w:t xml:space="preserve"> on deploy.</w:t>
+      </w:r>
+    </w:p>
+    <w:p>
+      <w:pPr>
+        <w:pStyle w:val="Heading3"/>
+      </w:pPr>
+      <w:r>
+        <w:t>Monthly cost</w:t>
+      </w:r>
+    </w:p>
+    <w:tbl>
+      <w:tblPr>
+        <w:tblStyle w:val="TableGrid"/>
+        <w:tblW w:type="auto" w:w="0"/>
+        <w:tblLayout w:type="autofit"/>
+        <w:tblLook w:firstColumn="1" w:firstRow="1" w:lastColumn="0" w:lastRow="0" w:noHBand="0" w:noVBand="1" w:val="04A0"/>
+      </w:tblPr>
+      <w:tblGrid>
+        <w:gridCol w:w="3120"/>
+        <w:gridCol w:w="3120"/>
+        <w:gridCol w:w="3120"/>
+      </w:tblGrid>
+      <w:tr>
+        <w:tc>
+          <w:tcPr>
+            <w:tcW w:type="dxa" w:w="3120"/>
+            <w:shd w:val="clear" w:fill="2F5D4E"/>
+          </w:tcPr>
+          <w:p>
+            <w:r/>
+            <w:r>
+              <w:rPr>
+                <w:b/>
+                <w:i w:val="0"/>
+                <w:color w:val="FFFFFF"/>
+              </w:rPr>
+              <w:t>Line</w:t>
+            </w:r>
+          </w:p>
+        </w:tc>
+        <w:tc>
+          <w:tcPr>
+            <w:tcW w:type="dxa" w:w="3120"/>
+            <w:shd w:val="clear" w:fill="2F5D4E"/>
+          </w:tcPr>
+          <w:p>
+            <w:r/>
+            <w:r>
+              <w:rPr>
+                <w:b/>
+                <w:i w:val="0"/>
+                <w:color w:val="FFFFFF"/>
+              </w:rPr>
+              <w:t>Choice</w:t>
+            </w:r>
+          </w:p>
+        </w:tc>
+        <w:tc>
+          <w:tcPr>
+            <w:tcW w:type="dxa" w:w="3120"/>
+            <w:shd w:val="clear" w:fill="2F5D4E"/>
+          </w:tcPr>
+          <w:p>
+            <w:r/>
+            <w:r>
+              <w:rPr>
+                <w:b/>
+                <w:i w:val="0"/>
+                <w:color w:val="FFFFFF"/>
+              </w:rPr>
+              <w:t>Cost</w:t>
+            </w:r>
+          </w:p>
+        </w:tc>
+      </w:tr>
+      <w:tr>
+        <w:tc>
+          <w:tcPr>
+            <w:tcW w:type="dxa" w:w="3120"/>
+          </w:tcPr>
+          <w:p>
+            <w:r/>
+            <w:r>
+              <w:rPr>
+                <w:b w:val="0"/>
+                <w:i w:val="0"/>
+              </w:rPr>
+              <w:t>Compute</w:t>
+            </w:r>
+          </w:p>
+        </w:tc>
+        <w:tc>
+          <w:tcPr>
+            <w:tcW w:type="dxa" w:w="3120"/>
+          </w:tcPr>
+          <w:p>
+            <w:r/>
+            <w:r>
+              <w:rPr>
+                <w:b w:val="0"/>
+                <w:i w:val="0"/>
+              </w:rPr>
+              <w:t>Single process, Railway/Fly</w:t>
+            </w:r>
+          </w:p>
+        </w:tc>
+        <w:tc>
+          <w:tcPr>
+            <w:tcW w:type="dxa" w:w="3120"/>
+          </w:tcPr>
+          <w:p>
+            <w:r/>
+            <w:r>
+              <w:rPr>
+                <w:b w:val="0"/>
+                <w:i w:val="0"/>
+              </w:rPr>
+              <w:t>$5–20</w:t>
+            </w:r>
+          </w:p>
+        </w:tc>
+      </w:tr>
+      <w:tr>
+        <w:tc>
+          <w:tcPr>
+            <w:tcW w:type="dxa" w:w="3120"/>
+          </w:tcPr>
+          <w:p>
+            <w:r/>
+            <w:r>
+              <w:rPr>
+                <w:b w:val="0"/>
+                <w:i w:val="0"/>
+              </w:rPr>
+              <w:t>Database</w:t>
+            </w:r>
+          </w:p>
+        </w:tc>
+        <w:tc>
+          <w:tcPr>
+            <w:tcW w:type="dxa" w:w="3120"/>
+          </w:tcPr>
+          <w:p>
+            <w:r/>
+            <w:r>
+              <w:rPr>
+                <w:b w:val="0"/>
+                <w:i w:val="0"/>
+              </w:rPr>
+              <w:t>Managed Postgres + PostGIS</w:t>
+            </w:r>
+          </w:p>
+        </w:tc>
+        <w:tc>
+          <w:tcPr>
+            <w:tcW w:type="dxa" w:w="3120"/>
+          </w:tcPr>
+          <w:p>
+            <w:r/>
+            <w:r>
+              <w:rPr>
+                <w:b w:val="0"/>
+                <w:i w:val="0"/>
+              </w:rPr>
+              <w:t>$0–25</w:t>
+            </w:r>
+          </w:p>
+        </w:tc>
+      </w:tr>
+      <w:tr>
+        <w:tc>
+          <w:tcPr>
+            <w:tcW w:type="dxa" w:w="3120"/>
+          </w:tcPr>
+          <w:p>
+            <w:r/>
+            <w:r>
+              <w:rPr>
+                <w:b w:val="0"/>
+                <w:i w:val="0"/>
+              </w:rPr>
+              <w:t>Photo storage</w:t>
+            </w:r>
+          </w:p>
+        </w:tc>
+        <w:tc>
+          <w:tcPr>
+            <w:tcW w:type="dxa" w:w="3120"/>
+          </w:tcPr>
+          <w:p>
+            <w:r/>
+            <w:r>
+              <w:rPr>
+                <w:b w:val="0"/>
+                <w:i w:val="0"/>
+              </w:rPr>
+              <w:t>Backblaze B2 / S3</w:t>
+            </w:r>
+          </w:p>
+        </w:tc>
+        <w:tc>
+          <w:tcPr>
+            <w:tcW w:type="dxa" w:w="3120"/>
+          </w:tcPr>
+          <w:p>
+            <w:r/>
+            <w:r>
+              <w:rPr>
+                <w:b w:val="0"/>
+                <w:i w:val="0"/>
+              </w:rPr>
+              <w:t>$1–5</w:t>
+            </w:r>
+          </w:p>
+        </w:tc>
+      </w:tr>
+      <w:tr>
+        <w:tc>
+          <w:tcPr>
+            <w:tcW w:type="dxa" w:w="3120"/>
+          </w:tcPr>
+          <w:p>
+            <w:r/>
+            <w:r>
+              <w:rPr>
+                <w:b w:val="0"/>
+                <w:i w:val="0"/>
+              </w:rPr>
+              <w:t>Maps / proximity</w:t>
+            </w:r>
+          </w:p>
+        </w:tc>
+        <w:tc>
+          <w:tcPr>
+            <w:tcW w:type="dxa" w:w="3120"/>
+          </w:tcPr>
+          <w:p>
+            <w:r/>
+            <w:r>
+              <w:rPr>
+                <w:b w:val="0"/>
+                <w:i w:val="0"/>
+              </w:rPr>
+              <w:t>Google Maps, cached 7d</w:t>
+            </w:r>
+          </w:p>
+        </w:tc>
+        <w:tc>
+          <w:tcPr>
+            <w:tcW w:type="dxa" w:w="3120"/>
+          </w:tcPr>
+          <w:p>
+            <w:r/>
+            <w:r>
+              <w:rPr>
+                <w:b w:val="0"/>
+                <w:i w:val="0"/>
+              </w:rPr>
+              <w:t>$0–30</w:t>
+            </w:r>
+          </w:p>
+        </w:tc>
+      </w:tr>
+      <w:tr>
+        <w:tc>
+          <w:tcPr>
+            <w:tcW w:type="dxa" w:w="3120"/>
+          </w:tcPr>
+          <w:p>
+            <w:r/>
+            <w:r>
+              <w:rPr>
+                <w:b w:val="0"/>
+                <w:i w:val="0"/>
+              </w:rPr>
+              <w:t>LLM narrative</w:t>
+            </w:r>
+          </w:p>
+        </w:tc>
+        <w:tc>
+          <w:tcPr>
+            <w:tcW w:type="dxa" w:w="3120"/>
+          </w:tcPr>
+          <w:p>
+            <w:r/>
+            <w:r>
+              <w:rPr>
+                <w:b w:val="0"/>
+                <w:i w:val="0"/>
+              </w:rPr>
+              <w:t>Cheap model, on-demand</w:t>
+            </w:r>
+          </w:p>
+        </w:tc>
+        <w:tc>
+          <w:tcPr>
+            <w:tcW w:type="dxa" w:w="3120"/>
+          </w:tcPr>
+          <w:p>
+            <w:r/>
+            <w:r>
+              <w:rPr>
+                <w:b w:val="0"/>
+                <w:i w:val="0"/>
+              </w:rPr>
+              <w:t>$1–10</w:t>
+            </w:r>
+          </w:p>
+        </w:tc>
+      </w:tr>
+      <w:tr>
+        <w:tc>
+          <w:tcPr>
+            <w:tcW w:type="dxa" w:w="3120"/>
+          </w:tcPr>
+          <w:p>
+            <w:r/>
+            <w:r>
+              <w:rPr>
+                <w:b w:val="0"/>
+                <w:i w:val="0"/>
+              </w:rPr>
+              <w:t>Skip-trace</w:t>
+            </w:r>
+          </w:p>
+        </w:tc>
+        <w:tc>
+          <w:tcPr>
+            <w:tcW w:type="dxa" w:w="3120"/>
+          </w:tcPr>
+          <w:p>
+            <w:r/>
+            <w:r>
+              <w:rPr>
+                <w:b w:val="0"/>
+                <w:i w:val="0"/>
+              </w:rPr>
+              <w:t>Per-hit, hot leads only</w:t>
+            </w:r>
+          </w:p>
+        </w:tc>
+        <w:tc>
+          <w:tcPr>
+            <w:tcW w:type="dxa" w:w="3120"/>
+          </w:tcPr>
+          <w:p>
+            <w:r/>
+            <w:r>
+              <w:rPr>
+                <w:b w:val="0"/>
+                <w:i w:val="0"/>
+              </w:rPr>
+              <w:t>pennies</w:t>
+            </w:r>
+          </w:p>
+        </w:tc>
+      </w:tr>
+      <w:tr>
+        <w:tc>
+          <w:tcPr>
+            <w:tcW w:type="dxa" w:w="3120"/>
+          </w:tcPr>
+          <w:p>
+            <w:r/>
+            <w:r>
+              <w:rPr>
+                <w:b w:val="0"/>
+                <w:i w:val="0"/>
+              </w:rPr>
+              <w:t>Telegram + email</w:t>
+            </w:r>
+          </w:p>
+        </w:tc>
+        <w:tc>
+          <w:tcPr>
+            <w:tcW w:type="dxa" w:w="3120"/>
+          </w:tcPr>
+          <w:p>
+            <w:r/>
+            <w:r>
+              <w:rPr>
+                <w:b w:val="0"/>
+                <w:i w:val="0"/>
+              </w:rPr>
+              <w:t>Free tiers</w:t>
+            </w:r>
+          </w:p>
+        </w:tc>
+        <w:tc>
+          <w:tcPr>
+            <w:tcW w:type="dxa" w:w="3120"/>
+          </w:tcPr>
+          <w:p>
+            <w:r/>
+            <w:r>
+              <w:rPr>
+                <w:b w:val="0"/>
+                <w:i w:val="0"/>
+              </w:rPr>
+              <w:t>$0</w:t>
+            </w:r>
+          </w:p>
+        </w:tc>
+      </w:tr>
+      <w:tr>
+        <w:tc>
+          <w:tcPr>
+            <w:tcW w:type="dxa" w:w="3120"/>
+          </w:tcPr>
+          <w:p>
+            <w:r/>
+            <w:r>
+              <w:rPr>
+                <w:b/>
+                <w:i w:val="0"/>
+              </w:rPr>
+              <w:t>Total</w:t>
+            </w:r>
+          </w:p>
+        </w:tc>
+        <w:tc>
+          <w:tcPr>
+            <w:tcW w:type="dxa" w:w="3120"/>
+          </w:tcPr>
+          <w:p>
+            <w:r/>
+            <w:r>
+              <w:rPr>
+                <w:b w:val="0"/>
+                <w:i w:val="0"/>
+              </w:rPr>
+              <w:t>all-in</w:t>
+            </w:r>
+          </w:p>
+        </w:tc>
+        <w:tc>
+          <w:tcPr>
+            <w:tcW w:type="dxa" w:w="3120"/>
+          </w:tcPr>
+          <w:p>
+            <w:r/>
+            <w:r>
+              <w:rPr>
+                <w:b/>
+                <w:i w:val="0"/>
+              </w:rPr>
+              <w:t>~$0–100</w:t>
+            </w:r>
+          </w:p>
+        </w:tc>
+      </w:tr>
+    </w:tbl>
+    <w:p>
+      <w:pPr>
+        <w:spacing w:after="40"/>
+      </w:pPr>
+    </w:p>
+    <w:p>
+      <w:pPr>
+        <w:pBdr>
+          <w:bottom w:val="single" w:sz="6" w:space="1" w:color="C9C3B4"/>
+        </w:pBdr>
+      </w:pPr>
+    </w:p>
+    <w:p>
+      <w:pPr>
+        <w:pStyle w:val="Heading2"/>
+      </w:pPr>
+      <w:r>
         <w:t>4. Data access — legal, and off-market first</w:t>
       </w:r>
     </w:p>
@@ -3667,7 +3658,7 @@
           <w:b w:val="0"/>
           <w:i w:val="0"/>
         </w:rPr>
-        <w:t xml:space="preserve"> (competitor-venue pricing, wedding-demand sentiment). Honesty matters — fully-automatic ingestion of most social platforms means scraping, which is the exact ToS/CFAA/fragility channel we cut. So we split by what's genuinely clean to automate.</w:t>
+        <w:t xml:space="preserve"> (competitor-venue pricing, wedding-demand sentiment). Fully-automatic ingestion of most social platforms means scraping, which is a ToS/CFAA/fragility problem. So we split by what's genuinely clean to automate.</w:t>
       </w:r>
     </w:p>
     <w:tbl>
@@ -4169,7 +4160,7 @@
           <w:b/>
           <w:i w:val="0"/>
         </w:rPr>
-        <w:t>The honest "automatic" for the rest:</w:t>
+        <w:t>The "automatic" for the rest:</w:t>
       </w:r>
       <w:r>
         <w:rPr>
@@ -4222,7 +4213,7 @@
           <w:b w:val="0"/>
           <w:i w:val="0"/>
         </w:rPr>
-        <w:t>'d, and shows up on the board. That's social "flowing in" continuously without rebuilding the fragile scraper layer.</w:t>
+        <w:t>'d, and shows up on the board. That's social "flowing in" continuously without the fragility of scraping.</w:t>
       </w:r>
     </w:p>
     <w:p>
@@ -6593,32 +6584,7 @@
         <w:pStyle w:val="Heading2"/>
       </w:pPr>
       <w:r>
-        <w:t>11. What we deliberately cut — and what carries over</w:t>
-      </w:r>
-    </w:p>
-    <w:p>
-      <w:pPr>
-        <w:pStyle w:val="Heading3"/>
-      </w:pPr>
-      <w:r>
-        <w:t>Cut from the enterprise draft</w:t>
-      </w:r>
-    </w:p>
-    <w:p>
-      <w:r>
-        <w:rPr>
-          <w:b w:val="0"/>
-          <w:i w:val="0"/>
-        </w:rPr>
-        <w:t>MLS/RESO adapters · LoopNet/Crexi/FB scrapers + proxy rotation · listing-photo computer vision · MongoDB, Elasticsearch, Pinecone, Snowflake · Celery worker pools · real-time SLOs &amp; WebSockets · per-user tenancy / RBAC / OAuth · Twilio SMS.</w:t>
-      </w:r>
-    </w:p>
-    <w:p>
-      <w:pPr>
-        <w:pStyle w:val="Heading3"/>
-      </w:pPr>
-      <w:r>
-        <w:t>Domain fixes that carry over (scale-independent)</w:t>
+        <w:t>11. Design principles</w:t>
       </w:r>
     </w:p>
     <w:p>
@@ -6630,14 +6596,14 @@
           <w:b/>
           <w:i w:val="0"/>
         </w:rPr>
-        <w:t>Pro-forma:</w:t>
+        <w:t>Pro-forma models the ramp.</w:t>
       </w:r>
       <w:r>
         <w:rPr>
           <w:b w:val="0"/>
           <w:i w:val="0"/>
         </w:rPr>
-        <w:t xml:space="preserve"> ramp columns to the group's targets (Year-2 break-even, Year-3 EBITDA ≥ 10%); working-capital-to-break-even folded into the $5M all-in; conversion-cost scaling fixed (fixed vs. occupancy-driven, not linear-in-SF); "cap rate" relabeled as development yield.</w:t>
+        <w:t xml:space="preserve"> Year-1/2/3 columns to the targets (Year-2 break-even, Year-3 EBITDA ≥ 10%); working capital to break-even folded into the $5M all-in; conversion-cost scaling is fixed vs. occupancy-driven, not linear-in-SF; the yield is labeled a development yield, not a cap rate.</w:t>
       </w:r>
     </w:p>
     <w:p>
@@ -6649,14 +6615,14 @@
           <w:b/>
           <w:i w:val="0"/>
         </w:rPr>
-        <w:t>Scoring:</w:t>
+        <w:t>Scoring is an explainable rubric, not a score.</w:t>
       </w:r>
       <w:r>
         <w:rPr>
           <w:b w:val="0"/>
           <w:i w:val="0"/>
         </w:rPr>
-        <w:t xml:space="preserve"> explainable traffic-light rubric, not a false-precision 0–100 — at ~1–3 closed deals/year you can't validate an "85% accuracy" claim.</w:t>
+        <w:t xml:space="preserve"> Traffic-light sub-scores, not a false-precision 0–100 — at ~1–3 closed deals/year an "accuracy %" can't be validated.</w:t>
       </w:r>
     </w:p>
     <w:p>
@@ -6668,14 +6634,14 @@
           <w:b/>
           <w:i w:val="0"/>
         </w:rPr>
-        <w:t>Zoning:</w:t>
+        <w:t>Zoning is a research checklist, not a verdict.</w:t>
       </w:r>
       <w:r>
         <w:rPr>
           <w:b w:val="0"/>
           <w:i w:val="0"/>
         </w:rPr>
-        <w:t xml:space="preserve"> a "verify these three things" research checklist (parcel + jurisdiction + code + planning link), not an automated permitted-use verdict — that's a liability line at any scale.</w:t>
+        <w:t xml:space="preserve"> Parcel + jurisdiction + code + planning link for a human to verify — an automated permitted-use determination is a liability line.</w:t>
       </w:r>
     </w:p>
     <w:p>
@@ -6687,14 +6653,14 @@
           <w:b/>
           <w:i w:val="0"/>
         </w:rPr>
-        <w:t>Buyer's agent:</w:t>
+        <w:t>Use a buyer's agent for MLS coverage.</w:t>
       </w:r>
       <w:r>
         <w:rPr>
           <w:b w:val="0"/>
           <w:i w:val="0"/>
         </w:rPr>
-        <w:t xml:space="preserve"> even unlicensed, the group can work with one who legally sets up MLS saved-searches and forwards matches — free MLS coverage without building anything.</w:t>
+        <w:t xml:space="preserve"> Even unlicensed, the group can work with one who legally sets up MLS saved-searches and forwards matches — free MLS coverage without building anything.</w:t>
       </w:r>
     </w:p>
     <w:p>

</xml_diff>

<commit_message>
Add deployment scaffolding + spec section 14 (deployment & costs)
Scaffolding: Dockerfile, requirements.txt, railway.toml, .env.example,
Alembic setup (env.py + 0001 initial schema creating the full PostGIS
schema), and an app skeleton (FastAPI /health + APScheduler job stubs
mapped to the roadmap). Spec gains section 14 (deployment & running
costs); README/Word regenerated to match.

Co-Authored-By: Claude Opus 4.8 <noreply@anthropic.com>
</commit_message>
<xml_diff>
--- a/RealtyDog_Build_Spec.docx
+++ b/RealtyDog_Build_Spec.docx
@@ -9295,6 +9295,1348 @@
           <w:i w:val="0"/>
         </w:rPr>
         <w:t xml:space="preserve"> (a barn/warehouse's higher conversion cost forces a lower purchase to stay under $5M). A high-purchase, high-leverage deal misses Year-2 break-even even on a great building — which is exactly what the gate is there to catch.</w:t>
+      </w:r>
+    </w:p>
+    <w:p>
+      <w:pPr>
+        <w:pBdr>
+          <w:bottom w:val="single" w:sz="6" w:space="1" w:color="C9C3B4"/>
+        </w:pBdr>
+      </w:pPr>
+    </w:p>
+    <w:p>
+      <w:pPr>
+        <w:pStyle w:val="Heading2"/>
+      </w:pPr>
+      <w:r>
+        <w:t>14. Deployment &amp; running costs</w:t>
+      </w:r>
+    </w:p>
+    <w:p>
+      <w:r>
+        <w:rPr>
+          <w:b w:val="0"/>
+          <w:i w:val="0"/>
+        </w:rPr>
+        <w:t>RealtyDog runs as one small service; deployment is four moving parts.</w:t>
+      </w:r>
+    </w:p>
+    <w:p>
+      <w:pPr>
+        <w:pStyle w:val="Heading3"/>
+      </w:pPr>
+      <w:r>
+        <w:t>What runs</w:t>
+      </w:r>
+    </w:p>
+    <w:tbl>
+      <w:tblPr>
+        <w:tblStyle w:val="TableGrid"/>
+        <w:tblW w:type="auto" w:w="0"/>
+        <w:tblLayout w:type="autofit"/>
+        <w:tblLook w:firstColumn="1" w:firstRow="1" w:lastColumn="0" w:lastRow="0" w:noHBand="0" w:noVBand="1" w:val="04A0"/>
+      </w:tblPr>
+      <w:tblGrid>
+        <w:gridCol w:w="3120"/>
+        <w:gridCol w:w="3120"/>
+        <w:gridCol w:w="3120"/>
+      </w:tblGrid>
+      <w:tr>
+        <w:tc>
+          <w:tcPr>
+            <w:tcW w:type="dxa" w:w="3120"/>
+            <w:shd w:val="clear" w:fill="2F5D4E"/>
+          </w:tcPr>
+          <w:p>
+            <w:r/>
+            <w:r>
+              <w:rPr>
+                <w:b/>
+                <w:i w:val="0"/>
+                <w:color w:val="FFFFFF"/>
+              </w:rPr>
+              <w:t>Component</w:t>
+            </w:r>
+          </w:p>
+        </w:tc>
+        <w:tc>
+          <w:tcPr>
+            <w:tcW w:type="dxa" w:w="3120"/>
+            <w:shd w:val="clear" w:fill="2F5D4E"/>
+          </w:tcPr>
+          <w:p>
+            <w:r/>
+            <w:r>
+              <w:rPr>
+                <w:b/>
+                <w:i w:val="0"/>
+                <w:color w:val="FFFFFF"/>
+              </w:rPr>
+              <w:t>What it is</w:t>
+            </w:r>
+          </w:p>
+        </w:tc>
+        <w:tc>
+          <w:tcPr>
+            <w:tcW w:type="dxa" w:w="3120"/>
+            <w:shd w:val="clear" w:fill="2F5D4E"/>
+          </w:tcPr>
+          <w:p>
+            <w:r/>
+            <w:r>
+              <w:rPr>
+                <w:b/>
+                <w:i w:val="0"/>
+                <w:color w:val="FFFFFF"/>
+              </w:rPr>
+              <w:t>Requirement</w:t>
+            </w:r>
+          </w:p>
+        </w:tc>
+      </w:tr>
+      <w:tr>
+        <w:tc>
+          <w:tcPr>
+            <w:tcW w:type="dxa" w:w="3120"/>
+          </w:tcPr>
+          <w:p>
+            <w:r/>
+            <w:r>
+              <w:rPr>
+                <w:b w:val="0"/>
+                <w:i w:val="0"/>
+              </w:rPr>
+              <w:t>App</w:t>
+            </w:r>
+          </w:p>
+        </w:tc>
+        <w:tc>
+          <w:tcPr>
+            <w:tcW w:type="dxa" w:w="3120"/>
+          </w:tcPr>
+          <w:p>
+            <w:r/>
+            <w:r>
+              <w:rPr>
+                <w:b w:val="0"/>
+                <w:i w:val="0"/>
+              </w:rPr>
+              <w:t>One container: FastAPI + APScheduler</w:t>
+            </w:r>
+          </w:p>
+        </w:tc>
+        <w:tc>
+          <w:tcPr>
+            <w:tcW w:type="dxa" w:w="3120"/>
+          </w:tcPr>
+          <w:p>
+            <w:r/>
+            <w:r>
+              <w:rPr>
+                <w:b w:val="0"/>
+                <w:i w:val="0"/>
+              </w:rPr>
+              <w:t>1 small instance (~0.5 vCPU, 512MB–1GB)</w:t>
+            </w:r>
+          </w:p>
+        </w:tc>
+      </w:tr>
+      <w:tr>
+        <w:tc>
+          <w:tcPr>
+            <w:tcW w:type="dxa" w:w="3120"/>
+          </w:tcPr>
+          <w:p>
+            <w:r/>
+            <w:r>
+              <w:rPr>
+                <w:b w:val="0"/>
+                <w:i w:val="0"/>
+              </w:rPr>
+              <w:t>Database</w:t>
+            </w:r>
+          </w:p>
+        </w:tc>
+        <w:tc>
+          <w:tcPr>
+            <w:tcW w:type="dxa" w:w="3120"/>
+          </w:tcPr>
+          <w:p>
+            <w:r/>
+            <w:r>
+              <w:rPr>
+                <w:b w:val="0"/>
+                <w:i w:val="0"/>
+              </w:rPr>
+              <w:t>Postgres with PostGIS + pg_trgm</w:t>
+            </w:r>
+          </w:p>
+        </w:tc>
+        <w:tc>
+          <w:tcPr>
+            <w:tcW w:type="dxa" w:w="3120"/>
+          </w:tcPr>
+          <w:p>
+            <w:r/>
+            <w:r>
+              <w:rPr>
+                <w:b w:val="0"/>
+                <w:i w:val="0"/>
+              </w:rPr>
+              <w:t>Managed Postgres supporting the PostGIS extension</w:t>
+            </w:r>
+          </w:p>
+        </w:tc>
+      </w:tr>
+      <w:tr>
+        <w:tc>
+          <w:tcPr>
+            <w:tcW w:type="dxa" w:w="3120"/>
+          </w:tcPr>
+          <w:p>
+            <w:r/>
+            <w:r>
+              <w:rPr>
+                <w:b w:val="0"/>
+                <w:i w:val="0"/>
+              </w:rPr>
+              <w:t>Object storage</w:t>
+            </w:r>
+          </w:p>
+        </w:tc>
+        <w:tc>
+          <w:tcPr>
+            <w:tcW w:type="dxa" w:w="3120"/>
+          </w:tcPr>
+          <w:p>
+            <w:r/>
+            <w:r>
+              <w:rPr>
+                <w:b w:val="0"/>
+                <w:i w:val="0"/>
+              </w:rPr>
+              <w:t>Property photos</w:t>
+            </w:r>
+          </w:p>
+        </w:tc>
+        <w:tc>
+          <w:tcPr>
+            <w:tcW w:type="dxa" w:w="3120"/>
+          </w:tcPr>
+          <w:p>
+            <w:r/>
+            <w:r>
+              <w:rPr>
+                <w:b w:val="0"/>
+                <w:i w:val="0"/>
+              </w:rPr>
+              <w:t>S3 / Backblaze B2 / Cloudflare R2 / Supabase Storage</w:t>
+            </w:r>
+          </w:p>
+        </w:tc>
+      </w:tr>
+      <w:tr>
+        <w:tc>
+          <w:tcPr>
+            <w:tcW w:type="dxa" w:w="3120"/>
+          </w:tcPr>
+          <w:p>
+            <w:r/>
+            <w:r>
+              <w:rPr>
+                <w:b w:val="0"/>
+                <w:i w:val="0"/>
+              </w:rPr>
+              <w:t>Telegram bot</w:t>
+            </w:r>
+          </w:p>
+        </w:tc>
+        <w:tc>
+          <w:tcPr>
+            <w:tcW w:type="dxa" w:w="3120"/>
+          </w:tcPr>
+          <w:p>
+            <w:r/>
+            <w:r>
+              <w:rPr>
+                <w:b w:val="0"/>
+                <w:i w:val="0"/>
+              </w:rPr>
+              <w:t>The whole UI</w:t>
+            </w:r>
+          </w:p>
+        </w:tc>
+        <w:tc>
+          <w:tcPr>
+            <w:tcW w:type="dxa" w:w="3120"/>
+          </w:tcPr>
+          <w:p>
+            <w:r/>
+            <w:r>
+              <w:rPr>
+                <w:b w:val="0"/>
+                <w:i w:val="0"/>
+              </w:rPr>
+              <w:t>Bot token (BotFather) + group chat ID</w:t>
+            </w:r>
+          </w:p>
+        </w:tc>
+      </w:tr>
+    </w:tbl>
+    <w:p>
+      <w:pPr>
+        <w:spacing w:after="40"/>
+      </w:pPr>
+    </w:p>
+    <w:p>
+      <w:pPr>
+        <w:pStyle w:val="Heading3"/>
+      </w:pPr>
+      <w:r>
+        <w:t>Accounts &amp; keys</w:t>
+      </w:r>
+    </w:p>
+    <w:tbl>
+      <w:tblPr>
+        <w:tblStyle w:val="TableGrid"/>
+        <w:tblW w:type="auto" w:w="0"/>
+        <w:tblLayout w:type="autofit"/>
+        <w:tblLook w:firstColumn="1" w:firstRow="1" w:lastColumn="0" w:lastRow="0" w:noHBand="0" w:noVBand="1" w:val="04A0"/>
+      </w:tblPr>
+      <w:tblGrid>
+        <w:gridCol w:w="3120"/>
+        <w:gridCol w:w="3120"/>
+        <w:gridCol w:w="3120"/>
+      </w:tblGrid>
+      <w:tr>
+        <w:tc>
+          <w:tcPr>
+            <w:tcW w:type="dxa" w:w="3120"/>
+            <w:shd w:val="clear" w:fill="2F5D4E"/>
+          </w:tcPr>
+          <w:p>
+            <w:r/>
+            <w:r>
+              <w:rPr>
+                <w:b/>
+                <w:i w:val="0"/>
+                <w:color w:val="FFFFFF"/>
+              </w:rPr>
+              <w:t>Service</w:t>
+            </w:r>
+          </w:p>
+        </w:tc>
+        <w:tc>
+          <w:tcPr>
+            <w:tcW w:type="dxa" w:w="3120"/>
+            <w:shd w:val="clear" w:fill="2F5D4E"/>
+          </w:tcPr>
+          <w:p>
+            <w:r/>
+            <w:r>
+              <w:rPr>
+                <w:b/>
+                <w:i w:val="0"/>
+                <w:color w:val="FFFFFF"/>
+              </w:rPr>
+              <w:t>For</w:t>
+            </w:r>
+          </w:p>
+        </w:tc>
+        <w:tc>
+          <w:tcPr>
+            <w:tcW w:type="dxa" w:w="3120"/>
+            <w:shd w:val="clear" w:fill="2F5D4E"/>
+          </w:tcPr>
+          <w:p>
+            <w:r/>
+            <w:r>
+              <w:rPr>
+                <w:b/>
+                <w:i w:val="0"/>
+                <w:color w:val="FFFFFF"/>
+              </w:rPr>
+              <w:t>Cost</w:t>
+            </w:r>
+          </w:p>
+        </w:tc>
+      </w:tr>
+      <w:tr>
+        <w:tc>
+          <w:tcPr>
+            <w:tcW w:type="dxa" w:w="3120"/>
+          </w:tcPr>
+          <w:p>
+            <w:r/>
+            <w:r>
+              <w:rPr>
+                <w:b w:val="0"/>
+                <w:i w:val="0"/>
+              </w:rPr>
+              <w:t>Hosting (Railway / Fly / VPS)</w:t>
+            </w:r>
+          </w:p>
+        </w:tc>
+        <w:tc>
+          <w:tcPr>
+            <w:tcW w:type="dxa" w:w="3120"/>
+          </w:tcPr>
+          <w:p>
+            <w:r/>
+            <w:r>
+              <w:rPr>
+                <w:b w:val="0"/>
+                <w:i w:val="0"/>
+              </w:rPr>
+              <w:t>Runs the app</w:t>
+            </w:r>
+          </w:p>
+        </w:tc>
+        <w:tc>
+          <w:tcPr>
+            <w:tcW w:type="dxa" w:w="3120"/>
+          </w:tcPr>
+          <w:p>
+            <w:r/>
+            <w:r>
+              <w:rPr>
+                <w:b w:val="0"/>
+                <w:i w:val="0"/>
+              </w:rPr>
+              <w:t>Paid, small</w:t>
+            </w:r>
+          </w:p>
+        </w:tc>
+      </w:tr>
+      <w:tr>
+        <w:tc>
+          <w:tcPr>
+            <w:tcW w:type="dxa" w:w="3120"/>
+          </w:tcPr>
+          <w:p>
+            <w:r/>
+            <w:r>
+              <w:rPr>
+                <w:b w:val="0"/>
+                <w:i w:val="0"/>
+              </w:rPr>
+              <w:t>Postgres + PostGIS (Supabase / Neon)</w:t>
+            </w:r>
+          </w:p>
+        </w:tc>
+        <w:tc>
+          <w:tcPr>
+            <w:tcW w:type="dxa" w:w="3120"/>
+          </w:tcPr>
+          <w:p>
+            <w:r/>
+            <w:r>
+              <w:rPr>
+                <w:b w:val="0"/>
+                <w:i w:val="0"/>
+              </w:rPr>
+              <w:t>Database</w:t>
+            </w:r>
+          </w:p>
+        </w:tc>
+        <w:tc>
+          <w:tcPr>
+            <w:tcW w:type="dxa" w:w="3120"/>
+          </w:tcPr>
+          <w:p>
+            <w:r/>
+            <w:r>
+              <w:rPr>
+                <w:b w:val="0"/>
+                <w:i w:val="0"/>
+              </w:rPr>
+              <w:t>Free tier at this scale</w:t>
+            </w:r>
+          </w:p>
+        </w:tc>
+      </w:tr>
+      <w:tr>
+        <w:tc>
+          <w:tcPr>
+            <w:tcW w:type="dxa" w:w="3120"/>
+          </w:tcPr>
+          <w:p>
+            <w:r/>
+            <w:r>
+              <w:rPr>
+                <w:b w:val="0"/>
+                <w:i w:val="0"/>
+              </w:rPr>
+              <w:t>Telegram (BotFather)</w:t>
+            </w:r>
+          </w:p>
+        </w:tc>
+        <w:tc>
+          <w:tcPr>
+            <w:tcW w:type="dxa" w:w="3120"/>
+          </w:tcPr>
+          <w:p>
+            <w:r/>
+            <w:r>
+              <w:rPr>
+                <w:b w:val="0"/>
+                <w:i w:val="0"/>
+              </w:rPr>
+              <w:t>Bot + alerts</w:t>
+            </w:r>
+          </w:p>
+        </w:tc>
+        <w:tc>
+          <w:tcPr>
+            <w:tcW w:type="dxa" w:w="3120"/>
+          </w:tcPr>
+          <w:p>
+            <w:r/>
+            <w:r>
+              <w:rPr>
+                <w:b w:val="0"/>
+                <w:i w:val="0"/>
+              </w:rPr>
+              <w:t>Free</w:t>
+            </w:r>
+          </w:p>
+        </w:tc>
+      </w:tr>
+      <w:tr>
+        <w:tc>
+          <w:tcPr>
+            <w:tcW w:type="dxa" w:w="3120"/>
+          </w:tcPr>
+          <w:p>
+            <w:r/>
+            <w:r>
+              <w:rPr>
+                <w:b w:val="0"/>
+                <w:i w:val="0"/>
+              </w:rPr>
+              <w:t>Google Maps Platform</w:t>
+            </w:r>
+          </w:p>
+        </w:tc>
+        <w:tc>
+          <w:tcPr>
+            <w:tcW w:type="dxa" w:w="3120"/>
+          </w:tcPr>
+          <w:p>
+            <w:r/>
+            <w:r>
+              <w:rPr>
+                <w:b w:val="0"/>
+                <w:i w:val="0"/>
+              </w:rPr>
+              <w:t>Drive-time, geocoding, hotels</w:t>
+            </w:r>
+          </w:p>
+        </w:tc>
+        <w:tc>
+          <w:tcPr>
+            <w:tcW w:type="dxa" w:w="3120"/>
+          </w:tcPr>
+          <w:p>
+            <w:r/>
+            <w:r>
+              <w:rPr>
+                <w:b w:val="0"/>
+                <w:i w:val="0"/>
+              </w:rPr>
+              <w:t>Pay-as-you-go</w:t>
+            </w:r>
+          </w:p>
+        </w:tc>
+      </w:tr>
+      <w:tr>
+        <w:tc>
+          <w:tcPr>
+            <w:tcW w:type="dxa" w:w="3120"/>
+          </w:tcPr>
+          <w:p>
+            <w:r/>
+            <w:r>
+              <w:rPr>
+                <w:b w:val="0"/>
+                <w:i w:val="0"/>
+              </w:rPr>
+              <w:t>LLM (OpenRouter)</w:t>
+            </w:r>
+          </w:p>
+        </w:tc>
+        <w:tc>
+          <w:tcPr>
+            <w:tcW w:type="dxa" w:w="3120"/>
+          </w:tcPr>
+          <w:p>
+            <w:r/>
+            <w:r>
+              <w:rPr>
+                <w:b w:val="0"/>
+                <w:i w:val="0"/>
+              </w:rPr>
+              <w:t>Deal-card narratives</w:t>
+            </w:r>
+          </w:p>
+        </w:tc>
+        <w:tc>
+          <w:tcPr>
+            <w:tcW w:type="dxa" w:w="3120"/>
+          </w:tcPr>
+          <w:p>
+            <w:r/>
+            <w:r>
+              <w:rPr>
+                <w:b w:val="0"/>
+                <w:i w:val="0"/>
+              </w:rPr>
+              <w:t>Pennies</w:t>
+            </w:r>
+          </w:p>
+        </w:tc>
+      </w:tr>
+      <w:tr>
+        <w:tc>
+          <w:tcPr>
+            <w:tcW w:type="dxa" w:w="3120"/>
+          </w:tcPr>
+          <w:p>
+            <w:r/>
+            <w:r>
+              <w:rPr>
+                <w:b w:val="0"/>
+                <w:i w:val="0"/>
+              </w:rPr>
+              <w:t>ProPublica Nonprofit Explorer</w:t>
+            </w:r>
+          </w:p>
+        </w:tc>
+        <w:tc>
+          <w:tcPr>
+            <w:tcW w:type="dxa" w:w="3120"/>
+          </w:tcPr>
+          <w:p>
+            <w:r/>
+            <w:r>
+              <w:rPr>
+                <w:b w:val="0"/>
+                <w:i w:val="0"/>
+              </w:rPr>
+              <w:t>990 financials</w:t>
+            </w:r>
+          </w:p>
+        </w:tc>
+        <w:tc>
+          <w:tcPr>
+            <w:tcW w:type="dxa" w:w="3120"/>
+          </w:tcPr>
+          <w:p>
+            <w:r/>
+            <w:r>
+              <w:rPr>
+                <w:b w:val="0"/>
+                <w:i w:val="0"/>
+              </w:rPr>
+              <w:t>Free</w:t>
+            </w:r>
+          </w:p>
+        </w:tc>
+      </w:tr>
+      <w:tr>
+        <w:tc>
+          <w:tcPr>
+            <w:tcW w:type="dxa" w:w="3120"/>
+          </w:tcPr>
+          <w:p>
+            <w:r/>
+            <w:r>
+              <w:rPr>
+                <w:b w:val="0"/>
+                <w:i w:val="0"/>
+              </w:rPr>
+              <w:t>County CAD / tax-sale lists</w:t>
+            </w:r>
+          </w:p>
+        </w:tc>
+        <w:tc>
+          <w:tcPr>
+            <w:tcW w:type="dxa" w:w="3120"/>
+          </w:tcPr>
+          <w:p>
+            <w:r/>
+            <w:r>
+              <w:rPr>
+                <w:b w:val="0"/>
+                <w:i w:val="0"/>
+              </w:rPr>
+              <w:t>Discovery backbone</w:t>
+            </w:r>
+          </w:p>
+        </w:tc>
+        <w:tc>
+          <w:tcPr>
+            <w:tcW w:type="dxa" w:w="3120"/>
+          </w:tcPr>
+          <w:p>
+            <w:r/>
+            <w:r>
+              <w:rPr>
+                <w:b w:val="0"/>
+                <w:i w:val="0"/>
+              </w:rPr>
+              <w:t>Free / public</w:t>
+            </w:r>
+          </w:p>
+        </w:tc>
+      </w:tr>
+      <w:tr>
+        <w:tc>
+          <w:tcPr>
+            <w:tcW w:type="dxa" w:w="3120"/>
+          </w:tcPr>
+          <w:p>
+            <w:r/>
+            <w:r>
+              <w:rPr>
+                <w:b w:val="0"/>
+                <w:i w:val="0"/>
+              </w:rPr>
+              <w:t>Email (SendGrid / SES)</w:t>
+            </w:r>
+          </w:p>
+        </w:tc>
+        <w:tc>
+          <w:tcPr>
+            <w:tcW w:type="dxa" w:w="3120"/>
+          </w:tcPr>
+          <w:p>
+            <w:r/>
+            <w:r>
+              <w:rPr>
+                <w:b w:val="0"/>
+                <w:i w:val="0"/>
+              </w:rPr>
+              <w:t>Daily digest</w:t>
+            </w:r>
+          </w:p>
+        </w:tc>
+        <w:tc>
+          <w:tcPr>
+            <w:tcW w:type="dxa" w:w="3120"/>
+          </w:tcPr>
+          <w:p>
+            <w:r/>
+            <w:r>
+              <w:rPr>
+                <w:b w:val="0"/>
+                <w:i w:val="0"/>
+              </w:rPr>
+              <w:t>Free tier</w:t>
+            </w:r>
+          </w:p>
+        </w:tc>
+      </w:tr>
+      <w:tr>
+        <w:tc>
+          <w:tcPr>
+            <w:tcW w:type="dxa" w:w="3120"/>
+          </w:tcPr>
+          <w:p>
+            <w:r/>
+            <w:r>
+              <w:rPr>
+                <w:b w:val="0"/>
+                <w:i w:val="0"/>
+              </w:rPr>
+              <w:t>Skip-trace API (later)</w:t>
+            </w:r>
+          </w:p>
+        </w:tc>
+        <w:tc>
+          <w:tcPr>
+            <w:tcW w:type="dxa" w:w="3120"/>
+          </w:tcPr>
+          <w:p>
+            <w:r/>
+            <w:r>
+              <w:rPr>
+                <w:b w:val="0"/>
+                <w:i w:val="0"/>
+              </w:rPr>
+              <w:t>Phone numbers for hot leads</w:t>
+            </w:r>
+          </w:p>
+        </w:tc>
+        <w:tc>
+          <w:tcPr>
+            <w:tcW w:type="dxa" w:w="3120"/>
+          </w:tcPr>
+          <w:p>
+            <w:r/>
+            <w:r>
+              <w:rPr>
+                <w:b w:val="0"/>
+                <w:i w:val="0"/>
+              </w:rPr>
+              <w:t>Pay-per-hit</w:t>
+            </w:r>
+          </w:p>
+        </w:tc>
+      </w:tr>
+    </w:tbl>
+    <w:p>
+      <w:pPr>
+        <w:spacing w:after="40"/>
+      </w:pPr>
+    </w:p>
+    <w:p>
+      <w:pPr>
+        <w:pStyle w:val="Heading3"/>
+      </w:pPr>
+      <w:r>
+        <w:t>Recommended stack</w:t>
+      </w:r>
+    </w:p>
+    <w:p>
+      <w:pPr>
+        <w:pStyle w:val="ListBullet"/>
+      </w:pPr>
+      <w:r>
+        <w:rPr>
+          <w:b/>
+          <w:i w:val="0"/>
+        </w:rPr>
+        <w:t>Compute:</w:t>
+      </w:r>
+      <w:r>
+        <w:rPr>
+          <w:b w:val="0"/>
+          <w:i w:val="0"/>
+        </w:rPr>
+        <w:t xml:space="preserve"> Railway (single process, auto-deploy on push).</w:t>
+      </w:r>
+    </w:p>
+    <w:p>
+      <w:pPr>
+        <w:pStyle w:val="ListBullet"/>
+      </w:pPr>
+      <w:r>
+        <w:rPr>
+          <w:b/>
+          <w:i w:val="0"/>
+        </w:rPr>
+        <w:t>Database:</w:t>
+      </w:r>
+      <w:r>
+        <w:rPr>
+          <w:b w:val="0"/>
+          <w:i w:val="0"/>
+        </w:rPr>
+        <w:t xml:space="preserve"> Supabase — managed Postgres with PostGIS pre-installed + a free tier, and object storage included. (Railway's default Postgres doesn't bundle PostGIS; use Supabase/Neon or a </w:t>
+      </w:r>
+      <w:r>
+        <w:rPr>
+          <w:rFonts w:ascii="Consolas" w:hAnsi="Consolas"/>
+          <w:b w:val="0"/>
+          <w:i w:val="0"/>
+          <w:sz w:val="19"/>
+        </w:rPr>
+        <w:t>postgis/postgis</w:t>
+      </w:r>
+      <w:r>
+        <w:rPr>
+          <w:b w:val="0"/>
+          <w:i w:val="0"/>
+        </w:rPr>
+        <w:t xml:space="preserve"> image.)</w:t>
+      </w:r>
+    </w:p>
+    <w:p>
+      <w:pPr>
+        <w:pStyle w:val="ListBullet"/>
+      </w:pPr>
+      <w:r>
+        <w:rPr>
+          <w:b/>
+          <w:i w:val="0"/>
+        </w:rPr>
+        <w:t>Deploy flow:</w:t>
+      </w:r>
+      <w:r>
+        <w:rPr>
+          <w:b w:val="0"/>
+          <w:i w:val="0"/>
+        </w:rPr>
+        <w:t xml:space="preserve"> Dockerfile → push → auto-deploy → </w:t>
+      </w:r>
+      <w:r>
+        <w:rPr>
+          <w:rFonts w:ascii="Consolas" w:hAnsi="Consolas"/>
+          <w:b w:val="0"/>
+          <w:i w:val="0"/>
+          <w:sz w:val="19"/>
+        </w:rPr>
+        <w:t>alembic upgrade head</w:t>
+      </w:r>
+      <w:r>
+        <w:rPr>
+          <w:b w:val="0"/>
+          <w:i w:val="0"/>
+        </w:rPr>
+        <w:t xml:space="preserve"> → FastAPI + APScheduler boot. Telegram uses long-polling (no public webhook needed).</w:t>
+      </w:r>
+    </w:p>
+    <w:p>
+      <w:pPr>
+        <w:pStyle w:val="Heading3"/>
+      </w:pPr>
+      <w:r>
+        <w:t>Charges — two buckets</w:t>
+      </w:r>
+    </w:p>
+    <w:p>
+      <w:r>
+        <w:rPr>
+          <w:b/>
+          <w:i w:val="0"/>
+        </w:rPr>
+        <w:t>Infrastructure (fixed, tiny):</w:t>
+      </w:r>
+    </w:p>
+    <w:tbl>
+      <w:tblPr>
+        <w:tblStyle w:val="TableGrid"/>
+        <w:tblW w:type="auto" w:w="0"/>
+        <w:tblLayout w:type="autofit"/>
+        <w:tblLook w:firstColumn="1" w:firstRow="1" w:lastColumn="0" w:lastRow="0" w:noHBand="0" w:noVBand="1" w:val="04A0"/>
+      </w:tblPr>
+      <w:tblGrid>
+        <w:gridCol w:w="4680"/>
+        <w:gridCol w:w="4680"/>
+      </w:tblGrid>
+      <w:tr>
+        <w:tc>
+          <w:tcPr>
+            <w:tcW w:type="dxa" w:w="4680"/>
+            <w:shd w:val="clear" w:fill="2F5D4E"/>
+          </w:tcPr>
+          <w:p>
+            <w:r/>
+            <w:r>
+              <w:rPr>
+                <w:b/>
+                <w:i w:val="0"/>
+                <w:color w:val="FFFFFF"/>
+              </w:rPr>
+              <w:t>Line</w:t>
+            </w:r>
+          </w:p>
+        </w:tc>
+        <w:tc>
+          <w:tcPr>
+            <w:tcW w:type="dxa" w:w="4680"/>
+            <w:shd w:val="clear" w:fill="2F5D4E"/>
+          </w:tcPr>
+          <w:p>
+            <w:r/>
+            <w:r>
+              <w:rPr>
+                <w:b/>
+                <w:i w:val="0"/>
+                <w:color w:val="FFFFFF"/>
+              </w:rPr>
+              <w:t>Monthly</w:t>
+            </w:r>
+          </w:p>
+        </w:tc>
+      </w:tr>
+      <w:tr>
+        <w:tc>
+          <w:tcPr>
+            <w:tcW w:type="dxa" w:w="4680"/>
+          </w:tcPr>
+          <w:p>
+            <w:r/>
+            <w:r>
+              <w:rPr>
+                <w:b w:val="0"/>
+                <w:i w:val="0"/>
+              </w:rPr>
+              <w:t>App compute</w:t>
+            </w:r>
+          </w:p>
+        </w:tc>
+        <w:tc>
+          <w:tcPr>
+            <w:tcW w:type="dxa" w:w="4680"/>
+          </w:tcPr>
+          <w:p>
+            <w:r/>
+            <w:r>
+              <w:rPr>
+                <w:b w:val="0"/>
+                <w:i w:val="0"/>
+              </w:rPr>
+              <w:t>$5–20</w:t>
+            </w:r>
+          </w:p>
+        </w:tc>
+      </w:tr>
+      <w:tr>
+        <w:tc>
+          <w:tcPr>
+            <w:tcW w:type="dxa" w:w="4680"/>
+          </w:tcPr>
+          <w:p>
+            <w:r/>
+            <w:r>
+              <w:rPr>
+                <w:b w:val="0"/>
+                <w:i w:val="0"/>
+              </w:rPr>
+              <w:t>Postgres + PostGIS</w:t>
+            </w:r>
+          </w:p>
+        </w:tc>
+        <w:tc>
+          <w:tcPr>
+            <w:tcW w:type="dxa" w:w="4680"/>
+          </w:tcPr>
+          <w:p>
+            <w:r/>
+            <w:r>
+              <w:rPr>
+                <w:b w:val="0"/>
+                <w:i w:val="0"/>
+              </w:rPr>
+              <w:t>$0–15</w:t>
+            </w:r>
+          </w:p>
+        </w:tc>
+      </w:tr>
+      <w:tr>
+        <w:tc>
+          <w:tcPr>
+            <w:tcW w:type="dxa" w:w="4680"/>
+          </w:tcPr>
+          <w:p>
+            <w:r/>
+            <w:r>
+              <w:rPr>
+                <w:b w:val="0"/>
+                <w:i w:val="0"/>
+              </w:rPr>
+              <w:t>Object storage</w:t>
+            </w:r>
+          </w:p>
+        </w:tc>
+        <w:tc>
+          <w:tcPr>
+            <w:tcW w:type="dxa" w:w="4680"/>
+          </w:tcPr>
+          <w:p>
+            <w:r/>
+            <w:r>
+              <w:rPr>
+                <w:b w:val="0"/>
+                <w:i w:val="0"/>
+              </w:rPr>
+              <w:t>$0–5</w:t>
+            </w:r>
+          </w:p>
+        </w:tc>
+      </w:tr>
+      <w:tr>
+        <w:tc>
+          <w:tcPr>
+            <w:tcW w:type="dxa" w:w="4680"/>
+          </w:tcPr>
+          <w:p>
+            <w:r/>
+            <w:r>
+              <w:rPr>
+                <w:b w:val="0"/>
+                <w:i w:val="0"/>
+              </w:rPr>
+              <w:t>LLM narratives</w:t>
+            </w:r>
+          </w:p>
+        </w:tc>
+        <w:tc>
+          <w:tcPr>
+            <w:tcW w:type="dxa" w:w="4680"/>
+          </w:tcPr>
+          <w:p>
+            <w:r/>
+            <w:r>
+              <w:rPr>
+                <w:b w:val="0"/>
+                <w:i w:val="0"/>
+              </w:rPr>
+              <w:t>$1–10</w:t>
+            </w:r>
+          </w:p>
+        </w:tc>
+      </w:tr>
+      <w:tr>
+        <w:tc>
+          <w:tcPr>
+            <w:tcW w:type="dxa" w:w="4680"/>
+          </w:tcPr>
+          <w:p>
+            <w:r/>
+            <w:r>
+              <w:rPr>
+                <w:b w:val="0"/>
+                <w:i w:val="0"/>
+              </w:rPr>
+              <w:t>Google Maps (cached)</w:t>
+            </w:r>
+          </w:p>
+        </w:tc>
+        <w:tc>
+          <w:tcPr>
+            <w:tcW w:type="dxa" w:w="4680"/>
+          </w:tcPr>
+          <w:p>
+            <w:r/>
+            <w:r>
+              <w:rPr>
+                <w:b w:val="0"/>
+                <w:i w:val="0"/>
+              </w:rPr>
+              <w:t>$0–30</w:t>
+            </w:r>
+          </w:p>
+        </w:tc>
+      </w:tr>
+      <w:tr>
+        <w:tc>
+          <w:tcPr>
+            <w:tcW w:type="dxa" w:w="4680"/>
+          </w:tcPr>
+          <w:p>
+            <w:r/>
+            <w:r>
+              <w:rPr>
+                <w:b w:val="0"/>
+                <w:i w:val="0"/>
+              </w:rPr>
+              <w:t>Email + Telegram</w:t>
+            </w:r>
+          </w:p>
+        </w:tc>
+        <w:tc>
+          <w:tcPr>
+            <w:tcW w:type="dxa" w:w="4680"/>
+          </w:tcPr>
+          <w:p>
+            <w:r/>
+            <w:r>
+              <w:rPr>
+                <w:b w:val="0"/>
+                <w:i w:val="0"/>
+              </w:rPr>
+              <w:t>$0</w:t>
+            </w:r>
+          </w:p>
+        </w:tc>
+      </w:tr>
+      <w:tr>
+        <w:tc>
+          <w:tcPr>
+            <w:tcW w:type="dxa" w:w="4680"/>
+          </w:tcPr>
+          <w:p>
+            <w:r/>
+            <w:r>
+              <w:rPr>
+                <w:b/>
+                <w:i w:val="0"/>
+              </w:rPr>
+              <w:t>Infra total</w:t>
+            </w:r>
+          </w:p>
+        </w:tc>
+        <w:tc>
+          <w:tcPr>
+            <w:tcW w:type="dxa" w:w="4680"/>
+          </w:tcPr>
+          <w:p>
+            <w:r/>
+            <w:r>
+              <w:rPr>
+                <w:b/>
+                <w:i w:val="0"/>
+              </w:rPr>
+              <w:t>~$25–50 / mo</w:t>
+            </w:r>
+          </w:p>
+        </w:tc>
+      </w:tr>
+    </w:tbl>
+    <w:p>
+      <w:pPr>
+        <w:spacing w:after="40"/>
+      </w:pPr>
+    </w:p>
+    <w:p>
+      <w:r>
+        <w:rPr>
+          <w:b/>
+          <w:i w:val="0"/>
+        </w:rPr>
+        <w:t>Outreach (variable — marketing, not software):</w:t>
+      </w:r>
+    </w:p>
+    <w:tbl>
+      <w:tblPr>
+        <w:tblStyle w:val="TableGrid"/>
+        <w:tblW w:type="auto" w:w="0"/>
+        <w:tblLayout w:type="autofit"/>
+        <w:tblLook w:firstColumn="1" w:firstRow="1" w:lastColumn="0" w:lastRow="0" w:noHBand="0" w:noVBand="1" w:val="04A0"/>
+      </w:tblPr>
+      <w:tblGrid>
+        <w:gridCol w:w="4680"/>
+        <w:gridCol w:w="4680"/>
+      </w:tblGrid>
+      <w:tr>
+        <w:tc>
+          <w:tcPr>
+            <w:tcW w:type="dxa" w:w="4680"/>
+            <w:shd w:val="clear" w:fill="2F5D4E"/>
+          </w:tcPr>
+          <w:p>
+            <w:r/>
+            <w:r>
+              <w:rPr>
+                <w:b/>
+                <w:i w:val="0"/>
+                <w:color w:val="FFFFFF"/>
+              </w:rPr>
+              <w:t>Line</w:t>
+            </w:r>
+          </w:p>
+        </w:tc>
+        <w:tc>
+          <w:tcPr>
+            <w:tcW w:type="dxa" w:w="4680"/>
+            <w:shd w:val="clear" w:fill="2F5D4E"/>
+          </w:tcPr>
+          <w:p>
+            <w:r/>
+            <w:r>
+              <w:rPr>
+                <w:b/>
+                <w:i w:val="0"/>
+                <w:color w:val="FFFFFF"/>
+              </w:rPr>
+              <w:t>Cost</w:t>
+            </w:r>
+          </w:p>
+        </w:tc>
+      </w:tr>
+      <w:tr>
+        <w:tc>
+          <w:tcPr>
+            <w:tcW w:type="dxa" w:w="4680"/>
+          </w:tcPr>
+          <w:p>
+            <w:r/>
+            <w:r>
+              <w:rPr>
+                <w:b w:val="0"/>
+                <w:i w:val="0"/>
+              </w:rPr>
+              <w:t>Skip-trace (hot leads only)</w:t>
+            </w:r>
+          </w:p>
+        </w:tc>
+        <w:tc>
+          <w:tcPr>
+            <w:tcW w:type="dxa" w:w="4680"/>
+          </w:tcPr>
+          <w:p>
+            <w:r/>
+            <w:r>
+              <w:rPr>
+                <w:b w:val="0"/>
+                <w:i w:val="0"/>
+              </w:rPr>
+              <w:t>~$0.10–0.25 each</w:t>
+            </w:r>
+          </w:p>
+        </w:tc>
+      </w:tr>
+      <w:tr>
+        <w:tc>
+          <w:tcPr>
+            <w:tcW w:type="dxa" w:w="4680"/>
+          </w:tcPr>
+          <w:p>
+            <w:r/>
+            <w:r>
+              <w:rPr>
+                <w:b w:val="0"/>
+                <w:i w:val="0"/>
+              </w:rPr>
+              <w:t>Direct-mail campaign</w:t>
+            </w:r>
+          </w:p>
+        </w:tc>
+        <w:tc>
+          <w:tcPr>
+            <w:tcW w:type="dxa" w:w="4680"/>
+          </w:tcPr>
+          <w:p>
+            <w:r/>
+            <w:r>
+              <w:rPr>
+                <w:b w:val="0"/>
+                <w:i w:val="0"/>
+              </w:rPr>
+              <w:t>~$0.50–1.00 per piece → 300–500 owners = $150–500</w:t>
+            </w:r>
+          </w:p>
+        </w:tc>
+      </w:tr>
+    </w:tbl>
+    <w:p>
+      <w:pPr>
+        <w:spacing w:after="40"/>
+      </w:pPr>
+    </w:p>
+    <w:p>
+      <w:r>
+        <w:rPr>
+          <w:b/>
+          <w:i w:val="0"/>
+        </w:rPr>
+        <w:t>One-time:</w:t>
+      </w:r>
+      <w:r>
+        <w:rPr>
+          <w:b w:val="0"/>
+          <w:i w:val="0"/>
+        </w:rPr>
+        <w:t xml:space="preserve"> ~$0 — domain optional (~$12/yr); a county or two may charge a small public-records fee for bulk CAD data.</w:t>
+      </w:r>
+    </w:p>
+    <w:p>
+      <w:r>
+        <w:rPr>
+          <w:b/>
+          <w:i w:val="0"/>
+        </w:rPr>
+        <w:t>Bottom line:</w:t>
+      </w:r>
+      <w:r>
+        <w:rPr>
+          <w:b w:val="0"/>
+          <w:i w:val="0"/>
+        </w:rPr>
+        <w:t xml:space="preserve"> running the software is ~$25–50/month; the meaningful spend is direct mail, a marketing choice dialed up or down. For a group deploying millions in capital, the tech stack is a rounding error.</w:t>
       </w:r>
     </w:p>
     <w:p>

</xml_diff>

<commit_message>
Docs: mark primary counties resolved (Dallas+Tarrant), JOB-002 WIP status
STUBS: SPIKE-000 primary-county decision resolved; JOB-002 -> WIP (core
done, adapters/persist/wiring/tests remaining) with the LIVING_ARE caveat;
open decision #1 closed. WIRING_STATUS: JOB-002 core noted as present but
not wired. README/Word: open decision #1 marked resolved.

Co-Authored-By: Claude Opus 4.8 <noreply@anthropic.com>
</commit_message>
<xml_diff>
--- a/RealtyDog_Build_Spec.docx
+++ b/RealtyDog_Build_Spec.docx
@@ -6684,6 +6684,13 @@
       </w:pPr>
       <w:r>
         <w:rPr>
+          <w:b w:val="0"/>
+          <w:i w:val="0"/>
+        </w:rPr>
+        <w:t>~~</w:t>
+      </w:r>
+      <w:r>
+        <w:rPr>
           <w:b/>
           <w:i w:val="0"/>
         </w:rPr>
@@ -6694,7 +6701,21 @@
           <w:b w:val="0"/>
           <w:i w:val="0"/>
         </w:rPr>
-        <w:t xml:space="preserve"> Drives the Job 0 spike and the first CAD ingestion.</w:t>
+        <w:t xml:space="preserve">~~ </w:t>
+      </w:r>
+      <w:r>
+        <w:rPr>
+          <w:b/>
+          <w:i w:val="0"/>
+        </w:rPr>
+        <w:t>Resolved: Dallas + Tarrant first (Collin third)</w:t>
+      </w:r>
+      <w:r>
+        <w:rPr>
+          <w:b w:val="0"/>
+          <w:i w:val="0"/>
+        </w:rPr>
+        <w:t xml:space="preserve"> — DCAD bulk + TAD ArcGIS API both confirmed free; LGBS covers both on the tax-sale side.</w:t>
       </w:r>
     </w:p>
     <w:p>

</xml_diff>